<commit_message>
Manuscript_EN.docx regenerado com a calibracao revisada
Co-Authored-By: Claude Sonnet 5.5 <noreply@anthropic.com>
</commit_message>
<xml_diff>
--- a/manuscript/Manuscript_EN.docx
+++ b/manuscript/Manuscript_EN.docx
@@ -222,7 +222,7 @@
         <w:t xml:space="preserve">Anticarsia gemmatalis</w:t>
       </w:r>
       <w:r>
-        <w:t xml:space="preserve">, catalytic subsites from natural-inhibitor crystal complexes were transferred to AlphaFold models, and a scoring ladder (Boltz-2, molecular dynamics, MM-GBSA, PRODIGY) was calibrated with six inhibitors and shuffled decoys. We designed 22,066 sequences on macrocyclic backbones (RFdiffusion, ProteinMPNN), kept those without a P1 residue of midgut trypsin-, chymotrypsin- or elastase-like proteases, co-folded them with Boltz-2, and simulated the top three per species for 10 ns, linear and macrocyclic.</w:t>
+        <w:t xml:space="preserve">, catalytic subsites from natural-inhibitor crystal complexes were transferred to AlphaFold models, and a scoring ladder (Boltz-2 and molecular dynamics) was calibrated with six inhibitors and shuffled decoys. We designed 22,066 sequences on macrocyclic backbones (RFdiffusion, ProteinMPNN), kept those without a P1 residue of midgut trypsin-, chymotrypsin- or elastase-like proteases, co-folded them with Boltz-2, and simulated the top three per species for 10 ns, linear and macrocyclic, ordering them with MM-GBSA and PRODIGY.</w:t>
       </w:r>
       <w:r>
         <w:t xml:space="preserve"> </w:t>
@@ -238,7 +238,7 @@
         <w:t xml:space="preserve"> </w:t>
       </w:r>
       <w:r>
-        <w:t xml:space="preserve">Boltz-2 scored the inhibitor above its decoy in 10 of 10 pairs; MM-GBSA did so in 4 of 10 and PRODIGY in 2 of 10, and both tracked interface size (ρ = −0.93 and −0.79). The criterion kept 527 linear and 543 cyclic sequences, 49% glycine. Repeated Boltz-2 runs correlated at 0.57 (n = 442), close to the 0.50 between the linear and cyclic forms of one sequence. In 48 simulations at pH 10.0 (one run each) the median anchor–Asp189 distance rose from 5.7 to 6.8 Å (linear) and from 5.1 to 6.1 Å (macrocyclic); four anchors ended within 4 Å, all having started within 4.0 Å. The same 48 complexes at pH 8.2 did not differ from pH 10.0 in any paired metric (final distance</w:t>
+        <w:t xml:space="preserve">Boltz-2 scored the inhibitor above its decoy in 10 of 10 pairs. The criterion kept 527 linear and 543 cyclic sequences, 49% glycine. Repeated Boltz-2 runs correlated at 0.57 (n = 442), close to the 0.50 between the linear and cyclic forms of one sequence. In 48 simulations at pH 10.0 (one run each) the median anchor–Asp189 distance rose from 5.7 to 6.8 Å (linear) and from 5.1 to 6.1 Å (macrocyclic); four anchors ended within 4 Å, all having started within 4.0 Å. The same 48 complexes at pH 8.2 did not differ from pH 10.0 in any paired metric (final distance</w:t>
       </w:r>
       <w:r>
         <w:t xml:space="preserve"> </w:t>
@@ -286,7 +286,7 @@
         <w:t xml:space="preserve"> </w:t>
       </w:r>
       <w:r>
-        <w:t xml:space="preserve">Natural inhibitors served as templates and calibration standards, but Boltz-2 confidence supports only pairwise comparisons, MM-GBSA and PRODIGY order candidates by interface size, and 10-ns S1 occupancy follows the starting pose. Requiring non-cleavability selects short, glycine-rich peptides, which makes the trade-off between resistance and S1 engagement explicit. All results are computational; selectivity and activity were not tested.</w:t>
+        <w:t xml:space="preserve">Natural inhibitors served as templates and calibration standards, but Boltz-2 confidence supports only pairwise comparisons, MM-GBSA and PRODIGY only order candidates against the same receptor, and 10-ns S1 occupancy follows the starting pose. Requiring non-cleavability selects short, glycine-rich peptides, which makes the trade-off between resistance and S1 engagement explicit. All results are computational; selectivity and activity were not tested.</w:t>
       </w:r>
     </w:p>
     <w:p>
@@ -541,7 +541,7 @@
         <w:t xml:space="preserve"> </w:t>
       </w:r>
       <w:r>
-        <w:t xml:space="preserve">design is asked to supply small size and the absence of cleavage motifs. We (i) define the catalytic subsites of eight pest trypsins by structural transfer, (ii) calibrate a scoring ladder (Boltz-2, molecular dynamics, MM-GBSA, PRODIGY) against six natural inhibitors and shuffled decoys, (iii) generate head-to-tail macrocyclic backbones with RFdiffusion and ProteinMPNN, (iv) apply a hard non-cleavability criterion, (v) co-fold the survivors and simulate them as linear peptides and as macrocycles, and (vi) rank them by stage with a free-energy filter (Figure 1). The work is entirely computational: it includes no assay and no test of selectivity against non-target proteases.</w:t>
+        <w:t xml:space="preserve">design is asked to supply small size and the absence of cleavage motifs. We (i) define the catalytic subsites of eight pest trypsins by structural transfer, (ii) calibrate a scoring ladder (Boltz-2 and molecular dynamics) against six natural inhibitors and shuffled decoys, (iii) generate head-to-tail macrocyclic backbones with RFdiffusion and ProteinMPNN, (iv) apply a hard non-cleavability criterion, (v) co-fold the survivors and simulate them as linear peptides and as macrocycles, and (vi) rank them by stage with a free-energy filter (Figure 1). The work is entirely computational: it includes no assay and no test of selectivity against non-target proteases.</w:t>
       </w:r>
     </w:p>
     <w:p>
@@ -863,7 +863,7 @@
         <w:t xml:space="preserve"> </w:t>
       </w:r>
       <w:r>
-        <w:t xml:space="preserve">model A0A089QDB3 (22 systems). Four scores were compared: (i) Boltz-2 confidence (Passaro et al., 2025) (ColabFold MSA (Mirdita et al., 2022); one sample); (ii) the RMSD of the ligand backbone after receptor superposition in a 2-ns simulation (Section 2.6; last third; pH 8.0 for bovine trypsin and 10.0 for the</w:t>
+        <w:t xml:space="preserve">model A0A089QDB3 (22 systems). Two kinds of score were compared: (i) Boltz-2 confidence (Passaro et al., 2025) (ColabFold MSA (Mirdita et al., 2022); one sample), with its ipTM and the pLDDT of the complex; (ii) the RMSD of the ligand backbone after receptor superposition in a 2-ns simulation (Section 2.6; last third; pH 8.0 for bovine trypsin and 10.0 for the</w:t>
       </w:r>
       <w:r>
         <w:t xml:space="preserve"> </w:t>
@@ -879,7 +879,7 @@
         <w:t xml:space="preserve"> </w:t>
       </w:r>
       <w:r>
-        <w:t xml:space="preserve">model); (iii) MM-GBSA with gmx_MMPBSA (Valdés-Tresanco et al., 2021) (igb = 5, 0.150 M salt, 45 frames from the last third, no entropy term); (iv) PRODIGY (Vangone and Bonvin, 2015) on four frames of the last third. A score separated a pair when the real inhibitor had the better value, with the direction fixed beforehand. The ten pairs are not independent, because each decoy is used with two receptors.</w:t>
+        <w:t xml:space="preserve">model). A score separated a pair when the real inhibitor had the better value, with the direction fixed beforehand. The ten pairs are not independent, because each decoy is used with two receptors.</w:t>
       </w:r>
     </w:p>
     <w:bookmarkEnd w:id="15"/>
@@ -1320,7 +1320,7 @@
         <w:pStyle w:val="FirstParagraph"/>
       </w:pPr>
       <w:r>
-        <w:t xml:space="preserve">MM-GBSA used gmx_MMPBSA (Valdés-Tresanco et al., 2021) (MMPBSA.py (Miller et al., 2012); generalized Born igb = 5 (Onufriev et al., 2004); 0.150 M salt; single trajectory; no entropy) on the second half of each trajectory (126 frames; receptor chain A, peptide chain B), with a standard error over five blocks of frames. PRODIGY (Vangone and Bonvin, 2015), a contact-based predictor with no explicit protonation, was applied to the initial pose (protonated at pH 8.2) and to 30 frames of the second half. Both scores grow with interface size, so each is also given per residue. Each stage ranks the candidates within a front (1 = best; ties receive the mean rank): Boltz-2 E2 confidence, paired Δ (E3), final peptide RMSD at pH 8.2, PRODIGY on the pose, and PRODIGY and MM-GBSA on the trajectory at pH 8.2; the aggregate is the mean rank over the stages. The ranking covers candidates that passed the pose quality control, had Δ &gt; 0 and, for macrocycles, met the strict ring criterion; S1 occupancy does not enter (Section 3.5). The pH 8.2 and pH 10.0 simulations are paired (same pose and protocol; they differ in side-chain protonation, counter-ions and seed) and compared by the paired difference of each metric (Wilcoxon signed-rank test), the rank correlation between pH and the agreement of categorical outcomes, read against the difference between runs of the same pH.</w:t>
+        <w:t xml:space="preserve">MM-GBSA used gmx_MMPBSA (Valdés-Tresanco et al., 2021) (MMPBSA.py (Miller et al., 2012); generalized Born igb = 5 (Onufriev et al., 2004); 0.150 M salt; single trajectory; no entropy) on the second half of each trajectory (126 frames; receptor chain A, peptide chain B), with a standard error over five blocks of frames. PRODIGY (Vangone and Bonvin, 2015), a contact-based predictor with no explicit protonation, was applied to the initial pose (protonated at pH 8.2) and to 30 frames of the second half. Both scores grow with interface size, so each is also given per residue; neither was calibrated as a discriminator between real and shuffled inhibitors, and they order candidates against the same receptor without being read as affinities. Each stage ranks the candidates within a front (1 = best; ties receive the mean rank): Boltz-2 E2 confidence, paired Δ (E3), final peptide RMSD at pH 8.2, PRODIGY on the pose, and PRODIGY and MM-GBSA on the trajectory at pH 8.2; the aggregate is the mean rank over the stages. The ranking covers candidates that passed the pose quality control, had Δ &gt; 0 and, for macrocycles, met the strict ring criterion; S1 occupancy does not enter (Section 3.5). The pH 8.2 and pH 10.0 simulations are paired (same pose and protocol; they differ in side-chain protonation, counter-ions and seed) and compared by the paired difference of each metric (Wilcoxon signed-rank test), the rank correlation between pH and the agreement of categorical outcomes, read against the difference between runs of the same pH.</w:t>
       </w:r>
     </w:p>
     <w:bookmarkEnd w:id="21"/>
@@ -2859,7 +2859,7 @@
         <w:pStyle w:val="FirstParagraph"/>
       </w:pPr>
       <w:r>
-        <w:t xml:space="preserve">Boltz-2 gave a higher confidence for the real inhibitor than for its decoy in 10 of 10 pairs (differences 0.042–0.274; median 0.190), as did complex pLDDT (10/10) and ipTM (10/10; the smallest margin was SKTI with</w:t>
+        <w:t xml:space="preserve">Boltz-2 gave a higher confidence for the real inhibitor than for its decoy in 10 of 10 pairs (differences 0.042–0.274; median 0.190), as did the complex pLDDT (10/10) and the ipTM (10/10; the smallest margin was SKTI with</w:t>
       </w:r>
       <w:r>
         <w:t xml:space="preserve"> </w:t>
@@ -2872,7 +2872,7 @@
         <w:t xml:space="preserve">S. frugiperda</w:t>
       </w:r>
       <w:r>
-        <w:t xml:space="preserve">, 0.711 against 0.706). Absolute values overlapped (real inhibitors 0.853–0.986, decoys 0.628–0.944; the shuffled SFTI-1 decoy reached 0.944 with bovine trypsin), so the discrimination holds within a pair and not as an absolute threshold (Figure 2A, Table 2). The ligand RMSD was lower for the real inhibitor in 9 of 10 pairs (the exception was</w:t>
+        <w:t xml:space="preserve">, 0.711 against 0.706). Absolute values overlapped (real inhibitors 0.853–0.986, decoys 0.628–0.944; the shuffled SFTI-1 decoy reached 0.944 with bovine trypsin), so the discrimination holds within a pair and not as an absolute threshold (Figure 2A–C, Table 2). The ligand RMSD was lower for the real inhibitor in 9 of 10 pairs (the exception was</w:t>
       </w:r>
       <w:r>
         <w:t xml:space="preserve"> </w:t>
@@ -2885,66 +2885,7 @@
         <w:t xml:space="preserve">S. frugiperda</w:t>
       </w:r>
       <w:r>
-        <w:t xml:space="preserve">–EcTI, 0.366 against 0.347 nm; Figure 2B).</w:t>
-      </w:r>
-    </w:p>
-    <w:p>
-      <w:pPr>
-        <w:pStyle w:val="BodyText"/>
-      </w:pPr>
-      <w:r>
-        <w:t xml:space="preserve">MM-GBSA favored the real inhibitor in 4 of 10 pairs and PRODIGY in 2 of 10 (Figure 2C, D; Table 2). Across the 22 systems, the MM-GBSA ΔG correlated with the number of receptor residues in contact with the ligand (Spearman ρ = −0.93,</w:t>
-      </w:r>
-      <w:r>
-        <w:t xml:space="preserve"> </w:t>
-      </w:r>
-      <w:r>
-        <w:rPr>
-          <w:i/>
-          <w:iCs/>
-        </w:rPr>
-        <w:t xml:space="preserve">P</w:t>
-      </w:r>
-      <w:r>
-        <w:t xml:space="preserve"> </w:t>
-      </w:r>
-      <w:r>
-        <w:t xml:space="preserve">= 7 × 10</w:t>
-      </w:r>
-      <w:r>
-        <w:rPr>
-          <w:vertAlign w:val="superscript"/>
-        </w:rPr>
-        <w:t xml:space="preserve">−10</w:t>
-      </w:r>
-      <w:r>
-        <w:t xml:space="preserve">; post hoc) and not with ligand length (ρ = −0.27,</w:t>
-      </w:r>
-      <w:r>
-        <w:t xml:space="preserve"> </w:t>
-      </w:r>
-      <w:r>
-        <w:rPr>
-          <w:i/>
-          <w:iCs/>
-        </w:rPr>
-        <w:t xml:space="preserve">P</w:t>
-      </w:r>
-      <w:r>
-        <w:t xml:space="preserve"> </w:t>
-      </w:r>
-      <w:r>
-        <w:t xml:space="preserve">= 0.23), and the PRODIGY ΔG correlated with its number of intermolecular contacts (ρ = −0.79, n = 22); the decoy had more contacts than its inhibitor in 7 of the 10 pairs (in one of them by 0.25 contacts) (Figure 2E, F). In this setting both scores therefore behave as measures of interface size and are used below to order candidates against the same receptor, not as affinities. In one system (</w:t>
-      </w:r>
-      <w:r>
-        <w:rPr>
-          <w:i/>
-          <w:iCs/>
-        </w:rPr>
-        <w:t xml:space="preserve">S. frugiperda</w:t>
-      </w:r>
-      <w:r>
-        <w:t xml:space="preserve">–BPTI) the ligand was found in another periodic image in at least one frame of the trajectory used for MM-GBSA, a further reason not to read absolute values.</w:t>
+        <w:t xml:space="preserve">–EcTI, 0.366 against 0.347 nm; Figure 2D). The Boltz-2 scores are therefore used below to compare each candidate with matched controls against the same receptor, and not as an absolute measure of binding.</w:t>
       </w:r>
     </w:p>
     <w:p>
@@ -2962,16 +2903,7 @@
         <w:t xml:space="preserve"> </w:t>
       </w:r>
       <w:r>
-        <w:t xml:space="preserve">Calibration pairs (real inhibitor / shuffled decoy). Conf.: Boltz-2 confidence. RMSD: ligand RMSD after receptor superposition (nm, last third of 2 ns). Contact: mean number of receptor residues within 4.5 Å of the ligand. ΔG: MM-GBSA and PRODIGY (kcal mol</w:t>
-      </w:r>
-      <w:r>
-        <w:rPr>
-          <w:vertAlign w:val="superscript"/>
-        </w:rPr>
-        <w:t xml:space="preserve">−1</w:t>
-      </w:r>
-      <w:r>
-        <w:t xml:space="preserve">). Bold marks a pair in which the decoy scored better than the real inhibitor.</w:t>
+        <w:t xml:space="preserve">Calibration pairs (real inhibitor / shuffled decoy). Conf.: Boltz-2 confidence. ipTM and pLDDT: Boltz-2 interface score and complex pLDDT. RMSD: ligand RMSD after receptor superposition (nm, last third of 2 ns). Bold marks the pair in which the decoy scored better than the real inhibitor.</w:t>
       </w:r>
     </w:p>
     <w:tbl>
@@ -2989,13 +2921,12 @@
         </w:tblBorders>
       </w:tblPr>
       <w:tblGrid>
-        <w:gridCol w:w="1131"/>
-        <w:gridCol w:w="1131"/>
-        <w:gridCol w:w="1131"/>
-        <w:gridCol w:w="1131"/>
-        <w:gridCol w:w="1131"/>
-        <w:gridCol w:w="1131"/>
-        <w:gridCol w:w="1131"/>
+        <w:gridCol w:w="1320"/>
+        <w:gridCol w:w="1320"/>
+        <w:gridCol w:w="1320"/>
+        <w:gridCol w:w="1320"/>
+        <w:gridCol w:w="1320"/>
+        <w:gridCol w:w="1320"/>
       </w:tblGrid>
       <w:tr>
         <w:trPr>
@@ -3061,55 +2992,39 @@
                 <w:b/>
                 <w:sz w:val="18"/>
               </w:rPr>
+              <w:t xml:space="preserve">ipTM</w:t>
+            </w:r>
+          </w:p>
+        </w:tc>
+        <w:tc>
+          <w:tcPr/>
+          <w:p>
+            <w:pPr>
+              <w:pStyle w:val="Compact"/>
+              <w:spacing w:line="240" w:lineRule="auto"/>
+            </w:pPr>
+            <w:r>
+              <w:rPr>
+                <w:b/>
+                <w:sz w:val="18"/>
+              </w:rPr>
+              <w:t xml:space="preserve">pLDDT</w:t>
+            </w:r>
+          </w:p>
+        </w:tc>
+        <w:tc>
+          <w:tcPr/>
+          <w:p>
+            <w:pPr>
+              <w:pStyle w:val="Compact"/>
+              <w:spacing w:line="240" w:lineRule="auto"/>
+            </w:pPr>
+            <w:r>
+              <w:rPr>
+                <w:b/>
+                <w:sz w:val="18"/>
+              </w:rPr>
               <w:t xml:space="preserve">RMSD (nm)</w:t>
-            </w:r>
-          </w:p>
-        </w:tc>
-        <w:tc>
-          <w:tcPr/>
-          <w:p>
-            <w:pPr>
-              <w:pStyle w:val="Compact"/>
-              <w:spacing w:line="240" w:lineRule="auto"/>
-            </w:pPr>
-            <w:r>
-              <w:rPr>
-                <w:b/>
-                <w:sz w:val="18"/>
-              </w:rPr>
-              <w:t xml:space="preserve">Contact</w:t>
-            </w:r>
-          </w:p>
-        </w:tc>
-        <w:tc>
-          <w:tcPr/>
-          <w:p>
-            <w:pPr>
-              <w:pStyle w:val="Compact"/>
-              <w:spacing w:line="240" w:lineRule="auto"/>
-            </w:pPr>
-            <w:r>
-              <w:rPr>
-                <w:b/>
-                <w:sz w:val="18"/>
-              </w:rPr>
-              <w:t xml:space="preserve">ΔG MM-GBSA</w:t>
-            </w:r>
-          </w:p>
-        </w:tc>
-        <w:tc>
-          <w:tcPr/>
-          <w:p>
-            <w:pPr>
-              <w:pStyle w:val="Compact"/>
-              <w:spacing w:line="240" w:lineRule="auto"/>
-            </w:pPr>
-            <w:r>
-              <w:rPr>
-                <w:b/>
-                <w:sz w:val="18"/>
-              </w:rPr>
-              <w:t xml:space="preserve">ΔG PRODIGY</w:t>
             </w:r>
           </w:p>
         </w:tc>
@@ -3171,52 +3086,37 @@
               <w:rPr>
                 <w:sz w:val="18"/>
               </w:rPr>
+              <w:t xml:space="preserve">0.981 / 0.891</w:t>
+            </w:r>
+          </w:p>
+        </w:tc>
+        <w:tc>
+          <w:tcPr/>
+          <w:p>
+            <w:pPr>
+              <w:pStyle w:val="Compact"/>
+              <w:spacing w:line="240" w:lineRule="auto"/>
+            </w:pPr>
+            <w:r>
+              <w:rPr>
+                <w:sz w:val="18"/>
+              </w:rPr>
+              <w:t xml:space="preserve">0.987 / 0.957</w:t>
+            </w:r>
+          </w:p>
+        </w:tc>
+        <w:tc>
+          <w:tcPr/>
+          <w:p>
+            <w:pPr>
+              <w:pStyle w:val="Compact"/>
+              <w:spacing w:line="240" w:lineRule="auto"/>
+            </w:pPr>
+            <w:r>
+              <w:rPr>
+                <w:sz w:val="18"/>
+              </w:rPr>
               <w:t xml:space="preserve">0.084 / 0.206</w:t>
-            </w:r>
-          </w:p>
-        </w:tc>
-        <w:tc>
-          <w:tcPr/>
-          <w:p>
-            <w:pPr>
-              <w:pStyle w:val="Compact"/>
-              <w:spacing w:line="240" w:lineRule="auto"/>
-            </w:pPr>
-            <w:r>
-              <w:rPr>
-                <w:sz w:val="18"/>
-              </w:rPr>
-              <w:t xml:space="preserve">25.1 / 23.5</w:t>
-            </w:r>
-          </w:p>
-        </w:tc>
-        <w:tc>
-          <w:tcPr/>
-          <w:p>
-            <w:pPr>
-              <w:pStyle w:val="Compact"/>
-              <w:spacing w:line="240" w:lineRule="auto"/>
-            </w:pPr>
-            <w:r>
-              <w:rPr>
-                <w:sz w:val="18"/>
-              </w:rPr>
-              <w:t xml:space="preserve">-70.2 / -64.8</w:t>
-            </w:r>
-          </w:p>
-        </w:tc>
-        <w:tc>
-          <w:tcPr/>
-          <w:p>
-            <w:pPr>
-              <w:pStyle w:val="Compact"/>
-              <w:spacing w:line="240" w:lineRule="auto"/>
-            </w:pPr>
-            <w:r>
-              <w:rPr>
-                <w:sz w:val="18"/>
-              </w:rPr>
-              <w:t xml:space="preserve">-11.8 / -10.8</w:t>
             </w:r>
           </w:p>
         </w:tc>
@@ -3278,7 +3178,674 @@
               <w:rPr>
                 <w:sz w:val="18"/>
               </w:rPr>
+              <w:t xml:space="preserve">0.853 / 0.716</w:t>
+            </w:r>
+          </w:p>
+        </w:tc>
+        <w:tc>
+          <w:tcPr/>
+          <w:p>
+            <w:pPr>
+              <w:pStyle w:val="Compact"/>
+              <w:spacing w:line="240" w:lineRule="auto"/>
+            </w:pPr>
+            <w:r>
+              <w:rPr>
+                <w:sz w:val="18"/>
+              </w:rPr>
+              <w:t xml:space="preserve">0.950 / 0.813</w:t>
+            </w:r>
+          </w:p>
+        </w:tc>
+        <w:tc>
+          <w:tcPr/>
+          <w:p>
+            <w:pPr>
+              <w:pStyle w:val="Compact"/>
+              <w:spacing w:line="240" w:lineRule="auto"/>
+            </w:pPr>
+            <w:r>
+              <w:rPr>
+                <w:sz w:val="18"/>
+              </w:rPr>
               <w:t xml:space="preserve">0.372 / 0.452</w:t>
+            </w:r>
+          </w:p>
+        </w:tc>
+      </w:tr>
+      <w:tr>
+        <w:tc>
+          <w:tcPr/>
+          <w:p>
+            <w:pPr>
+              <w:pStyle w:val="Compact"/>
+              <w:spacing w:line="240" w:lineRule="auto"/>
+            </w:pPr>
+            <w:r>
+              <w:rPr>
+                <w:sz w:val="18"/>
+              </w:rPr>
+              <w:t xml:space="preserve">bovine</w:t>
+            </w:r>
+          </w:p>
+        </w:tc>
+        <w:tc>
+          <w:tcPr/>
+          <w:p>
+            <w:pPr>
+              <w:pStyle w:val="Compact"/>
+              <w:spacing w:line="240" w:lineRule="auto"/>
+            </w:pPr>
+            <w:r>
+              <w:rPr>
+                <w:sz w:val="18"/>
+              </w:rPr>
+              <w:t xml:space="preserve">BPTI</w:t>
+            </w:r>
+          </w:p>
+        </w:tc>
+        <w:tc>
+          <w:tcPr/>
+          <w:p>
+            <w:pPr>
+              <w:pStyle w:val="Compact"/>
+              <w:spacing w:line="240" w:lineRule="auto"/>
+            </w:pPr>
+            <w:r>
+              <w:rPr>
+                <w:sz w:val="18"/>
+              </w:rPr>
+              <w:t xml:space="preserve">0.962 / 0.796</w:t>
+            </w:r>
+          </w:p>
+        </w:tc>
+        <w:tc>
+          <w:tcPr/>
+          <w:p>
+            <w:pPr>
+              <w:pStyle w:val="Compact"/>
+              <w:spacing w:line="240" w:lineRule="auto"/>
+            </w:pPr>
+            <w:r>
+              <w:rPr>
+                <w:sz w:val="18"/>
+              </w:rPr>
+              <w:t xml:space="preserve">0.961 / 0.653</w:t>
+            </w:r>
+          </w:p>
+        </w:tc>
+        <w:tc>
+          <w:tcPr/>
+          <w:p>
+            <w:pPr>
+              <w:pStyle w:val="Compact"/>
+              <w:spacing w:line="240" w:lineRule="auto"/>
+            </w:pPr>
+            <w:r>
+              <w:rPr>
+                <w:sz w:val="18"/>
+              </w:rPr>
+              <w:t xml:space="preserve">0.962 / 0.832</w:t>
+            </w:r>
+          </w:p>
+        </w:tc>
+        <w:tc>
+          <w:tcPr/>
+          <w:p>
+            <w:pPr>
+              <w:pStyle w:val="Compact"/>
+              <w:spacing w:line="240" w:lineRule="auto"/>
+            </w:pPr>
+            <w:r>
+              <w:rPr>
+                <w:sz w:val="18"/>
+              </w:rPr>
+              <w:t xml:space="preserve">0.380 / 0.643</w:t>
+            </w:r>
+          </w:p>
+        </w:tc>
+      </w:tr>
+      <w:tr>
+        <w:tc>
+          <w:tcPr/>
+          <w:p>
+            <w:pPr>
+              <w:pStyle w:val="Compact"/>
+              <w:spacing w:line="240" w:lineRule="auto"/>
+            </w:pPr>
+            <w:r>
+              <w:rPr>
+                <w:sz w:val="18"/>
+              </w:rPr>
+              <w:t xml:space="preserve">bovine</w:t>
+            </w:r>
+          </w:p>
+        </w:tc>
+        <w:tc>
+          <w:tcPr/>
+          <w:p>
+            <w:pPr>
+              <w:pStyle w:val="Compact"/>
+              <w:spacing w:line="240" w:lineRule="auto"/>
+            </w:pPr>
+            <w:r>
+              <w:rPr>
+                <w:sz w:val="18"/>
+              </w:rPr>
+              <w:t xml:space="preserve">EcTI</w:t>
+            </w:r>
+          </w:p>
+        </w:tc>
+        <w:tc>
+          <w:tcPr/>
+          <w:p>
+            <w:pPr>
+              <w:pStyle w:val="Compact"/>
+              <w:spacing w:line="240" w:lineRule="auto"/>
+            </w:pPr>
+            <w:r>
+              <w:rPr>
+                <w:sz w:val="18"/>
+              </w:rPr>
+              <w:t xml:space="preserve">0.934 / 0.687</w:t>
+            </w:r>
+          </w:p>
+        </w:tc>
+        <w:tc>
+          <w:tcPr/>
+          <w:p>
+            <w:pPr>
+              <w:pStyle w:val="Compact"/>
+              <w:spacing w:line="240" w:lineRule="auto"/>
+            </w:pPr>
+            <w:r>
+              <w:rPr>
+                <w:sz w:val="18"/>
+              </w:rPr>
+              <w:t xml:space="preserve">0.936 / 0.775</w:t>
+            </w:r>
+          </w:p>
+        </w:tc>
+        <w:tc>
+          <w:tcPr/>
+          <w:p>
+            <w:pPr>
+              <w:pStyle w:val="Compact"/>
+              <w:spacing w:line="240" w:lineRule="auto"/>
+            </w:pPr>
+            <w:r>
+              <w:rPr>
+                <w:sz w:val="18"/>
+              </w:rPr>
+              <w:t xml:space="preserve">0.933 / 0.665</w:t>
+            </w:r>
+          </w:p>
+        </w:tc>
+        <w:tc>
+          <w:tcPr/>
+          <w:p>
+            <w:pPr>
+              <w:pStyle w:val="Compact"/>
+              <w:spacing w:line="240" w:lineRule="auto"/>
+            </w:pPr>
+            <w:r>
+              <w:rPr>
+                <w:sz w:val="18"/>
+              </w:rPr>
+              <w:t xml:space="preserve">0.181 / 0.537</w:t>
+            </w:r>
+          </w:p>
+        </w:tc>
+      </w:tr>
+      <w:tr>
+        <w:tc>
+          <w:tcPr/>
+          <w:p>
+            <w:pPr>
+              <w:pStyle w:val="Compact"/>
+              <w:spacing w:line="240" w:lineRule="auto"/>
+            </w:pPr>
+            <w:r>
+              <w:rPr>
+                <w:sz w:val="18"/>
+              </w:rPr>
+              <w:t xml:space="preserve">bovine</w:t>
+            </w:r>
+          </w:p>
+        </w:tc>
+        <w:tc>
+          <w:tcPr/>
+          <w:p>
+            <w:pPr>
+              <w:pStyle w:val="Compact"/>
+              <w:spacing w:line="240" w:lineRule="auto"/>
+            </w:pPr>
+            <w:r>
+              <w:rPr>
+                <w:sz w:val="18"/>
+              </w:rPr>
+              <w:t xml:space="preserve">SKTI</w:t>
+            </w:r>
+          </w:p>
+        </w:tc>
+        <w:tc>
+          <w:tcPr/>
+          <w:p>
+            <w:pPr>
+              <w:pStyle w:val="Compact"/>
+              <w:spacing w:line="240" w:lineRule="auto"/>
+            </w:pPr>
+            <w:r>
+              <w:rPr>
+                <w:sz w:val="18"/>
+              </w:rPr>
+              <w:t xml:space="preserve">0.954 / 0.680</w:t>
+            </w:r>
+          </w:p>
+        </w:tc>
+        <w:tc>
+          <w:tcPr/>
+          <w:p>
+            <w:pPr>
+              <w:pStyle w:val="Compact"/>
+              <w:spacing w:line="240" w:lineRule="auto"/>
+            </w:pPr>
+            <w:r>
+              <w:rPr>
+                <w:sz w:val="18"/>
+              </w:rPr>
+              <w:t xml:space="preserve">0.963 / 0.844</w:t>
+            </w:r>
+          </w:p>
+        </w:tc>
+        <w:tc>
+          <w:tcPr/>
+          <w:p>
+            <w:pPr>
+              <w:pStyle w:val="Compact"/>
+              <w:spacing w:line="240" w:lineRule="auto"/>
+            </w:pPr>
+            <w:r>
+              <w:rPr>
+                <w:sz w:val="18"/>
+              </w:rPr>
+              <w:t xml:space="preserve">0.951 / 0.639</w:t>
+            </w:r>
+          </w:p>
+        </w:tc>
+        <w:tc>
+          <w:tcPr/>
+          <w:p>
+            <w:pPr>
+              <w:pStyle w:val="Compact"/>
+              <w:spacing w:line="240" w:lineRule="auto"/>
+            </w:pPr>
+            <w:r>
+              <w:rPr>
+                <w:sz w:val="18"/>
+              </w:rPr>
+              <w:t xml:space="preserve">0.275 / 0.364</w:t>
+            </w:r>
+          </w:p>
+        </w:tc>
+      </w:tr>
+      <w:tr>
+        <w:tc>
+          <w:tcPr/>
+          <w:p>
+            <w:pPr>
+              <w:pStyle w:val="Compact"/>
+              <w:spacing w:line="240" w:lineRule="auto"/>
+            </w:pPr>
+            <w:r>
+              <w:rPr>
+                <w:i/>
+                <w:iCs/>
+                <w:sz w:val="18"/>
+              </w:rPr>
+              <w:t xml:space="preserve">S. frugiperda</w:t>
+            </w:r>
+          </w:p>
+        </w:tc>
+        <w:tc>
+          <w:tcPr/>
+          <w:p>
+            <w:pPr>
+              <w:pStyle w:val="Compact"/>
+              <w:spacing w:line="240" w:lineRule="auto"/>
+            </w:pPr>
+            <w:r>
+              <w:rPr>
+                <w:sz w:val="18"/>
+              </w:rPr>
+              <w:t xml:space="preserve">SFTI-1</w:t>
+            </w:r>
+          </w:p>
+        </w:tc>
+        <w:tc>
+          <w:tcPr/>
+          <w:p>
+            <w:pPr>
+              <w:pStyle w:val="Compact"/>
+              <w:spacing w:line="240" w:lineRule="auto"/>
+            </w:pPr>
+            <w:r>
+              <w:rPr>
+                <w:sz w:val="18"/>
+              </w:rPr>
+              <w:t xml:space="preserve">0.933 / 0.869</w:t>
+            </w:r>
+          </w:p>
+        </w:tc>
+        <w:tc>
+          <w:tcPr/>
+          <w:p>
+            <w:pPr>
+              <w:pStyle w:val="Compact"/>
+              <w:spacing w:line="240" w:lineRule="auto"/>
+            </w:pPr>
+            <w:r>
+              <w:rPr>
+                <w:sz w:val="18"/>
+              </w:rPr>
+              <w:t xml:space="preserve">0.906 / 0.688</w:t>
+            </w:r>
+          </w:p>
+        </w:tc>
+        <w:tc>
+          <w:tcPr/>
+          <w:p>
+            <w:pPr>
+              <w:pStyle w:val="Compact"/>
+              <w:spacing w:line="240" w:lineRule="auto"/>
+            </w:pPr>
+            <w:r>
+              <w:rPr>
+                <w:sz w:val="18"/>
+              </w:rPr>
+              <w:t xml:space="preserve">0.940 / 0.914</w:t>
+            </w:r>
+          </w:p>
+        </w:tc>
+        <w:tc>
+          <w:tcPr/>
+          <w:p>
+            <w:pPr>
+              <w:pStyle w:val="Compact"/>
+              <w:spacing w:line="240" w:lineRule="auto"/>
+            </w:pPr>
+            <w:r>
+              <w:rPr>
+                <w:sz w:val="18"/>
+              </w:rPr>
+              <w:t xml:space="preserve">0.129 / 0.274</w:t>
+            </w:r>
+          </w:p>
+        </w:tc>
+      </w:tr>
+      <w:tr>
+        <w:tc>
+          <w:tcPr/>
+          <w:p>
+            <w:pPr>
+              <w:pStyle w:val="Compact"/>
+              <w:spacing w:line="240" w:lineRule="auto"/>
+            </w:pPr>
+            <w:r>
+              <w:rPr>
+                <w:i/>
+                <w:iCs/>
+                <w:sz w:val="18"/>
+              </w:rPr>
+              <w:t xml:space="preserve">S. frugiperda</w:t>
+            </w:r>
+          </w:p>
+        </w:tc>
+        <w:tc>
+          <w:tcPr/>
+          <w:p>
+            <w:pPr>
+              <w:pStyle w:val="Compact"/>
+              <w:spacing w:line="240" w:lineRule="auto"/>
+            </w:pPr>
+            <w:r>
+              <w:rPr>
+                <w:sz w:val="18"/>
+              </w:rPr>
+              <w:t xml:space="preserve">BBI</w:t>
+            </w:r>
+          </w:p>
+        </w:tc>
+        <w:tc>
+          <w:tcPr/>
+          <w:p>
+            <w:pPr>
+              <w:pStyle w:val="Compact"/>
+              <w:spacing w:line="240" w:lineRule="auto"/>
+            </w:pPr>
+            <w:r>
+              <w:rPr>
+                <w:sz w:val="18"/>
+              </w:rPr>
+              <w:t xml:space="preserve">0.862 / 0.650</w:t>
+            </w:r>
+          </w:p>
+        </w:tc>
+        <w:tc>
+          <w:tcPr/>
+          <w:p>
+            <w:pPr>
+              <w:pStyle w:val="Compact"/>
+              <w:spacing w:line="240" w:lineRule="auto"/>
+            </w:pPr>
+            <w:r>
+              <w:rPr>
+                <w:sz w:val="18"/>
+              </w:rPr>
+              <w:t xml:space="preserve">0.717 / 0.318</w:t>
+            </w:r>
+          </w:p>
+        </w:tc>
+        <w:tc>
+          <w:tcPr/>
+          <w:p>
+            <w:pPr>
+              <w:pStyle w:val="Compact"/>
+              <w:spacing w:line="240" w:lineRule="auto"/>
+            </w:pPr>
+            <w:r>
+              <w:rPr>
+                <w:sz w:val="18"/>
+              </w:rPr>
+              <w:t xml:space="preserve">0.899 / 0.732</w:t>
+            </w:r>
+          </w:p>
+        </w:tc>
+        <w:tc>
+          <w:tcPr/>
+          <w:p>
+            <w:pPr>
+              <w:pStyle w:val="Compact"/>
+              <w:spacing w:line="240" w:lineRule="auto"/>
+            </w:pPr>
+            <w:r>
+              <w:rPr>
+                <w:sz w:val="18"/>
+              </w:rPr>
+              <w:t xml:space="preserve">0.349 / 1.167</w:t>
+            </w:r>
+          </w:p>
+        </w:tc>
+      </w:tr>
+      <w:tr>
+        <w:tc>
+          <w:tcPr/>
+          <w:p>
+            <w:pPr>
+              <w:pStyle w:val="Compact"/>
+              <w:spacing w:line="240" w:lineRule="auto"/>
+            </w:pPr>
+            <w:r>
+              <w:rPr>
+                <w:i/>
+                <w:iCs/>
+                <w:sz w:val="18"/>
+              </w:rPr>
+              <w:t xml:space="preserve">S. frugiperda</w:t>
+            </w:r>
+          </w:p>
+        </w:tc>
+        <w:tc>
+          <w:tcPr/>
+          <w:p>
+            <w:pPr>
+              <w:pStyle w:val="Compact"/>
+              <w:spacing w:line="240" w:lineRule="auto"/>
+            </w:pPr>
+            <w:r>
+              <w:rPr>
+                <w:sz w:val="18"/>
+              </w:rPr>
+              <w:t xml:space="preserve">BPTI</w:t>
+            </w:r>
+          </w:p>
+        </w:tc>
+        <w:tc>
+          <w:tcPr/>
+          <w:p>
+            <w:pPr>
+              <w:pStyle w:val="Compact"/>
+              <w:spacing w:line="240" w:lineRule="auto"/>
+            </w:pPr>
+            <w:r>
+              <w:rPr>
+                <w:sz w:val="18"/>
+              </w:rPr>
+              <w:t xml:space="preserve">0.877 / 0.755</w:t>
+            </w:r>
+          </w:p>
+        </w:tc>
+        <w:tc>
+          <w:tcPr/>
+          <w:p>
+            <w:pPr>
+              <w:pStyle w:val="Compact"/>
+              <w:spacing w:line="240" w:lineRule="auto"/>
+            </w:pPr>
+            <w:r>
+              <w:rPr>
+                <w:sz w:val="18"/>
+              </w:rPr>
+              <w:t xml:space="preserve">0.918 / 0.643</w:t>
+            </w:r>
+          </w:p>
+        </w:tc>
+        <w:tc>
+          <w:tcPr/>
+          <w:p>
+            <w:pPr>
+              <w:pStyle w:val="Compact"/>
+              <w:spacing w:line="240" w:lineRule="auto"/>
+            </w:pPr>
+            <w:r>
+              <w:rPr>
+                <w:sz w:val="18"/>
+              </w:rPr>
+              <w:t xml:space="preserve">0.867 / 0.783</w:t>
+            </w:r>
+          </w:p>
+        </w:tc>
+        <w:tc>
+          <w:tcPr/>
+          <w:p>
+            <w:pPr>
+              <w:pStyle w:val="Compact"/>
+              <w:spacing w:line="240" w:lineRule="auto"/>
+            </w:pPr>
+            <w:r>
+              <w:rPr>
+                <w:sz w:val="18"/>
+              </w:rPr>
+              <w:t xml:space="preserve">0.317 / 0.342</w:t>
+            </w:r>
+          </w:p>
+        </w:tc>
+      </w:tr>
+      <w:tr>
+        <w:tc>
+          <w:tcPr/>
+          <w:p>
+            <w:pPr>
+              <w:pStyle w:val="Compact"/>
+              <w:spacing w:line="240" w:lineRule="auto"/>
+            </w:pPr>
+            <w:r>
+              <w:rPr>
+                <w:i/>
+                <w:iCs/>
+                <w:sz w:val="18"/>
+              </w:rPr>
+              <w:t xml:space="preserve">S. frugiperda</w:t>
+            </w:r>
+          </w:p>
+        </w:tc>
+        <w:tc>
+          <w:tcPr/>
+          <w:p>
+            <w:pPr>
+              <w:pStyle w:val="Compact"/>
+              <w:spacing w:line="240" w:lineRule="auto"/>
+            </w:pPr>
+            <w:r>
+              <w:rPr>
+                <w:sz w:val="18"/>
+              </w:rPr>
+              <w:t xml:space="preserve">EcTI</w:t>
+            </w:r>
+          </w:p>
+        </w:tc>
+        <w:tc>
+          <w:tcPr/>
+          <w:p>
+            <w:pPr>
+              <w:pStyle w:val="Compact"/>
+              <w:spacing w:line="240" w:lineRule="auto"/>
+            </w:pPr>
+            <w:r>
+              <w:rPr>
+                <w:sz w:val="18"/>
+              </w:rPr>
+              <w:t xml:space="preserve">0.868 / 0.637</w:t>
+            </w:r>
+          </w:p>
+        </w:tc>
+        <w:tc>
+          <w:tcPr/>
+          <w:p>
+            <w:pPr>
+              <w:pStyle w:val="Compact"/>
+              <w:spacing w:line="240" w:lineRule="auto"/>
+            </w:pPr>
+            <w:r>
+              <w:rPr>
+                <w:sz w:val="18"/>
+              </w:rPr>
+              <w:t xml:space="preserve">0.866 / 0.607</w:t>
+            </w:r>
+          </w:p>
+        </w:tc>
+        <w:tc>
+          <w:tcPr/>
+          <w:p>
+            <w:pPr>
+              <w:pStyle w:val="Compact"/>
+              <w:spacing w:line="240" w:lineRule="auto"/>
+            </w:pPr>
+            <w:r>
+              <w:rPr>
+                <w:sz w:val="18"/>
+              </w:rPr>
+              <w:t xml:space="preserve">0.868 / 0.645</w:t>
             </w:r>
           </w:p>
         </w:tc>
@@ -3295,41 +3862,7 @@
                 <w:bCs/>
                 <w:sz w:val="18"/>
               </w:rPr>
-              <w:t xml:space="preserve">22.1 / 28.1</w:t>
-            </w:r>
-          </w:p>
-        </w:tc>
-        <w:tc>
-          <w:tcPr/>
-          <w:p>
-            <w:pPr>
-              <w:pStyle w:val="Compact"/>
-              <w:spacing w:line="240" w:lineRule="auto"/>
-            </w:pPr>
-            <w:r>
-              <w:rPr>
-                <w:b/>
-                <w:bCs/>
-                <w:sz w:val="18"/>
-              </w:rPr>
-              <w:t xml:space="preserve">-66.1 / -68.5</w:t>
-            </w:r>
-          </w:p>
-        </w:tc>
-        <w:tc>
-          <w:tcPr/>
-          <w:p>
-            <w:pPr>
-              <w:pStyle w:val="Compact"/>
-              <w:spacing w:line="240" w:lineRule="auto"/>
-            </w:pPr>
-            <w:r>
-              <w:rPr>
-                <w:b/>
-                <w:bCs/>
-                <w:sz w:val="18"/>
-              </w:rPr>
-              <w:t xml:space="preserve">-13.5 / -13.8</w:t>
+              <w:t xml:space="preserve">0.366 / 0.347</w:t>
             </w:r>
           </w:p>
         </w:tc>
@@ -3344,343 +3877,6 @@
             </w:pPr>
             <w:r>
               <w:rPr>
-                <w:sz w:val="18"/>
-              </w:rPr>
-              <w:t xml:space="preserve">bovine</w:t>
-            </w:r>
-          </w:p>
-        </w:tc>
-        <w:tc>
-          <w:tcPr/>
-          <w:p>
-            <w:pPr>
-              <w:pStyle w:val="Compact"/>
-              <w:spacing w:line="240" w:lineRule="auto"/>
-            </w:pPr>
-            <w:r>
-              <w:rPr>
-                <w:sz w:val="18"/>
-              </w:rPr>
-              <w:t xml:space="preserve">BPTI</w:t>
-            </w:r>
-          </w:p>
-        </w:tc>
-        <w:tc>
-          <w:tcPr/>
-          <w:p>
-            <w:pPr>
-              <w:pStyle w:val="Compact"/>
-              <w:spacing w:line="240" w:lineRule="auto"/>
-            </w:pPr>
-            <w:r>
-              <w:rPr>
-                <w:sz w:val="18"/>
-              </w:rPr>
-              <w:t xml:space="preserve">0.962 / 0.796</w:t>
-            </w:r>
-          </w:p>
-        </w:tc>
-        <w:tc>
-          <w:tcPr/>
-          <w:p>
-            <w:pPr>
-              <w:pStyle w:val="Compact"/>
-              <w:spacing w:line="240" w:lineRule="auto"/>
-            </w:pPr>
-            <w:r>
-              <w:rPr>
-                <w:sz w:val="18"/>
-              </w:rPr>
-              <w:t xml:space="preserve">0.380 / 0.643</w:t>
-            </w:r>
-          </w:p>
-        </w:tc>
-        <w:tc>
-          <w:tcPr/>
-          <w:p>
-            <w:pPr>
-              <w:pStyle w:val="Compact"/>
-              <w:spacing w:line="240" w:lineRule="auto"/>
-            </w:pPr>
-            <w:r>
-              <w:rPr>
-                <w:b/>
-                <w:bCs/>
-                <w:sz w:val="18"/>
-              </w:rPr>
-              <w:t xml:space="preserve">24.4 / 25.6</w:t>
-            </w:r>
-          </w:p>
-        </w:tc>
-        <w:tc>
-          <w:tcPr/>
-          <w:p>
-            <w:pPr>
-              <w:pStyle w:val="Compact"/>
-              <w:spacing w:line="240" w:lineRule="auto"/>
-            </w:pPr>
-            <w:r>
-              <w:rPr>
-                <w:sz w:val="18"/>
-              </w:rPr>
-              <w:t xml:space="preserve">-68.8 / -52.5</w:t>
-            </w:r>
-          </w:p>
-        </w:tc>
-        <w:tc>
-          <w:tcPr/>
-          <w:p>
-            <w:pPr>
-              <w:pStyle w:val="Compact"/>
-              <w:spacing w:line="240" w:lineRule="auto"/>
-            </w:pPr>
-            <w:r>
-              <w:rPr>
-                <w:b/>
-                <w:bCs/>
-                <w:sz w:val="18"/>
-              </w:rPr>
-              <w:t xml:space="preserve">-12.2 / -12.9</w:t>
-            </w:r>
-          </w:p>
-        </w:tc>
-      </w:tr>
-      <w:tr>
-        <w:tc>
-          <w:tcPr/>
-          <w:p>
-            <w:pPr>
-              <w:pStyle w:val="Compact"/>
-              <w:spacing w:line="240" w:lineRule="auto"/>
-            </w:pPr>
-            <w:r>
-              <w:rPr>
-                <w:sz w:val="18"/>
-              </w:rPr>
-              <w:t xml:space="preserve">bovine</w:t>
-            </w:r>
-          </w:p>
-        </w:tc>
-        <w:tc>
-          <w:tcPr/>
-          <w:p>
-            <w:pPr>
-              <w:pStyle w:val="Compact"/>
-              <w:spacing w:line="240" w:lineRule="auto"/>
-            </w:pPr>
-            <w:r>
-              <w:rPr>
-                <w:sz w:val="18"/>
-              </w:rPr>
-              <w:t xml:space="preserve">EcTI</w:t>
-            </w:r>
-          </w:p>
-        </w:tc>
-        <w:tc>
-          <w:tcPr/>
-          <w:p>
-            <w:pPr>
-              <w:pStyle w:val="Compact"/>
-              <w:spacing w:line="240" w:lineRule="auto"/>
-            </w:pPr>
-            <w:r>
-              <w:rPr>
-                <w:sz w:val="18"/>
-              </w:rPr>
-              <w:t xml:space="preserve">0.934 / 0.687</w:t>
-            </w:r>
-          </w:p>
-        </w:tc>
-        <w:tc>
-          <w:tcPr/>
-          <w:p>
-            <w:pPr>
-              <w:pStyle w:val="Compact"/>
-              <w:spacing w:line="240" w:lineRule="auto"/>
-            </w:pPr>
-            <w:r>
-              <w:rPr>
-                <w:sz w:val="18"/>
-              </w:rPr>
-              <w:t xml:space="preserve">0.181 / 0.537</w:t>
-            </w:r>
-          </w:p>
-        </w:tc>
-        <w:tc>
-          <w:tcPr/>
-          <w:p>
-            <w:pPr>
-              <w:pStyle w:val="Compact"/>
-              <w:spacing w:line="240" w:lineRule="auto"/>
-            </w:pPr>
-            <w:r>
-              <w:rPr>
-                <w:b/>
-                <w:bCs/>
-                <w:sz w:val="18"/>
-              </w:rPr>
-              <w:t xml:space="preserve">31.3 / 31.4</w:t>
-            </w:r>
-          </w:p>
-        </w:tc>
-        <w:tc>
-          <w:tcPr/>
-          <w:p>
-            <w:pPr>
-              <w:pStyle w:val="Compact"/>
-              <w:spacing w:line="240" w:lineRule="auto"/>
-            </w:pPr>
-            <w:r>
-              <w:rPr>
-                <w:b/>
-                <w:bCs/>
-                <w:sz w:val="18"/>
-              </w:rPr>
-              <w:t xml:space="preserve">-72.7 / -79.0</w:t>
-            </w:r>
-          </w:p>
-        </w:tc>
-        <w:tc>
-          <w:tcPr/>
-          <w:p>
-            <w:pPr>
-              <w:pStyle w:val="Compact"/>
-              <w:spacing w:line="240" w:lineRule="auto"/>
-            </w:pPr>
-            <w:r>
-              <w:rPr>
-                <w:b/>
-                <w:bCs/>
-                <w:sz w:val="18"/>
-              </w:rPr>
-              <w:t xml:space="preserve">-12.9 / -13.6</w:t>
-            </w:r>
-          </w:p>
-        </w:tc>
-      </w:tr>
-      <w:tr>
-        <w:tc>
-          <w:tcPr/>
-          <w:p>
-            <w:pPr>
-              <w:pStyle w:val="Compact"/>
-              <w:spacing w:line="240" w:lineRule="auto"/>
-            </w:pPr>
-            <w:r>
-              <w:rPr>
-                <w:sz w:val="18"/>
-              </w:rPr>
-              <w:t xml:space="preserve">bovine</w:t>
-            </w:r>
-          </w:p>
-        </w:tc>
-        <w:tc>
-          <w:tcPr/>
-          <w:p>
-            <w:pPr>
-              <w:pStyle w:val="Compact"/>
-              <w:spacing w:line="240" w:lineRule="auto"/>
-            </w:pPr>
-            <w:r>
-              <w:rPr>
-                <w:sz w:val="18"/>
-              </w:rPr>
-              <w:t xml:space="preserve">SKTI</w:t>
-            </w:r>
-          </w:p>
-        </w:tc>
-        <w:tc>
-          <w:tcPr/>
-          <w:p>
-            <w:pPr>
-              <w:pStyle w:val="Compact"/>
-              <w:spacing w:line="240" w:lineRule="auto"/>
-            </w:pPr>
-            <w:r>
-              <w:rPr>
-                <w:sz w:val="18"/>
-              </w:rPr>
-              <w:t xml:space="preserve">0.954 / 0.680</w:t>
-            </w:r>
-          </w:p>
-        </w:tc>
-        <w:tc>
-          <w:tcPr/>
-          <w:p>
-            <w:pPr>
-              <w:pStyle w:val="Compact"/>
-              <w:spacing w:line="240" w:lineRule="auto"/>
-            </w:pPr>
-            <w:r>
-              <w:rPr>
-                <w:sz w:val="18"/>
-              </w:rPr>
-              <w:t xml:space="preserve">0.275 / 0.364</w:t>
-            </w:r>
-          </w:p>
-        </w:tc>
-        <w:tc>
-          <w:tcPr/>
-          <w:p>
-            <w:pPr>
-              <w:pStyle w:val="Compact"/>
-              <w:spacing w:line="240" w:lineRule="auto"/>
-            </w:pPr>
-            <w:r>
-              <w:rPr>
-                <w:b/>
-                <w:bCs/>
-                <w:sz w:val="18"/>
-              </w:rPr>
-              <w:t xml:space="preserve">29.6 / 36.3</w:t>
-            </w:r>
-          </w:p>
-        </w:tc>
-        <w:tc>
-          <w:tcPr/>
-          <w:p>
-            <w:pPr>
-              <w:pStyle w:val="Compact"/>
-              <w:spacing w:line="240" w:lineRule="auto"/>
-            </w:pPr>
-            <w:r>
-              <w:rPr>
-                <w:b/>
-                <w:bCs/>
-                <w:sz w:val="18"/>
-              </w:rPr>
-              <w:t xml:space="preserve">-77.4 / -103.0</w:t>
-            </w:r>
-          </w:p>
-        </w:tc>
-        <w:tc>
-          <w:tcPr/>
-          <w:p>
-            <w:pPr>
-              <w:pStyle w:val="Compact"/>
-              <w:spacing w:line="240" w:lineRule="auto"/>
-            </w:pPr>
-            <w:r>
-              <w:rPr>
-                <w:b/>
-                <w:bCs/>
-                <w:sz w:val="18"/>
-              </w:rPr>
-              <w:t xml:space="preserve">-13.2 / -14.8</w:t>
-            </w:r>
-          </w:p>
-        </w:tc>
-      </w:tr>
-      <w:tr>
-        <w:tc>
-          <w:tcPr/>
-          <w:p>
-            <w:pPr>
-              <w:pStyle w:val="Compact"/>
-              <w:spacing w:line="240" w:lineRule="auto"/>
-            </w:pPr>
-            <w:r>
-              <w:rPr>
                 <w:i/>
                 <w:iCs/>
                 <w:sz w:val="18"/>
@@ -3700,462 +3896,6 @@
               <w:rPr>
                 <w:sz w:val="18"/>
               </w:rPr>
-              <w:t xml:space="preserve">SFTI-1</w:t>
-            </w:r>
-          </w:p>
-        </w:tc>
-        <w:tc>
-          <w:tcPr/>
-          <w:p>
-            <w:pPr>
-              <w:pStyle w:val="Compact"/>
-              <w:spacing w:line="240" w:lineRule="auto"/>
-            </w:pPr>
-            <w:r>
-              <w:rPr>
-                <w:sz w:val="18"/>
-              </w:rPr>
-              <w:t xml:space="preserve">0.933 / 0.869</w:t>
-            </w:r>
-          </w:p>
-        </w:tc>
-        <w:tc>
-          <w:tcPr/>
-          <w:p>
-            <w:pPr>
-              <w:pStyle w:val="Compact"/>
-              <w:spacing w:line="240" w:lineRule="auto"/>
-            </w:pPr>
-            <w:r>
-              <w:rPr>
-                <w:sz w:val="18"/>
-              </w:rPr>
-              <w:t xml:space="preserve">0.129 / 0.274</w:t>
-            </w:r>
-          </w:p>
-        </w:tc>
-        <w:tc>
-          <w:tcPr/>
-          <w:p>
-            <w:pPr>
-              <w:pStyle w:val="Compact"/>
-              <w:spacing w:line="240" w:lineRule="auto"/>
-            </w:pPr>
-            <w:r>
-              <w:rPr>
-                <w:sz w:val="18"/>
-              </w:rPr>
-              <w:t xml:space="preserve">35.8 / 31.0</w:t>
-            </w:r>
-          </w:p>
-        </w:tc>
-        <w:tc>
-          <w:tcPr/>
-          <w:p>
-            <w:pPr>
-              <w:pStyle w:val="Compact"/>
-              <w:spacing w:line="240" w:lineRule="auto"/>
-            </w:pPr>
-            <w:r>
-              <w:rPr>
-                <w:sz w:val="18"/>
-              </w:rPr>
-              <w:t xml:space="preserve">-86.0 / -84.0</w:t>
-            </w:r>
-          </w:p>
-        </w:tc>
-        <w:tc>
-          <w:tcPr/>
-          <w:p>
-            <w:pPr>
-              <w:pStyle w:val="Compact"/>
-              <w:spacing w:line="240" w:lineRule="auto"/>
-            </w:pPr>
-            <w:r>
-              <w:rPr>
-                <w:sz w:val="18"/>
-              </w:rPr>
-              <w:t xml:space="preserve">-10.8 / -10.1</w:t>
-            </w:r>
-          </w:p>
-        </w:tc>
-      </w:tr>
-      <w:tr>
-        <w:tc>
-          <w:tcPr/>
-          <w:p>
-            <w:pPr>
-              <w:pStyle w:val="Compact"/>
-              <w:spacing w:line="240" w:lineRule="auto"/>
-            </w:pPr>
-            <w:r>
-              <w:rPr>
-                <w:i/>
-                <w:iCs/>
-                <w:sz w:val="18"/>
-              </w:rPr>
-              <w:t xml:space="preserve">S. frugiperda</w:t>
-            </w:r>
-          </w:p>
-        </w:tc>
-        <w:tc>
-          <w:tcPr/>
-          <w:p>
-            <w:pPr>
-              <w:pStyle w:val="Compact"/>
-              <w:spacing w:line="240" w:lineRule="auto"/>
-            </w:pPr>
-            <w:r>
-              <w:rPr>
-                <w:sz w:val="18"/>
-              </w:rPr>
-              <w:t xml:space="preserve">BBI</w:t>
-            </w:r>
-          </w:p>
-        </w:tc>
-        <w:tc>
-          <w:tcPr/>
-          <w:p>
-            <w:pPr>
-              <w:pStyle w:val="Compact"/>
-              <w:spacing w:line="240" w:lineRule="auto"/>
-            </w:pPr>
-            <w:r>
-              <w:rPr>
-                <w:sz w:val="18"/>
-              </w:rPr>
-              <w:t xml:space="preserve">0.862 / 0.650</w:t>
-            </w:r>
-          </w:p>
-        </w:tc>
-        <w:tc>
-          <w:tcPr/>
-          <w:p>
-            <w:pPr>
-              <w:pStyle w:val="Compact"/>
-              <w:spacing w:line="240" w:lineRule="auto"/>
-            </w:pPr>
-            <w:r>
-              <w:rPr>
-                <w:sz w:val="18"/>
-              </w:rPr>
-              <w:t xml:space="preserve">0.349 / 1.167</w:t>
-            </w:r>
-          </w:p>
-        </w:tc>
-        <w:tc>
-          <w:tcPr/>
-          <w:p>
-            <w:pPr>
-              <w:pStyle w:val="Compact"/>
-              <w:spacing w:line="240" w:lineRule="auto"/>
-            </w:pPr>
-            <w:r>
-              <w:rPr>
-                <w:b/>
-                <w:bCs/>
-                <w:sz w:val="18"/>
-              </w:rPr>
-              <w:t xml:space="preserve">37.3 / 68.7</w:t>
-            </w:r>
-          </w:p>
-        </w:tc>
-        <w:tc>
-          <w:tcPr/>
-          <w:p>
-            <w:pPr>
-              <w:pStyle w:val="Compact"/>
-              <w:spacing w:line="240" w:lineRule="auto"/>
-            </w:pPr>
-            <w:r>
-              <w:rPr>
-                <w:b/>
-                <w:bCs/>
-                <w:sz w:val="18"/>
-              </w:rPr>
-              <w:t xml:space="preserve">-88.6 / -151.2</w:t>
-            </w:r>
-          </w:p>
-        </w:tc>
-        <w:tc>
-          <w:tcPr/>
-          <w:p>
-            <w:pPr>
-              <w:pStyle w:val="Compact"/>
-              <w:spacing w:line="240" w:lineRule="auto"/>
-            </w:pPr>
-            <w:r>
-              <w:rPr>
-                <w:b/>
-                <w:bCs/>
-                <w:sz w:val="18"/>
-              </w:rPr>
-              <w:t xml:space="preserve">-15.2 / -20.9</w:t>
-            </w:r>
-          </w:p>
-        </w:tc>
-      </w:tr>
-      <w:tr>
-        <w:tc>
-          <w:tcPr/>
-          <w:p>
-            <w:pPr>
-              <w:pStyle w:val="Compact"/>
-              <w:spacing w:line="240" w:lineRule="auto"/>
-            </w:pPr>
-            <w:r>
-              <w:rPr>
-                <w:i/>
-                <w:iCs/>
-                <w:sz w:val="18"/>
-              </w:rPr>
-              <w:t xml:space="preserve">S. frugiperda</w:t>
-            </w:r>
-          </w:p>
-        </w:tc>
-        <w:tc>
-          <w:tcPr/>
-          <w:p>
-            <w:pPr>
-              <w:pStyle w:val="Compact"/>
-              <w:spacing w:line="240" w:lineRule="auto"/>
-            </w:pPr>
-            <w:r>
-              <w:rPr>
-                <w:sz w:val="18"/>
-              </w:rPr>
-              <w:t xml:space="preserve">BPTI</w:t>
-            </w:r>
-          </w:p>
-        </w:tc>
-        <w:tc>
-          <w:tcPr/>
-          <w:p>
-            <w:pPr>
-              <w:pStyle w:val="Compact"/>
-              <w:spacing w:line="240" w:lineRule="auto"/>
-            </w:pPr>
-            <w:r>
-              <w:rPr>
-                <w:sz w:val="18"/>
-              </w:rPr>
-              <w:t xml:space="preserve">0.877 / 0.755</w:t>
-            </w:r>
-          </w:p>
-        </w:tc>
-        <w:tc>
-          <w:tcPr/>
-          <w:p>
-            <w:pPr>
-              <w:pStyle w:val="Compact"/>
-              <w:spacing w:line="240" w:lineRule="auto"/>
-            </w:pPr>
-            <w:r>
-              <w:rPr>
-                <w:sz w:val="18"/>
-              </w:rPr>
-              <w:t xml:space="preserve">0.317 / 0.342</w:t>
-            </w:r>
-          </w:p>
-        </w:tc>
-        <w:tc>
-          <w:tcPr/>
-          <w:p>
-            <w:pPr>
-              <w:pStyle w:val="Compact"/>
-              <w:spacing w:line="240" w:lineRule="auto"/>
-            </w:pPr>
-            <w:r>
-              <w:rPr>
-                <w:b/>
-                <w:bCs/>
-                <w:sz w:val="18"/>
-              </w:rPr>
-              <w:t xml:space="preserve">40.7 / 52.2</w:t>
-            </w:r>
-          </w:p>
-        </w:tc>
-        <w:tc>
-          <w:tcPr/>
-          <w:p>
-            <w:pPr>
-              <w:pStyle w:val="Compact"/>
-              <w:spacing w:line="240" w:lineRule="auto"/>
-            </w:pPr>
-            <w:r>
-              <w:rPr>
-                <w:b/>
-                <w:bCs/>
-                <w:sz w:val="18"/>
-              </w:rPr>
-              <w:t xml:space="preserve">-112.7 / -131.6</w:t>
-            </w:r>
-          </w:p>
-        </w:tc>
-        <w:tc>
-          <w:tcPr/>
-          <w:p>
-            <w:pPr>
-              <w:pStyle w:val="Compact"/>
-              <w:spacing w:line="240" w:lineRule="auto"/>
-            </w:pPr>
-            <w:r>
-              <w:rPr>
-                <w:b/>
-                <w:bCs/>
-                <w:sz w:val="18"/>
-              </w:rPr>
-              <w:t xml:space="preserve">-14.1 / -16.1</w:t>
-            </w:r>
-          </w:p>
-        </w:tc>
-      </w:tr>
-      <w:tr>
-        <w:tc>
-          <w:tcPr/>
-          <w:p>
-            <w:pPr>
-              <w:pStyle w:val="Compact"/>
-              <w:spacing w:line="240" w:lineRule="auto"/>
-            </w:pPr>
-            <w:r>
-              <w:rPr>
-                <w:i/>
-                <w:iCs/>
-                <w:sz w:val="18"/>
-              </w:rPr>
-              <w:t xml:space="preserve">S. frugiperda</w:t>
-            </w:r>
-          </w:p>
-        </w:tc>
-        <w:tc>
-          <w:tcPr/>
-          <w:p>
-            <w:pPr>
-              <w:pStyle w:val="Compact"/>
-              <w:spacing w:line="240" w:lineRule="auto"/>
-            </w:pPr>
-            <w:r>
-              <w:rPr>
-                <w:sz w:val="18"/>
-              </w:rPr>
-              <w:t xml:space="preserve">EcTI</w:t>
-            </w:r>
-          </w:p>
-        </w:tc>
-        <w:tc>
-          <w:tcPr/>
-          <w:p>
-            <w:pPr>
-              <w:pStyle w:val="Compact"/>
-              <w:spacing w:line="240" w:lineRule="auto"/>
-            </w:pPr>
-            <w:r>
-              <w:rPr>
-                <w:sz w:val="18"/>
-              </w:rPr>
-              <w:t xml:space="preserve">0.868 / 0.637</w:t>
-            </w:r>
-          </w:p>
-        </w:tc>
-        <w:tc>
-          <w:tcPr/>
-          <w:p>
-            <w:pPr>
-              <w:pStyle w:val="Compact"/>
-              <w:spacing w:line="240" w:lineRule="auto"/>
-            </w:pPr>
-            <w:r>
-              <w:rPr>
-                <w:b/>
-                <w:bCs/>
-                <w:sz w:val="18"/>
-              </w:rPr>
-              <w:t xml:space="preserve">0.366 / 0.347</w:t>
-            </w:r>
-          </w:p>
-        </w:tc>
-        <w:tc>
-          <w:tcPr/>
-          <w:p>
-            <w:pPr>
-              <w:pStyle w:val="Compact"/>
-              <w:spacing w:line="240" w:lineRule="auto"/>
-            </w:pPr>
-            <w:r>
-              <w:rPr>
-                <w:b/>
-                <w:bCs/>
-                <w:sz w:val="18"/>
-              </w:rPr>
-              <w:t xml:space="preserve">38.0 / 66.9</w:t>
-            </w:r>
-          </w:p>
-        </w:tc>
-        <w:tc>
-          <w:tcPr/>
-          <w:p>
-            <w:pPr>
-              <w:pStyle w:val="Compact"/>
-              <w:spacing w:line="240" w:lineRule="auto"/>
-            </w:pPr>
-            <w:r>
-              <w:rPr>
-                <w:b/>
-                <w:bCs/>
-                <w:sz w:val="18"/>
-              </w:rPr>
-              <w:t xml:space="preserve">-78.9 / -223.7</w:t>
-            </w:r>
-          </w:p>
-        </w:tc>
-        <w:tc>
-          <w:tcPr/>
-          <w:p>
-            <w:pPr>
-              <w:pStyle w:val="Compact"/>
-              <w:spacing w:line="240" w:lineRule="auto"/>
-            </w:pPr>
-            <w:r>
-              <w:rPr>
-                <w:b/>
-                <w:bCs/>
-                <w:sz w:val="18"/>
-              </w:rPr>
-              <w:t xml:space="preserve">-11.6 / -22.2</w:t>
-            </w:r>
-          </w:p>
-        </w:tc>
-      </w:tr>
-      <w:tr>
-        <w:tc>
-          <w:tcPr/>
-          <w:p>
-            <w:pPr>
-              <w:pStyle w:val="Compact"/>
-              <w:spacing w:line="240" w:lineRule="auto"/>
-            </w:pPr>
-            <w:r>
-              <w:rPr>
-                <w:i/>
-                <w:iCs/>
-                <w:sz w:val="18"/>
-              </w:rPr>
-              <w:t xml:space="preserve">S. frugiperda</w:t>
-            </w:r>
-          </w:p>
-        </w:tc>
-        <w:tc>
-          <w:tcPr/>
-          <w:p>
-            <w:pPr>
-              <w:pStyle w:val="Compact"/>
-              <w:spacing w:line="240" w:lineRule="auto"/>
-            </w:pPr>
-            <w:r>
-              <w:rPr>
-                <w:sz w:val="18"/>
-              </w:rPr>
               <w:t xml:space="preserve">SKTI</w:t>
             </w:r>
           </w:p>
@@ -4186,56 +3926,37 @@
               <w:rPr>
                 <w:sz w:val="18"/>
               </w:rPr>
+              <w:t xml:space="preserve">0.711 / 0.706</w:t>
+            </w:r>
+          </w:p>
+        </w:tc>
+        <w:tc>
+          <w:tcPr/>
+          <w:p>
+            <w:pPr>
+              <w:pStyle w:val="Compact"/>
+              <w:spacing w:line="240" w:lineRule="auto"/>
+            </w:pPr>
+            <w:r>
+              <w:rPr>
+                <w:sz w:val="18"/>
+              </w:rPr>
+              <w:t xml:space="preserve">0.889 / 0.608</w:t>
+            </w:r>
+          </w:p>
+        </w:tc>
+        <w:tc>
+          <w:tcPr/>
+          <w:p>
+            <w:pPr>
+              <w:pStyle w:val="Compact"/>
+              <w:spacing w:line="240" w:lineRule="auto"/>
+            </w:pPr>
+            <w:r>
+              <w:rPr>
+                <w:sz w:val="18"/>
+              </w:rPr>
               <w:t xml:space="preserve">0.200 / 0.466</w:t>
-            </w:r>
-          </w:p>
-        </w:tc>
-        <w:tc>
-          <w:tcPr/>
-          <w:p>
-            <w:pPr>
-              <w:pStyle w:val="Compact"/>
-              <w:spacing w:line="240" w:lineRule="auto"/>
-            </w:pPr>
-            <w:r>
-              <w:rPr>
-                <w:b/>
-                <w:bCs/>
-                <w:sz w:val="18"/>
-              </w:rPr>
-              <w:t xml:space="preserve">50.7 / 54.4</w:t>
-            </w:r>
-          </w:p>
-        </w:tc>
-        <w:tc>
-          <w:tcPr/>
-          <w:p>
-            <w:pPr>
-              <w:pStyle w:val="Compact"/>
-              <w:spacing w:line="240" w:lineRule="auto"/>
-            </w:pPr>
-            <w:r>
-              <w:rPr>
-                <w:sz w:val="18"/>
-              </w:rPr>
-              <w:t xml:space="preserve">-129.2 / -128.6</w:t>
-            </w:r>
-          </w:p>
-        </w:tc>
-        <w:tc>
-          <w:tcPr/>
-          <w:p>
-            <w:pPr>
-              <w:pStyle w:val="Compact"/>
-              <w:spacing w:line="240" w:lineRule="auto"/>
-            </w:pPr>
-            <w:r>
-              <w:rPr>
-                <w:b/>
-                <w:bCs/>
-                <w:sz w:val="18"/>
-              </w:rPr>
-              <w:t xml:space="preserve">-16.4 / -18.1</w:t>
             </w:r>
           </w:p>
         </w:tc>
@@ -4248,9 +3969,9 @@
       <w:r>
         <w:drawing>
           <wp:inline>
-            <wp:extent cx="5334000" cy="3853030"/>
+            <wp:extent cx="5334000" cy="3556836"/>
             <wp:effectExtent b="0" l="0" r="0" t="0"/>
-            <wp:docPr descr="Figure 2. Calibration of the scoring ladder with six natural inhibitors and shuffled decoys (22 systems; Bt: bovine trypsin, Sf: S. frugiperda). (A–D) Real inhibitor (filled) and shuffled decoy (open) for (A) Boltz-2 confidence, (B) ligand backbone RMSD after receptor superposition (2 ns, last third), (C) MM-GBSA ΔG and (D) PRODIGY ΔG; a connector is red when the decoy scored better, and the number of pairs (out of 10) in which the inhibitor scored better is given in each panel. (E) MM-GBSA ΔG against the number of receptor residues within 4.5 Å of the ligand (circles: bovine trypsin; squares: S. frugiperda; filled: inhibitor; open: decoy). (F) PRODIGY ΔG against its number of intermolecular contacts. ρ: Spearman correlation (post hoc)." title="" id="26" name="Picture"/>
+            <wp:docPr descr="Figure 2. Calibration of the scoring ladder with six natural inhibitors and shuffled decoys (22 systems; Bt: bovine trypsin, Sf: S. frugiperda). Real inhibitor (filled) and shuffled decoy (open) for (A) Boltz-2 confidence, (B) Boltz-2 ipTM, (C) pLDDT of the complex and (D) ligand backbone RMSD after receptor superposition (2 ns, last third); a connector is red when the decoy scored better, and the number of pairs (out of 10) in which the inhibitor scored better is given in each panel." title="" id="26" name="Picture"/>
             <a:graphic>
               <a:graphicData uri="http://schemas.openxmlformats.org/drawingml/2006/picture">
                 <pic:pic>
@@ -4269,7 +3990,7 @@
                   <pic:spPr bwMode="auto">
                     <a:xfrm>
                       <a:off x="0" y="0"/>
-                      <a:ext cx="5334000" cy="3853030"/>
+                      <a:ext cx="5334000" cy="3556836"/>
                     </a:xfrm>
                     <a:prstGeom prst="rect">
                       <a:avLst/>
@@ -4316,20 +4037,7 @@
         <w:t xml:space="preserve">S. frugiperda</w:t>
       </w:r>
       <w:r>
-        <w:t xml:space="preserve">). (A–D) Real inhibitor (filled) and shuffled decoy (open) for (A) Boltz-2 confidence, (B) ligand backbone RMSD after receptor superposition (2 ns, last third), (C) MM-GBSA ΔG and (D) PRODIGY ΔG; a connector is red when the decoy scored better, and the number of pairs (out of 10) in which the inhibitor scored better is given in each panel. (E) MM-GBSA ΔG against the number of receptor residues within 4.5 Å of the ligand (circles: bovine trypsin; squares:</w:t>
-      </w:r>
-      <w:r>
-        <w:t xml:space="preserve"> </w:t>
-      </w:r>
-      <w:r>
-        <w:rPr>
-          <w:i/>
-          <w:iCs/>
-        </w:rPr>
-        <w:t xml:space="preserve">S. frugiperda</w:t>
-      </w:r>
-      <w:r>
-        <w:t xml:space="preserve">; filled: inhibitor; open: decoy). (F) PRODIGY ΔG against its number of intermolecular contacts. ρ: Spearman correlation (post hoc).</w:t>
+        <w:t xml:space="preserve">). Real inhibitor (filled) and shuffled decoy (open) for (A) Boltz-2 confidence, (B) Boltz-2 ipTM, (C) pLDDT of the complex and (D) ligand backbone RMSD after receptor superposition (2 ns, last third); a connector is red when the decoy scored better, and the number of pairs (out of 10) in which the inhibitor scored better is given in each panel.</w:t>
       </w:r>
     </w:p>
     <w:bookmarkEnd w:id="28"/>
@@ -7615,7 +7323,7 @@
         <w:pStyle w:val="FirstParagraph"/>
       </w:pPr>
       <w:r>
-        <w:t xml:space="preserve">We assembled and calibrated a pipeline from eight lepidopteran digestive trypsins to ranked candidate peptides, with non-cleavability by midgut proteases as an explicit binary requirement. The structural part was robust: subsites from two crystal complexes transferred to all ten receptors, and the Asp189 equivalent found by structure matched the one found from sequence. The scoring ladder was weaker: Boltz-2 separated real inhibitors from decoys within pairs, but MM-GBSA and PRODIGY did not and tracked interface size. Requiring non-cleavability left 527 linear and 543 cyclic sequences, short and almost half glycine. Ten-nanosecond simulations showed that S1 occupancy follows the Boltz-2 starting pose, so the simulations verify the stability of a pose and are not evidence of binding; the same 48 simulations at pH 8.2 gave no difference from pH 10.0 that passed a paired test, and only two peptides (NGGRPDAP, GGKPGEP) kept S1 at both pH. No result bears on inhibitory activity or on selectivity.</w:t>
+        <w:t xml:space="preserve">We assembled and calibrated a pipeline from eight lepidopteran digestive trypsins to ranked candidate peptides, with non-cleavability by midgut proteases as an explicit binary requirement. The structural part was robust: subsites from two crystal complexes transferred to all ten receptors, and the Asp189 equivalent found by structure matched the one found from sequence. The scoring ladder was weaker: Boltz-2 separated real inhibitors from decoys within pairs, but not as an absolute threshold. Requiring non-cleavability left 527 linear and 543 cyclic sequences, short and almost half glycine. Ten-nanosecond simulations showed that S1 occupancy follows the Boltz-2 starting pose, so the simulations verify the stability of a pose and are not evidence of binding; the same 48 simulations at pH 8.2 gave no difference from pH 10.0 that passed a paired test, and only two peptides (NGGRPDAP, GGKPGEP) kept S1 at both pH. No result bears on inhibitory activity or on selectivity.</w:t>
       </w:r>
     </w:p>
     <w:p>
@@ -7665,7 +7373,7 @@
         <w:pStyle w:val="BodyText"/>
       </w:pPr>
       <w:r>
-        <w:t xml:space="preserve">MM-GBSA from a single 2-ns trajectory without entropy favored the real inhibitor in 4 of 10 pairs, and PRODIGY, trained on protein–protein complexes (Vangone and Bonvin, 2015), in 2 of 10; both are close to measures of the number of contacts, consistent with the sensitivity of end-point methods to sampling and system type (Hou et al., 2011; Genheden and Ryde, 2015; Xu et al., 2025). They are therefore used to order peptides of the same receptor and protocol, with a per-residue value, and not to estimate affinity. For comparison, a single-receptor study of an interface-derived peptide against</w:t>
+        <w:t xml:space="preserve">MM-GBSA from a single trajectory without entropy and PRODIGY, trained on protein–protein complexes (Vangone and Bonvin, 2015), are sensitive to sampling and to system type (Hou et al., 2011; Genheden and Ryde, 2015; Xu et al., 2025). They are therefore used to order peptides of the same receptor and protocol, with a per-residue value, and not to estimate affinity. For comparison, a single-receptor study of an interface-derived peptide against</w:t>
       </w:r>
       <w:r>
         <w:t xml:space="preserve"> </w:t>
@@ -7918,7 +7626,7 @@
         <w:pStyle w:val="FirstParagraph"/>
       </w:pPr>
       <w:r>
-        <w:t xml:space="preserve">Natural inhibitors served as templates and calibration standards for a pipeline that takes eight lepidopteran digestive trypsins to a ranked set of short, non-cleavable peptides. Boltz-2 supports pairwise comparisons; MM-GBSA and PRODIGY order candidates by interface size; and 10-ns S1 occupancy follows the starting pose, so it does not by itself indicate binding; the occupancy of nine candidates differed by more than 0.5 between pH 8.2 and pH 10.0, in either direction without a net shift, and repeats at the same pH differed by more than 0.5 in three of 16 pairs. The four shortlisted peptides (NGGRPDAP, GQNDS, GGHSE, GGKPGEP) survived the filters available and carry no claim of selectivity or activity. The decisive tests are enzymatic.</w:t>
+        <w:t xml:space="preserve">Natural inhibitors served as templates and calibration standards for a pipeline that takes eight lepidopteran digestive trypsins to a ranked set of short, non-cleavable peptides. Boltz-2 supports pairwise comparisons; MM-GBSA and PRODIGY only order candidates against the same receptor; and 10-ns S1 occupancy follows the starting pose, so it does not by itself indicate binding; the occupancy of nine candidates differed by more than 0.5 between pH 8.2 and pH 10.0, in either direction without a net shift, and repeats at the same pH differed by more than 0.5 in three of 16 pairs. The four shortlisted peptides (NGGRPDAP, GQNDS, GGHSE, GGKPGEP) survived the filters available and carry no claim of selectivity or activity. The decisive tests are enzymatic.</w:t>
       </w:r>
     </w:p>
     <w:bookmarkEnd w:id="60"/>

</xml_diff>

<commit_message>
manuscrito: esqueletos tratados de forma generica e frentes L/M como formas quimicas avaliadas
Resumo, 2.3, 2.4, 2.5, 3.3-3.8, discussao, limitacoes, Tabela S3 e legendas (EN e PT) deixam de
afirmar que as sequencias sao ciclicas/macrociclos e passam a falar em esqueletos e em frente L
(linear) e frente M (ciclica cabeca-cauda). Figura 1 (caixas), Figura 3 (legenda e rotulos),
Figura 4 (eixos e titulo) e Figura S8 (titulo) regeneradas sem rotulos de topologia. O fato de a
difusao ter usado o fechamento cabeca-cauda continua declarado em 2.3 e na limitacao 4.4(iv).
audit_numbers: 215 verificacoes, 0 falhas.

Co-Authored-By: Claude Sonnet 5.5 <noreply@anthropic.com>
</commit_message>
<xml_diff>
--- a/manuscript/Manuscript_EN.docx
+++ b/manuscript/Manuscript_EN.docx
@@ -222,7 +222,7 @@
         <w:t xml:space="preserve">Anticarsia gemmatalis</w:t>
       </w:r>
       <w:r>
-        <w:t xml:space="preserve">, catalytic subsites from natural-inhibitor crystal complexes were transferred to AlphaFold models, and a scoring ladder (Boltz-2 and molecular dynamics) was calibrated with six inhibitors and shuffled decoys. We designed 22,066 sequences on 880 backbones, all head-to-tail macrocycles (RFdiffusion, ProteinMPNN, no cysteine), kept those with no residue that midgut trypsin-, chymotrypsin-/elastase-2- or elastase-1-type activity takes at P1 (K, R, F, Y, W, L, M, A, V), read the survivors both as macrocycles and as the corresponding linear peptides, co-folded them with Boltz-2, and simulated the top three per species and form for 10 ns, ordering them with MM-GBSA and PRODIGY.</w:t>
+        <w:t xml:space="preserve">, catalytic subsites from natural-inhibitor crystal complexes were transferred to AlphaFold models, and a scoring ladder (Boltz-2 and molecular dynamics) was calibrated with six inhibitors and shuffled decoys. We designed 22,066 sequences on 880 backbones (RFdiffusion, ProteinMPNN, no cysteine), kept those with no residue that midgut trypsin-, chymotrypsin-/elastase-2- or elastase-1-type activity takes at P1 (K, R, F, Y, W, L, M, A, V), evaluated the survivors in two forms, linear (front L) and head-to-tail cyclic (front M), co-folded them with Boltz-2, and simulated the top three per species and front for 10 ns, ordering them with MM-GBSA and PRODIGY.</w:t>
       </w:r>
       <w:r>
         <w:t xml:space="preserve"> </w:t>
@@ -238,7 +238,7 @@
         <w:t xml:space="preserve"> </w:t>
       </w:r>
       <w:r>
-        <w:t xml:space="preserve">Boltz-2 scored the inhibitor above its decoy in 10 of 10 pairs. The criterion kept 527 linear and 543 cyclic sequences, 49% glycine. Repeated Boltz-2 runs correlated at 0.57 (n = 442), close to the 0.50 between the linear and cyclic forms of one sequence. In 48 simulations at pH 10.0 (one run each) the median anchor–Asp189 distance rose from 5.7 to 6.8 Å (linear) and from 5.1 to 6.1 Å (macrocyclic); four anchors ended within 4 Å, all having started within 4.0 Å. The same 48 complexes at pH 8.2 did not differ from pH 10.0 in any paired metric (final distance</w:t>
+        <w:t xml:space="preserve">Boltz-2 scored the inhibitor above its decoy in 10 of 10 pairs. The criterion kept 527 linear and 543 cyclic sequences, 49% glycine. Repeated Boltz-2 runs correlated at 0.57 (n = 442), close to the 0.50 between the linear and cyclic forms of one sequence. In 48 simulations at pH 10.0 (one run each) the median anchor–Asp189 distance rose from 5.7 to 6.8 Å (front L) and from 5.1 to 6.1 Å (front M); four anchors ended within 4 Å, all having started within 4.0 Å. The same 48 complexes at pH 8.2 did not differ from pH 10.0 in any paired metric (final distance</w:t>
       </w:r>
       <w:r>
         <w:t xml:space="preserve"> </w:t>
@@ -270,7 +270,7 @@
         <w:t xml:space="preserve"> </w:t>
       </w:r>
       <w:r>
-        <w:t xml:space="preserve">= 0.88). The paired Boltz-2 difference against shuffled controls was positive for 63 of 78 linear and 60 of 79 macrocyclic candidates, within prediction noise.</w:t>
+        <w:t xml:space="preserve">= 0.88). The paired Boltz-2 difference against shuffled controls was positive for 63 of 78 front-L and 60 of 79 front-M candidates, within prediction noise.</w:t>
       </w:r>
       <w:r>
         <w:t xml:space="preserve"> </w:t>
@@ -477,7 +477,7 @@
         <w:pStyle w:val="BodyText"/>
       </w:pPr>
       <w:r>
-        <w:t xml:space="preserve">Canonical inhibitors insert the P1 residue of an exposed loop into the S1 pocket (Laskowski and Kato, 1980; Laskowski and Qasim, 2000). In trypsin-like enzymes S1 is defined by Asp189 and favors lysine and arginine (Perona and Craik, 1995; Hedstrom, 2002; Patarroyo-Vargas et al., 2017), which are also the cleavage sites of the target enzyme. A peptide cleaved in the gut cannot reach its target, so proteolytic stability is a requirement: the midgut also holds chymotrypsin-like and elastase-like endopeptidases and exopeptidases (Valaitis, 1995; Valaitis et al., 1999; Yang et al., 2013; Zhan et al., 2011; Nakonieczny et al., 2007). A sequence without the P1 residues of these enzymes and, as a head-to-tail macrocycle, without free termini should in principle resist them.</w:t>
+        <w:t xml:space="preserve">Canonical inhibitors insert the P1 residue of an exposed loop into the S1 pocket (Laskowski and Kato, 1980; Laskowski and Qasim, 2000). In trypsin-like enzymes S1 is defined by Asp189 and favors lysine and arginine (Perona and Craik, 1995; Hedstrom, 2002; Patarroyo-Vargas et al., 2017), which are also the cleavage sites of the target enzyme. A peptide cleaved in the gut cannot reach its target, so proteolytic stability is a requirement: the midgut also holds chymotrypsin-like and elastase-like endopeptidases and exopeptidases (Valaitis, 1995; Valaitis et al., 1999; Yang et al., 2013; Zhan et al., 2011; Nakonieczny et al., 2007). A sequence without the P1 residues of these enzymes and, when closed head-to-tail, without free termini should in principle resist them.</w:t>
       </w:r>
     </w:p>
     <w:p>
@@ -541,7 +541,7 @@
         <w:t xml:space="preserve"> </w:t>
       </w:r>
       <w:r>
-        <w:t xml:space="preserve">design is asked to supply small size and the absence of cleavage motifs. We (i) define the catalytic subsites of eight pest trypsins by structural transfer, (ii) calibrate a scoring ladder (Boltz-2 and molecular dynamics) against six natural inhibitors and shuffled decoys, (iii) generate head-to-tail macrocyclic backbones with RFdiffusion and ProteinMPNN, (iv) apply a hard non-cleavability criterion, (v) co-fold the survivors and simulate them as linear peptides and as macrocycles, and (vi) rank them by stage with a free-energy filter (Figure 1). The work is entirely computational: it includes no assay and no test of selectivity against non-target proteases.</w:t>
+        <w:t xml:space="preserve">design is asked to supply small size and the absence of cleavage motifs. We (i) define the catalytic subsites of eight pest trypsins by structural transfer, (ii) calibrate a scoring ladder (Boltz-2 and molecular dynamics) against six natural inhibitors and shuffled decoys, (iii) generate backbones with RFdiffusion and sequences with ProteinMPNN, (iv) apply a hard non-cleavability criterion, (v) co-fold the survivors and simulate them in two chemical forms, linear (front L) and head-to-tail cyclic (front M), and (vi) rank them by stage with a free-energy filter (Figure 1). The work is entirely computational: it includes no assay and no test of selectivity against non-target proteases.</w:t>
       </w:r>
     </w:p>
     <w:p>
@@ -553,7 +553,7 @@
           <wp:inline>
             <wp:extent cx="5334000" cy="3496593"/>
             <wp:effectExtent b="0" l="0" r="0" t="0"/>
-            <wp:docPr descr="Figure 1. Study design. Eight receptors with transferred subsites and a calibrated scoring ladder precede the generation of 880 backbones, all head-to-tail macrocycles, and 22,066 sequences; the hard non-cleavability criterion is then applied to the same sequences read as linear peptides (front L, 527) and as macrocycles (front M, 543), two nested readings rather than a partition; Boltz-2 co-folding, re-scoring, paired controls and pose quality control (E1–E4) yield 48 candidates (three per species and front), which are simulated for 10 ns at pH 10.0 and at pH 8.2, with 16 repeated runs, and then analysed and ranked by stage. No enzymatic assay and no counter-selection against non-target proteases was performed." title="" id="11" name="Picture"/>
+            <wp:docPr descr="Figure 1. Study design. Eight receptors with transferred subsites and a calibrated scoring ladder precede the generation of 880 backbones and 22,066 sequences; the hard non-cleavability criterion is then applied to the same sequences in each of the two chemical forms evaluated, linear (front L, 527) and head-to-tail cyclic (front M, 543), which are nested rather than a partition; Boltz-2 co-folding, re-scoring, paired controls and pose quality control (E1–E4) yield 48 candidates (three per species and front), which are simulated for 10 ns at pH 10.0 and at pH 8.2, with 16 repeated runs, and then analysed and ranked by stage. No enzymatic assay and no counter-selection against non-target proteases was performed." title="" id="11" name="Picture"/>
             <a:graphic>
               <a:graphicData uri="http://schemas.openxmlformats.org/drawingml/2006/picture">
                 <pic:pic>
@@ -606,7 +606,7 @@
         <w:t xml:space="preserve"> </w:t>
       </w:r>
       <w:r>
-        <w:t xml:space="preserve">Study design. Eight receptors with transferred subsites and a calibrated scoring ladder precede the generation of 880 backbones, all head-to-tail macrocycles, and 22,066 sequences; the hard non-cleavability criterion is then applied to the same sequences read as linear peptides (front L, 527) and as macrocycles (front M, 543), two nested readings rather than a partition; Boltz-2 co-folding, re-scoring, paired controls and pose quality control (E1–E4) yield 48 candidates (three per species and front), which are simulated for 10 ns at pH 10.0 and at pH 8.2, with 16 repeated runs, and then analysed and ranked by stage. No enzymatic assay and no counter-selection against non-target proteases was performed.</w:t>
+        <w:t xml:space="preserve">Study design. Eight receptors with transferred subsites and a calibrated scoring ladder precede the generation of 880 backbones and 22,066 sequences; the hard non-cleavability criterion is then applied to the same sequences in each of the two chemical forms evaluated, linear (front L, 527) and head-to-tail cyclic (front M, 543), which are nested rather than a partition; Boltz-2 co-folding, re-scoring, paired controls and pose quality control (E1–E4) yield 48 candidates (three per species and front), which are simulated for 10 ns at pH 10.0 and at pH 8.2, with 16 repeated runs, and then analysed and ranked by stage. No enzymatic assay and no counter-selection against non-target proteases was performed.</w:t>
       </w:r>
     </w:p>
     <w:p>
@@ -897,7 +897,7 @@
         <w:pStyle w:val="FirstParagraph"/>
       </w:pPr>
       <w:r>
-        <w:t xml:space="preserve">Head-to-tail cyclic backbones were generated with RFdiffusion 1.1.0 (Watson et al., 2023) (</w:t>
+        <w:t xml:space="preserve">Peptide backbones were generated with RFdiffusion 1.1.0 (Watson et al., 2023) (</w:t>
       </w:r>
       <w:r>
         <w:rPr>
@@ -936,7 +936,7 @@
         <w:t xml:space="preserve"> </w:t>
       </w:r>
       <w:r>
-        <w:t xml:space="preserve">0.1, cyclic mode, receptor fixed): ten backbones for each of 11 lengths (5, 6, 7, 8, 10, 12, 14, 16, 18, 19, 20 residues) and each of the eight targets (880 backbones). Every design was generated in cyclic mode, so the campaign produced no linear backbone. Hotspots were the S1 and S2 residues transferred from 1SFI; only the first eight in residue number reached RFdiffusion (equivalents of His57, Leu99, Asp189, Ser190, Cys191, Gln192, Gly193 and Asp194). ProteinMPNN (Dauparas et al., 2022) (</w:t>
+        <w:t xml:space="preserve">0.1, cyclic mode with head-to-tail closure, receptor fixed): ten backbones for each of 11 lengths (5, 6, 7, 8, 10, 12, 14, 16, 18, 19, 20 residues) and each of the eight targets (880 backbones). Hotspots were the S1 and S2 residues transferred from 1SFI; only the first eight in residue number reached RFdiffusion (equivalents of His57, Leu99, Asp189, Ser190, Cys191, Gln192, Gly193 and Asp194). ProteinMPNN (Dauparas et al., 2022) (</w:t>
       </w:r>
       <w:r>
         <w:rPr>
@@ -963,13 +963,13 @@
           <w:i/>
           <w:iCs/>
         </w:rPr>
-        <w:t xml:space="preserve">A cyclic backbone.</w:t>
-      </w:r>
-      <w:r>
-        <w:t xml:space="preserve"> </w:t>
-      </w:r>
-      <w:r>
-        <w:t xml:space="preserve">SFTI-1, the smallest natural trypsin inhibitor, is itself a head-to-tail macrocycle (Luckett et al., 1999), rigidity of the reactive loop raises affinity and resistance to proteolysis (Kelly et al., 2005), bicyclic peptides built on inhibitor loops were ten-fold more potent against</w:t>
+        <w:t xml:space="preserve">A closure constraint during diffusion.</w:t>
+      </w:r>
+      <w:r>
+        <w:t xml:space="preserve"> </w:t>
+      </w:r>
+      <w:r>
+        <w:t xml:space="preserve">The backbones were diffused with the ends joined, because SFTI-1, the smallest natural trypsin inhibitor, is itself a head-to-tail macrocycle (Luckett et al., 1999), rigidity of the reactive loop raises affinity and resistance to proteolysis (Kelly et al., 2005), bicyclic peptides built on inhibitor loops were ten-fold more potent against</w:t>
       </w:r>
       <w:r>
         <w:t xml:space="preserve"> </w:t>
@@ -985,7 +985,7 @@
         <w:t xml:space="preserve"> </w:t>
       </w:r>
       <w:r>
-        <w:t xml:space="preserve">proteases than the corresponding linear peptides (Saikhedkar et al., 2019), and a closed ring has no free terminus for the exopeptidases of the midgut (Valaitis, 1995; Valaitis et al., 1999). (ii)</w:t>
+        <w:t xml:space="preserve">proteases than the corresponding linear peptides (Saikhedkar et al., 2019), and a closed ring has no free terminus for the exopeptidases of the midgut (Valaitis, 1995; Valaitis et al., 1999). The constraint acts on the geometry used for sequence design; whether the final peptide carries the closing bond is the question asked by the two fronts below. (ii)</w:t>
       </w:r>
       <w:r>
         <w:t xml:space="preserve"> </w:t>
@@ -1001,7 +1001,7 @@
         <w:t xml:space="preserve"> </w:t>
       </w:r>
       <w:r>
-        <w:t xml:space="preserve">The alternative constraint, a disulfide, cannot be assumed to hold in this environment: midgut redox potential differs among lepidopteran larvae, reducing in some species and oxidizing in others (Appel and Martin, 1990; Johnson and Felton, 1996), so a scaffold that depends on an oxidized cystine is not transferable across the pest complex. Cysteine was therefore excluded at design time and the amide ring is the only conformational constraint in the campaign. (iii)</w:t>
+        <w:t xml:space="preserve">The alternative constraint, a disulfide, cannot be assumed to hold in this environment: midgut redox potential differs among lepidopteran larvae, reducing in some species and oxidizing in others (Appel and Martin, 1990; Johnson and Felton, 1996), so a scaffold that depends on an oxidized cystine is not transferable across the pest complex. Cysteine was therefore excluded at design time, so the backbone closure is the only conformational constraint considered. (iii)</w:t>
       </w:r>
       <w:r>
         <w:t xml:space="preserve"> </w:t>
@@ -1035,7 +1035,7 @@
         <w:t xml:space="preserve"> </w:t>
       </w:r>
       <w:r>
-        <w:t xml:space="preserve">Because every backbone is cyclic, the linear front is not a second design campaign. Front M evaluates a sequence as the head-to-tail macrocycle it was designed on; front L evaluates the same sequence as a linear peptide with free termini, whose three-dimensional structure is predicted de novo by Boltz-2 (Section 2.5) and not taken from the RFdiffusion backbone. The linear reading is kept because it is the form in which peptide inhibitors of these enzymes have been assayed (de Almeida Barros et al., 2021; Meriño-Cabrera et al., 2020b; Mariano et al., 2026) and the one that needs no ring-closing chemistry, so the two fronts ask whether a sequence selected on a cyclic backbone still survives the screens when the ring is opened. They are two readings of one sequence set and not disjoint sets (Section 3.3).</w:t>
+        <w:t xml:space="preserve">Each designed sequence was taken forward in two forms, and the whole pipeline downstream of design was run on both. Front L treats the sequence as a linear peptide with free termini; front M treats it as a head-to-tail cyclic peptide. The distinction is not a second design campaign but a chemical form, declared before the screens and carried through the non-cleavability criterion (Section 2.4), the co-folding (Section 2.5) and the simulations (Section 2.6): in front L the three-dimensional structure is predicted de novo by Boltz-2 from the sequence alone and is not taken from the backbone, whereas in front M the closing bond is imposed in the prediction and monitored in the trajectory. Front L is kept because it is the form in which peptide inhibitors of these enzymes have been assayed (de Almeida Barros et al., 2021; Meriño-Cabrera et al., 2020b; Mariano et al., 2026) and the one that needs no ring-closing chemistry, and front M because the closure removes the free termini that the midgut exopeptidases require. The two fronts therefore apply to one sequence set and are not disjoint (Section 3.3).</w:t>
       </w:r>
     </w:p>
     <w:bookmarkEnd w:id="16"/>
@@ -1129,7 +1129,7 @@
         <w:t xml:space="preserve"> </w:t>
       </w:r>
       <w:r>
-        <w:t xml:space="preserve">A sequence was kept only if no residue was K or R (trypsin-like), F, Y, W, L or M (chymotrypsin- and elastase-2-like), or A or V (elastase-1-like), unless the next residue was proline. In the linear peptide the C-terminal residue was also evaluated (it must not belong to this set or be isoleucine); in the macrocycle the closing bond was evaluated like any other. Isoleucine was allowed in the interior. The rule was applied to the same sequences for the linear (front L) and cyclic (front M) interpretation.</w:t>
+        <w:t xml:space="preserve">A sequence was kept only if no residue was K or R (trypsin-like), F, Y, W, L or M (chymotrypsin- and elastase-2-like), or A or V (elastase-1-like), unless the next residue was proline. In the linear peptide the C-terminal residue was also evaluated (it must not belong to this set or be isoleucine); in front M the closing bond was evaluated like any other. Isoleucine was allowed in the interior. The rule was applied to the same sequences for the linear (front L) and cyclic (front M) interpretation.</w:t>
       </w:r>
     </w:p>
     <w:p>
@@ -1223,7 +1223,7 @@
         <w:t xml:space="preserve"> </w:t>
       </w:r>
       <w:r>
-        <w:t xml:space="preserve">the broad elastase rule of the motif-score screen counts them at P1, but the activity actually characterised in lepidopteran midguts is elastase-2-like (P1 = Leu, already excluded), and forbidding them as well leaves 13 of the 527 linear and 14 of the 543 cyclic candidates (4 and 5 if threonine is added). They were kept, with the consequence stated: the surviving peptides are glycine-rich (Section 3.3) and remain exposed to any small-P1 activity, which an enzymatic stability assay, not a motif rule, has to settle.</w:t>
+        <w:t xml:space="preserve">the broad elastase rule of the motif-score screen counts them at P1, but the activity actually characterised in lepidopteran midguts is elastase-2-like (P1 = Leu, already excluded), and forbidding them as well leaves 13 of the 527 front-L and 14 of the 543 front-M candidates (4 and 5 if threonine is added). They were kept, with the consequence stated: the surviving peptides are glycine-rich (Section 3.3) and remain exposed to any small-P1 activity, which an enzymatic stability assay, not a motif rule, has to settle.</w:t>
       </w:r>
       <w:r>
         <w:t xml:space="preserve"> </w:t>
@@ -1255,7 +1255,7 @@
         <w:t xml:space="preserve"> </w:t>
       </w:r>
       <w:r>
-        <w:t xml:space="preserve">carboxypeptidase A activity predominates in lepidopteran midgut extracts, with carboxypeptidase B at a lower level, and it is induced by ingested soybean Kunitz inhibitor (Bown et al., 1998); carboxypeptidase activity is also high in field-collected larvae of another species (Valaitis et al., 1999); carboxypeptidase A removes C-terminal aromatic and branched aliphatic residues and carboxypeptidase B basic ones (Rawlings et al., 2018), so the forbidden set plus isoleucine was applied to the free C-terminus of the linear peptide. The macrocycle has no terminus and is not screened for exopeptidases, whereas aminopeptidases of the brush border, purified from lepidopteran midguts as a leucine aminopeptidase and as aminopeptidase N (Valaitis, 1995; Valaitis et al., 1999), act on the free N-terminus of a linear peptide whatever its sequence and is therefore not excluded by any rule. The two cut-offs of the motif score (0.3 and 0.5) are operational and were fixed before the screen; they have no literature basis.</w:t>
+        <w:t xml:space="preserve">carboxypeptidase A activity predominates in lepidopteran midgut extracts, with carboxypeptidase B at a lower level, and it is induced by ingested soybean Kunitz inhibitor (Bown et al., 1998); carboxypeptidase activity is also high in field-collected larvae of another species (Valaitis et al., 1999); carboxypeptidase A removes C-terminal aromatic and branched aliphatic residues and carboxypeptidase B basic ones (Rawlings et al., 2018), so the forbidden set plus isoleucine was applied to the free C-terminus of the linear peptide. Front M has no terminus and is not screened for exopeptidases, whereas aminopeptidases of the brush border, purified from lepidopteran midguts as a leucine aminopeptidase and as aminopeptidase N (Valaitis, 1995; Valaitis et al., 1999), act on the free N-terminus of a linear peptide whatever its sequence and is therefore not excluded by any rule. The two cut-offs of the motif score (0.3 and 0.5) are operational and were fixed before the screen; they have no literature basis.</w:t>
       </w:r>
     </w:p>
     <w:bookmarkEnd w:id="17"/>
@@ -1288,7 +1288,7 @@
         <w:t xml:space="preserve"> </w:t>
       </w:r>
       <w:r>
-        <w:t xml:space="preserve">for macrocycles). We report the</w:t>
+        <w:t xml:space="preserve">for front M). We report the</w:t>
       </w:r>
       <w:r>
         <w:t xml:space="preserve"> </w:t>
@@ -1319,7 +1319,7 @@
         <w:t xml:space="preserve"> </w:t>
       </w:r>
       <w:r>
-        <w:t xml:space="preserve">the 527 linear and 543 cyclic candidates of the hard criterion, one prediction each.</w:t>
+        <w:t xml:space="preserve">the 527 front-L and 543 front-M candidates of the hard criterion, one prediction each.</w:t>
       </w:r>
       <w:r>
         <w:t xml:space="preserve"> </w:t>
@@ -1367,7 +1367,7 @@
         <w:t xml:space="preserve"> </w:t>
       </w:r>
       <w:r>
-        <w:t xml:space="preserve">pose quality control, with thresholds fixed beforehand: no peptide–receptor heavy-atom pair closer than 2.2 Å; |ω| ≥ 150° (Pro cis accepted); L chirality; His57 Nε2–Ser195 Oγ ≤ 3.8 Å; for macrocycles, closing C–N ≤ 1.5 Å and closing ω ≥ 150°. The best candidate of each species was also co-folded with the seven other receptors (8 × 8 cross matrix). The three candidates per species and front with the highest mean E2 confidence among distinct sequences (24 linear, 24 cyclic) went to simulation; Δ was not used for selection.</w:t>
+        <w:t xml:space="preserve">pose quality control, with thresholds fixed beforehand: no peptide–receptor heavy-atom pair closer than 2.2 Å; |ω| ≥ 150° (Pro cis accepted); L chirality; His57 Nε2–Ser195 Oγ ≤ 3.8 Å; in front M, closing C–N ≤ 1.5 Å and closing ω ≥ 150°. The best candidate of each species was also co-folded with the seven other receptors (8 × 8 cross matrix). The three candidates per species and front with the highest mean E2 confidence among distinct sequences (24 per front) went to simulation; Δ was not used for selection.</w:t>
       </w:r>
     </w:p>
     <w:bookmarkEnd w:id="18"/>
@@ -1443,7 +1443,7 @@
         <w:t xml:space="preserve"> </w:t>
       </w:r>
       <w:r>
-        <w:t xml:space="preserve">termini at both pH; the macrocycle has no termini, and pdb2gmx forms the head-to-tail bond from the Boltz-2 geometry (the assembly script stops if the closing bond or CMAP term is missing). After minimization, 200 ps NVT and 500 ps NPT with position restraints (1,000 kJ mol</w:t>
+        <w:t xml:space="preserve">termini at both pH; in front M there are no termini, and pdb2gmx forms the head-to-tail bond from the Boltz-2 geometry (the assembly script stops if the closing bond or CMAP term is missing). After minimization, 200 ps NVT and 500 ps NPT with position restraints (1,000 kJ mol</w:t>
       </w:r>
       <w:r>
         <w:rPr>
@@ -1491,7 +1491,7 @@
         <w:t xml:space="preserve">gmx trjconv -pbc mol -center</w:t>
       </w:r>
       <w:r>
-        <w:t xml:space="preserve">), because receptor and peptide are separate molecules that can be written to different periodic images; analyses used MDAnalysis 2.9.0 (Michaud-Agrawal et al., 2011; Gowers et al., 2016). In each frame, the distance from each peptide residue to the carboxylate oxygens of the Asp189 equivalent was the minimum heavy-atom distance, and the residue with the smallest mean distance was the anchor (defined post hoc, without assuming which residue). S1 occupancy is the fraction of frames with anchor–Asp189 distance below 5 Å (4 and 6 Å also computed), for the whole trajectory and each half. The anchor–Asp189 distance and the peptide Cα RMSD after receptor superposition are reported for an initial (first 0.4 ns) and a final window (last 2 ns). We also report the fraction of frames with any peptide atom within 4.5 Å of the catalytic Ser Oγ or His Nε2 or of the receptor and, for macrocycles, the closing C–N distance and ω in every frame. The screen declared beforehand required second-half occupancy ≥ 70%, the same anchor in both halves and, for macrocycles, an intact ring (C–N ≤ 1.5 Å, ω ≥ 150° in every frame). On 2 October 2026, after the first 16 simulations, occupancy was demoted from a gate to a description (Section 3.5), a change of the declared procedure made after seeing data. With one run per candidate no statistical inference is made.</w:t>
+        <w:t xml:space="preserve">), because receptor and peptide are separate molecules that can be written to different periodic images; analyses used MDAnalysis 2.9.0 (Michaud-Agrawal et al., 2011; Gowers et al., 2016). In each frame, the distance from each peptide residue to the carboxylate oxygens of the Asp189 equivalent was the minimum heavy-atom distance, and the residue with the smallest mean distance was the anchor (defined post hoc, without assuming which residue). S1 occupancy is the fraction of frames with anchor–Asp189 distance below 5 Å (4 and 6 Å also computed), for the whole trajectory and each half. The anchor–Asp189 distance and the peptide Cα RMSD after receptor superposition are reported for an initial (first 0.4 ns) and a final window (last 2 ns). We also report the fraction of frames with any peptide atom within 4.5 Å of the catalytic Ser Oγ or His Nε2 or of the receptor and, in front M, the closing C–N distance and ω in every frame. The screen declared beforehand required second-half occupancy ≥ 70%, the same anchor in both halves and, in front M, an intact ring (C–N ≤ 1.5 Å, ω ≥ 150° in every frame). On 2 October 2026, after the first 16 simulations, occupancy was demoted from a gate to a description (Section 3.5), a change of the declared procedure made after seeing data. With one run per candidate no statistical inference is made.</w:t>
       </w:r>
     </w:p>
     <w:p>
@@ -1536,7 +1536,7 @@
         <w:pStyle w:val="FirstParagraph"/>
       </w:pPr>
       <w:r>
-        <w:t xml:space="preserve">MM-GBSA used gmx_MMPBSA (Valdés-Tresanco et al., 2021) (MMPBSA.py (Miller et al., 2012); generalized Born igb = 5 (Onufriev et al., 2004); 0.150 M salt; single trajectory; no entropy) on the second half of each trajectory (126 frames; receptor chain A, peptide chain B), with a standard error over five blocks of frames. PRODIGY (Vangone and Bonvin, 2015), a contact-based predictor with no explicit protonation, was applied to the initial pose (protonated at pH 8.2) and to 30 frames of the second half. Both scores grow with interface size, so each is also given per residue; neither was calibrated as a discriminator between real and shuffled inhibitors, and they order candidates against the same receptor without being read as affinities. Each stage ranks the candidates within a front (1 = best; ties receive the mean rank): Boltz-2 E2 confidence, paired Δ (E3), final peptide RMSD at pH 8.2, PRODIGY on the pose, and PRODIGY and MM-GBSA on the trajectory at pH 8.2; the aggregate is the mean rank over the stages. The ranking covers candidates that passed the pose quality control, had Δ &gt; 0 and, for macrocycles, met the strict ring criterion; S1 occupancy does not enter (Section 3.5). The pH 8.2 and pH 10.0 simulations are paired (same pose and protocol; they differ in side-chain protonation, counter-ions and seed) and compared by the paired difference of each metric (Wilcoxon signed-rank test), the rank correlation between pH and the agreement of categorical outcomes, read against the difference between runs of the same pH.</w:t>
+        <w:t xml:space="preserve">MM-GBSA used gmx_MMPBSA (Valdés-Tresanco et al., 2021) (MMPBSA.py (Miller et al., 2012); generalized Born igb = 5 (Onufriev et al., 2004); 0.150 M salt; single trajectory; no entropy) on the second half of each trajectory (126 frames; receptor chain A, peptide chain B), with a standard error over five blocks of frames. PRODIGY (Vangone and Bonvin, 2015), a contact-based predictor with no explicit protonation, was applied to the initial pose (protonated at pH 8.2) and to 30 frames of the second half. Both scores grow with interface size, so each is also given per residue; neither was calibrated as a discriminator between real and shuffled inhibitors, and they order candidates against the same receptor without being read as affinities. Each stage ranks the candidates within a front (1 = best; ties receive the mean rank): Boltz-2 E2 confidence, paired Δ (E3), final peptide RMSD at pH 8.2, PRODIGY on the pose, and PRODIGY and MM-GBSA on the trajectory at pH 8.2; the aggregate is the mean rank over the stages. The ranking covers candidates that passed the pose quality control, had Δ &gt; 0 and, in front M, met the strict ring criterion; S1 occupancy does not enter (Section 3.5). The pH 8.2 and pH 10.0 simulations are paired (same pose and protocol; they differ in side-chain protonation, counter-ions and seed) and compared by the paired difference of each metric (Wilcoxon signed-rank test), the rank correlation between pH and the agreement of categorical outcomes, read against the difference between runs of the same pH.</w:t>
       </w:r>
     </w:p>
     <w:bookmarkEnd w:id="21"/>
@@ -5265,7 +5265,7 @@
         <w:pStyle w:val="BodyText"/>
       </w:pPr>
       <w:r>
-        <w:t xml:space="preserve">The hard criterion (Figure S1) left 527 sequences (2.4%) for the linear peptide and 543 (2.5%) for the macrocycle, 41–86 and 41–87 per species (Figure 3); because sequences were merged within a species and not across species, these counts are sequence–target pairs and correspond to 445 and 461 distinct sequences. All 527 linear sequences are in the cyclic set; of the 16 cyclic-only sequences, 14 end in a forbidden residue followed across the closure by a proline that is also the first residue, and two end in isoleucine. The two fronts are therefore nested readings of one set and not a partition of it. The hard set and the motif-score set, by contrast, do not nest (396 of the 543 cyclic candidates, 73%, were also resistant-like), and the discrepancy has a single cause: the elastase rule of the motif score counts glycine and serine at P1, which the hard criterion does not forbid (Section 2.4), so the 147 candidates that the motif score does not call resistant-like are the glycine-rich ones (85.9% glycine and mean length 10.1 residues, against 27.9% and 6.8 in the 396 that both screens accept). The hard set is short and glycine-rich (Figure S3): mean length 7.7 residues, 430 of 527 linear sequences (81.6%) with 8 residues or fewer, and glycine 49.4% of the 4,060 residues, followed by serine (11.7%), proline (9.8%), threonine (9.0%) and aspartate (5.8%). Lysine or arginine accounted for nine residues (0.22%), each followed by proline (six Arg–Pro, three Lys–Pro). The criterion is sensitive to where its boundary is drawn: forbidding isoleucine in the interior as well leaves 393 linear sequences, forbidding glycine leaves 49, forbidding glycine and serine leaves 13, and adding threonine leaves 4.</w:t>
+        <w:t xml:space="preserve">The hard criterion (Figure S1) left 527 sequences (2.4%) in front L and 543 (2.5%) in front M, 41–86 and 41–87 per species (Figure 3); because sequences were merged within a species and not across species, these counts are sequence–target pairs and correspond to 445 and 461 distinct sequences. All 527 front-L sequences are also in front M; of the 16 that pass only in front M, 14 end in a forbidden residue followed across the closure by a proline that is also the first residue, and two end in isoleucine. The two fronts are therefore nested and not a partition of the set. The hard set and the motif-score set, by contrast, do not nest (396 of the 543 front-M candidates, 73%, were also resistant-like), and the discrepancy has a single cause: the elastase rule of the motif score counts glycine and serine at P1, which the hard criterion does not forbid (Section 2.4), so the 147 candidates that the motif score does not call resistant-like are the glycine-rich ones (85.9% glycine and mean length 10.1 residues, against 27.9% and 6.8 in the 396 that both screens accept). The hard set is short and glycine-rich (Figure S3): mean length 7.7 residues, 430 of the 527 front-L sequences (81.6%) with 8 residues or fewer, and glycine 49.4% of the 4,060 residues, followed by serine (11.7%), proline (9.8%), threonine (9.0%) and aspartate (5.8%). Lysine or arginine accounted for nine residues (0.22%), each followed by proline (six Arg–Pro, three Lys–Pro). The criterion is sensitive to where its boundary is drawn: forbidding isoleucine in the interior as well leaves 393 front-L sequences, forbidding glycine leaves 49, forbidding glycine and serine leaves 13, and adding threonine leaves 4.</w:t>
       </w:r>
     </w:p>
     <w:p>
@@ -5277,7 +5277,7 @@
           <wp:inline>
             <wp:extent cx="5334000" cy="1982992"/>
             <wp:effectExtent b="0" l="0" r="0" t="0"/>
-            <wp:docPr descr="Figure 3. Candidates surviving each screen. Left: sequences per species labelled resistant-like by the first-round motif score (circular rule) and by the hard criterion for the linear (front L) and cyclic (front M) interpretation; right: totals out of 22,066 sequences." title="" id="30" name="Picture"/>
+            <wp:docPr descr="Figure 3. Candidates surviving each screen. Left: sequences per species labelled resistant-like by the first-round motif score and by the hard criterion in each of the two fronts; right: totals out of 22,066 sequences." title="" id="30" name="Picture"/>
             <a:graphic>
               <a:graphicData uri="http://schemas.openxmlformats.org/drawingml/2006/picture">
                 <pic:pic>
@@ -5330,7 +5330,7 @@
         <w:t xml:space="preserve"> </w:t>
       </w:r>
       <w:r>
-        <w:t xml:space="preserve">Candidates surviving each screen. Left: sequences per species labelled resistant-like by the first-round motif score (circular rule) and by the hard criterion for the linear (front L) and cyclic (front M) interpretation; right: totals out of 22,066 sequences.</w:t>
+        <w:t xml:space="preserve">Candidates surviving each screen. Left: sequences per species labelled resistant-like by the first-round motif score and by the hard criterion in each of the two fronts; right: totals out of 22,066 sequences.</w:t>
       </w:r>
     </w:p>
     <w:bookmarkEnd w:id="32"/>
@@ -5348,7 +5348,7 @@
         <w:pStyle w:val="FirstParagraph"/>
       </w:pPr>
       <w:r>
-        <w:t xml:space="preserve">All 527 linear and 543 cyclic candidates were predicted (E1; mean confidence 0.874 and 0.862). Predicting 442 cyclic candidates a second time with identical input gave a rank correlation of only 0.57 between runs (mean absolute difference 0.028; 0.21–0.69 by species), and the linear and cyclic predictions of the same sequence (n = 527) correlated at 0.50 (Figure 4). The agreement between the two modalities is therefore close to the agreement between two runs of the same modality, and a single prediction cannot separate an effect of modality from sampling noise. In E2, the ten best candidates per species and front were re-predicted (15 predictions each): mean confidence fell from 0.922 to 0.900 (linear) and from 0.911 to 0.888 (cyclic), the regression expected for a top-ranked set; the standard deviation among the 15 predictions of one candidate averaged 0.019 and 0.022, of the order of the spread among the ten candidates of a species, so the order within a top ten is not resolved (Figure S4). Every candidate had at least one sample that passed the pose quality control, and the 48 selected candidates all passed it, with the catalytic triad intact (His57–Ser195 distance 2.4–3.4 Å) and no peptide–receptor heavy-atom pair closer than 2.4 Å (Figure S5). The minimum distance to the Asp189 carboxylate in the starting structure was 5 Å or less in 9 of 24 linear and 18 of 24 cyclic structures. Only three of the 48 contain lysine or arginine (linear NGGRPDAP; cyclic PISQIDSGSR and GGKPGEP).</w:t>
+        <w:t xml:space="preserve">All 527 front-L and 543 front-M candidates were predicted (E1; mean confidence 0.874 and 0.862). Predicting 442 candidates a second time with identical input gave a rank correlation of only 0.57 between runs (mean absolute difference 0.028; 0.21–0.69 by species), and the two fronts of the same sequence (n = 527) correlated at 0.50 (Figure 4). The agreement between the two forms is therefore close to the agreement between two runs of one of them, and a single prediction cannot separate an effect of the form from sampling noise. In E2, the ten best candidates per species and front were re-predicted (15 predictions each): mean confidence fell from 0.922 to 0.900 (front L) and from 0.911 to 0.888 (front M), the regression expected for a top-ranked set; the standard deviation among the 15 predictions of one candidate averaged 0.019 and 0.022, of the order of the spread among the ten candidates of a species, so the order within a top ten is not resolved (Figure S4). Every candidate had at least one sample that passed the pose quality control, and the 48 selected candidates all passed it, with the catalytic triad intact (His57–Ser195 distance 2.4–3.4 Å) and no peptide–receptor heavy-atom pair closer than 2.4 Å (Figure S5). The minimum distance to the Asp189 carboxylate in the starting structure was 5 Å or less in 9 of the 24 front-L and 18 of the 24 front-M structures. Only three of the 48 contain lysine or arginine (NGGRPDAP in front L; PISQIDSGSR and GGKPGEP in front M).</w:t>
       </w:r>
     </w:p>
     <w:p>
@@ -5356,7 +5356,7 @@
         <w:pStyle w:val="BodyText"/>
       </w:pPr>
       <w:r>
-        <w:t xml:space="preserve">The paired difference Δ against three shuffled controls (E3) was positive in 63 of 78 linear candidates (81%; median 0.013, interquartile range 0.003–0.030) and in 60 of 79 cyclic ones (76%; median 0.014; the other two linear and one cyclic candidate of the 80 per front are poly-glycine and cannot be shuffled); among the 48 final candidates it was positive in 23 of 24 linear and 22 of 24 cyclic. The differences are of the order of the standard deviation among the 15 predictions of a candidate (0.02), each Δ rests on three controls, and the shuffled controls of glycine-rich sequences are similar to the candidate (mean identity 0.35 linear, 0.29 cyclic); a positive Δ therefore means that the candidate did not score below its controls, and not that it binds; that poly-glycine sequences, which have no shuffled control, were among the ten best by first-pass (E1) confidence in both fronts points the same way, since a score that rewards a homopolymer is not reporting specific recognition. The cross matrix (best candidate of each species against its own and the seven other receptors) showed no species-specific preference: the own receptor gave the highest confidence in 4 of 8 (linear) and 3 of 8 (cyclic) species, and the receptor explained more variation than the peptide (the</w:t>
+        <w:t xml:space="preserve">The paired difference Δ against three shuffled controls (E3) was positive in 63 of 78 linear candidates (81%; median 0.013, interquartile range 0.003–0.030) and in 60 of 79 cyclic ones (76%; median 0.014; the other two linear and one cyclic candidate of the 80 per front are poly-glycine and cannot be shuffled); among the 48 final candidates it was positive in 23 of 24 linear and 22 of 24 cyclic. The differences are of the order of the standard deviation among the 15 predictions of a candidate (0.02), each Δ rests on three controls, and the shuffled controls of glycine-rich sequences are similar to the candidate (mean identity 0.35 in front L, 0.29 in front M); a positive Δ therefore means that the candidate did not score below its controls, and not that it binds; that poly-glycine sequences, which have no shuffled control, were among the ten best by first-pass (E1) confidence in both fronts points the same way, since a score that rewards a homopolymer is not reporting specific recognition. The cross matrix (best candidate of each species against its own and the seven other receptors) showed no species-specific preference: the own receptor gave the highest confidence in 4 of 8 (linear) and 3 of 8 (cyclic) species, and the receptor explained more variation than the peptide (the</w:t>
       </w:r>
       <w:r>
         <w:t xml:space="preserve"> </w:t>
@@ -5384,7 +5384,7 @@
           <wp:inline>
             <wp:extent cx="5334000" cy="2414733"/>
             <wp:effectExtent b="0" l="0" r="0" t="0"/>
-            <wp:docPr descr="Figure 4. Reproducibility of Boltz-2 confidence in the two-front screen. (A) The same 442 cyclic candidates predicted in the first round and again in the two-front screen with identical input. (B) The same 527 sequences predicted as cyclic and as linear peptides. The dotted line is identity; ρ is the Spearman correlation and |Δ| the mean absolute difference." title="" id="34" name="Picture"/>
+            <wp:docPr descr="Figure 4. Reproducibility of Boltz-2 confidence in the two-front screen. (A) The same 442 candidates predicted in the first round and again in the two-front screen with identical input. (B) The same 527 sequences predicted in each of the two fronts. The dotted line is identity; ρ is the Spearman correlation and |Δ| the mean absolute difference." title="" id="34" name="Picture"/>
             <a:graphic>
               <a:graphicData uri="http://schemas.openxmlformats.org/drawingml/2006/picture">
                 <pic:pic>
@@ -5437,7 +5437,7 @@
         <w:t xml:space="preserve"> </w:t>
       </w:r>
       <w:r>
-        <w:t xml:space="preserve">Reproducibility of Boltz-2 confidence in the two-front screen. (A) The same 442 cyclic candidates predicted in the first round and again in the two-front screen with identical input. (B) The same 527 sequences predicted as cyclic and as linear peptides. The dotted line is identity; ρ is the Spearman correlation and |Δ| the mean absolute difference.</w:t>
+        <w:t xml:space="preserve">Reproducibility of Boltz-2 confidence in the two-front screen. (A) The same 442 candidates predicted in the first round and again in the two-front screen with identical input. (B) The same 527 sequences predicted in each of the two fronts. The dotted line is identity; ρ is the Spearman correlation and |Δ| the mean absolute difference.</w:t>
       </w:r>
     </w:p>
     <w:bookmarkEnd w:id="36"/>
@@ -5532,7 +5532,7 @@
           <wp:inline>
             <wp:extent cx="5334000" cy="5484607"/>
             <wp:effectExtent b="0" l="0" r="0" t="0"/>
-            <wp:docPr descr="Figure 5. Ten-nanosecond screening simulations at pH 10.0 (CHARMM36, 300 K, one run each; all 48 finished). (A) Distance from the anchor residue to the Asp189 carboxylate and (B) local peptide RMSD (Cα, receptor-aligned) for the three A. gemmatalis candidates of each front (solid, dashed and dotted: candidates 1, 2 and 3). (C) S1 occupancy at 5 Å in the first and second halves for all 48 simulations (circle: passes the screen as originally declared; cross: does not; the dashed line is the 70% level, now descriptive). (D) Per simulation, linear (top) and macrocyclic (bottom): second-half occupancy, contact with the catalytic serine and any receptor contact; ✗ marks macrocycles that failed the strict ring criterion and ✓ those that met it." title="" id="38" name="Picture"/>
+            <wp:docPr descr="Figure 5. Ten-nanosecond screening simulations at pH 10.0 (CHARMM36, 300 K, one run each; all 48 finished). (A) Distance from the anchor residue to the Asp189 carboxylate and (B) local peptide RMSD (Cα, receptor-aligned) for the three A. gemmatalis candidates of each front (solid, dashed and dotted: candidates 1, 2 and 3). (C) S1 occupancy at 5 Å in the first and second halves for all 48 simulations (circle: passes the screen as originally declared; cross: does not; the dashed line is the 70% level, now descriptive). (D) Per simulation, front L (top) and front M (bottom): second-half occupancy, contact with the catalytic serine and any receptor contact; ✗ marks front-M candidates that failed the strict ring criterion and ✓ those that met it." title="" id="38" name="Picture"/>
             <a:graphic>
               <a:graphicData uri="http://schemas.openxmlformats.org/drawingml/2006/picture">
                 <pic:pic>
@@ -5601,7 +5601,7 @@
         <w:t xml:space="preserve"> </w:t>
       </w:r>
       <w:r>
-        <w:t xml:space="preserve">candidates of each front (solid, dashed and dotted: candidates 1, 2 and 3). (C) S1 occupancy at 5 Å in the first and second halves for all 48 simulations (circle: passes the screen as originally declared; cross: does not; the dashed line is the 70% level, now descriptive). (D) Per simulation, linear (top) and macrocyclic (bottom): second-half occupancy, contact with the catalytic serine and any receptor contact; ✗ marks macrocycles that failed the strict ring criterion and ✓ those that met it.</w:t>
+        <w:t xml:space="preserve">candidates of each front (solid, dashed and dotted: candidates 1, 2 and 3). (C) S1 occupancy at 5 Å in the first and second halves for all 48 simulations (circle: passes the screen as originally declared; cross: does not; the dashed line is the 70% level, now descriptive). (D) Per simulation, front L (top) and front M (bottom): second-half occupancy, contact with the catalytic serine and any receptor contact; ✗ marks front-M candidates that failed the strict ring criterion and ✓ those that met it.</w:t>
       </w:r>
     </w:p>
     <w:bookmarkEnd w:id="40"/>
@@ -5631,7 +5631,7 @@
         <w:t xml:space="preserve"> </w:t>
       </w:r>
       <w:r>
-        <w:t xml:space="preserve">(median −9.6) and followed the size of the peptide (Spearman ρ with the number of residues −0.60; with the number of contacts −0.62; Figure 6A). The lowest values belong to the longest macrocycles (QSPDFPNPPNNH −12.2 and QAPDFPTGPNQS −12.1, both</w:t>
+        <w:t xml:space="preserve">(median −9.6) and followed the size of the peptide (Spearman ρ with the number of residues −0.60; with the number of contacts −0.62; Figure 6A). The lowest values belong to the longest candidates of front M (QSPDFPNPPNNH −12.2 and QAPDFPTGPNQS −12.1, both</w:t>
       </w:r>
       <w:r>
         <w:t xml:space="preserve"> </w:t>
@@ -5785,7 +5785,7 @@
           <wp:inline>
             <wp:extent cx="5334000" cy="4445418"/>
             <wp:effectExtent b="0" l="0" r="0" t="0"/>
-            <wp:docPr descr="Figure 6. Energy filter and ranking by stage. (A) PRODIGY ΔG of the initial pose of the 48 candidates against peptide length (ρ: Spearman). (B) Rank of each candidate within its front at each stage and the aggregate (mean rank) for the ten best candidates of each front among those that passed the gates; stages shown: Boltz-2 E2 confidence, paired Δ (E3), final peptide RMSD, PRODIGY on the pose, PRODIGY on trajectory frames and MM-GBSA (the last three stages from the 10-ns simulation at pH 8.2). The number printed in a cell is the raw rank (1 = best); the colour is that rank relative to the number of candidates ranked in the same front (23 linear, 10 macrocyclic), because a given rank does not mean the same in pools of different size." title="" id="42" name="Picture"/>
+            <wp:docPr descr="Figure 6. Energy filter and ranking by stage. (A) PRODIGY ΔG of the initial pose of the 48 candidates against peptide length (ρ: Spearman). (B) Rank of each candidate within its front at each stage and the aggregate (mean rank) for the ten best candidates of each front among those that passed the gates; stages shown: Boltz-2 E2 confidence, paired Δ (E3), final peptide RMSD, PRODIGY on the pose, PRODIGY on trajectory frames and MM-GBSA (the last three stages from the 10-ns simulation at pH 8.2). The number printed in a cell is the raw rank (1 = best); the colour is that rank relative to the number of candidates ranked in the same front (23 in front L, 10 in front M), because a given rank does not mean the same in pools of different size." title="" id="42" name="Picture"/>
             <a:graphic>
               <a:graphicData uri="http://schemas.openxmlformats.org/drawingml/2006/picture">
                 <pic:pic>
@@ -5838,7 +5838,7 @@
         <w:t xml:space="preserve"> </w:t>
       </w:r>
       <w:r>
-        <w:t xml:space="preserve">Energy filter and ranking by stage. (A) PRODIGY ΔG of the initial pose of the 48 candidates against peptide length (ρ: Spearman). (B) Rank of each candidate within its front at each stage and the aggregate (mean rank) for the ten best candidates of each front among those that passed the gates; stages shown: Boltz-2 E2 confidence, paired Δ (E3), final peptide RMSD, PRODIGY on the pose, PRODIGY on trajectory frames and MM-GBSA (the last three stages from the 10-ns simulation at pH 8.2). The number printed in a cell is the raw rank (1 = best); the colour is that rank relative to the number of candidates ranked in the same front (23 linear, 10 macrocyclic), because a given rank does not mean the same in pools of different size.</w:t>
+        <w:t xml:space="preserve">Energy filter and ranking by stage. (A) PRODIGY ΔG of the initial pose of the 48 candidates against peptide length (ρ: Spearman). (B) Rank of each candidate within its front at each stage and the aggregate (mean rank) for the ten best candidates of each front among those that passed the gates; stages shown: Boltz-2 E2 confidence, paired Δ (E3), final peptide RMSD, PRODIGY on the pose, PRODIGY on trajectory frames and MM-GBSA (the last three stages from the 10-ns simulation at pH 8.2). The number printed in a cell is the raw rank (1 = best); the colour is that rank relative to the number of candidates ranked in the same front (23 in front L, 10 in front M), because a given rank does not mean the same in pools of different size.</w:t>
       </w:r>
     </w:p>
     <w:bookmarkEnd w:id="44"/>
@@ -5880,7 +5880,7 @@
         <w:pStyle w:val="BodyText"/>
       </w:pPr>
       <w:r>
-        <w:t xml:space="preserve">All 48 simulations at pH 8.2 (24 linear, 24 macrocyclic) finished and are paired in Figure 7 with the same candidates at pH 10.0 (same initial pose; only the protonation state assigned by PROPKA, which differed in a median of one residue per system, and the number of counter-ions change). The final anchor–Asp189 distance had a median of 6.40 Å at pH 8.2 against 6.62 Å at pH 10.0 (Wilcoxon</w:t>
+        <w:t xml:space="preserve">All 48 simulations at pH 8.2 (24 per front) finished and are paired in Figure 7 with the same candidates at pH 10.0 (same initial pose; only the protonation state assigned by PROPKA, which differed in a median of one residue per system, and the number of counter-ions change). The final anchor–Asp189 distance had a median of 6.40 Å at pH 8.2 against 6.62 Å at pH 10.0 (Wilcoxon</w:t>
       </w:r>
       <w:r>
         <w:t xml:space="preserve"> </w:t>
@@ -5922,7 +5922,7 @@
         <w:t xml:space="preserve"> </w:t>
       </w:r>
       <w:r>
-        <w:t xml:space="preserve">= 0.63). The anchor was within 4 Å of Asp189 in the final window in 4 simulations at each pH, and farther than 10 Å in 5 at pH 8.2 and 10 at pH 10.0. An occupancy of at least 0.70 occurred in six simulations at pH 8.2 (NGGRPDAP, GGKPGEP, the macrocycles PISQIDSGSR, GGHGGG and GGSDHT, and GENGGPG) and in five at pH 10.0 (NGGRPDAP, GGKPGEP, linear GQNDS, GGHSE and GGGGH); only NGGRPDAP and GGKPGEP reached it at both, four reached it at pH 8.2 alone and three at pH 10.0 alone, and 39 of the 48 pairs at neither. The occupancy differed by more than 0.5 between pH in nine pairs, in both directions. The outcome at one pH predicted the other moderately for the final distance (Spearman ρ = 0.51,</w:t>
+        <w:t xml:space="preserve">= 0.63). The anchor was within 4 Å of Asp189 in the final window in 4 simulations at each pH, and farther than 10 Å in 5 at pH 8.2 and 10 at pH 10.0. An occupancy of at least 0.70 occurred in six simulations at pH 8.2 (NGGRPDAP, GGKPGEP, the front-M candidates PISQIDSGSR, GGHGGG and GGSDHT, and GENGGPG) and in five at pH 10.0 (NGGRPDAP, GGKPGEP, linear GQNDS, GGHSE and GGGGH); only NGGRPDAP and GGKPGEP reached it at both, four reached it at pH 8.2 alone and three at pH 10.0 alone, and 39 of the 48 pairs at neither. The occupancy differed by more than 0.5 between pH in nine pairs, in both directions. The outcome at one pH predicted the other moderately for the final distance (Spearman ρ = 0.51,</w:t>
       </w:r>
       <w:r>
         <w:t xml:space="preserve"> </w:t>
@@ -5954,7 +5954,7 @@
         <w:t xml:space="preserve"> </w:t>
       </w:r>
       <w:r>
-        <w:t xml:space="preserve">= 0.002). Linear GQNDS occupied S1 only in the first half at pH 8.2 (0.97, then 0.04), GGHSE left it (final distance 8.61 Å, occupancy 0.00; minimum |ω| 149.5° against 153.7° at pH 10.0) and GGGGH did too (0.07 against 0.82; started at 4.11 Å against 2.93 Å), whereas GGHGGG (0.91 against 0.00), GGSDHT (1.00 against 0.00), GENGGPG (0.85 against 0.41) and PISQIDSGSR were closer to S1 at pH 8.2. PISQIDSGSR, an Arg-anchored macrocycle, kept the Arg in S1 at pH 8.2 (occupancy 1.00, final distance 2.80 Å, started at 3.21 Å) and lost it at pH 10.0 (0.33; 5.21 Å; started at 3.97 Å). NGGRPDAP and GGKPGEP, the two peptides whose anchor is a basic residue followed by proline (Arg and Lys), kept S1 at both pH: occupancy 0.98 and 1.00 and final distance 2.84 and 2.74 Å for NGGRPDAP; occupancy 1.00 at both pH and 2.71 Å for GGKPGEP, whose ring met the strict criterion at pH 8.2 (minimum |ω| 156.7° against 144.5° at pH 10.0).</w:t>
+        <w:t xml:space="preserve">= 0.002). Linear GQNDS occupied S1 only in the first half at pH 8.2 (0.97, then 0.04), GGHSE left it (final distance 8.61 Å, occupancy 0.00; minimum |ω| 149.5° against 153.7° at pH 10.0) and GGGGH did too (0.07 against 0.82; started at 4.11 Å against 2.93 Å), whereas GGHGGG (0.91 against 0.00), GGSDHT (1.00 against 0.00), GENGGPG (0.85 against 0.41) and PISQIDSGSR were closer to S1 at pH 8.2. PISQIDSGSR, an Arg-anchored candidate of front M, kept the Arg in S1 at pH 8.2 (occupancy 1.00, final distance 2.80 Å, started at 3.21 Å) and lost it at pH 10.0 (0.33; 5.21 Å; started at 3.97 Å). NGGRPDAP and GGKPGEP, the two peptides whose anchor is a basic residue followed by proline (Arg and Lys), kept S1 at both pH: occupancy 0.98 and 1.00 and final distance 2.84 and 2.74 Å for NGGRPDAP; occupancy 1.00 at both pH and 2.71 Å for GGKPGEP, whose ring met the strict criterion at pH 8.2 (minimum |ω| 156.7° against 144.5° at pH 10.0).</w:t>
       </w:r>
       <w:r>
         <w:t xml:space="preserve"> </w:t>
@@ -6130,7 +6130,7 @@
           <wp:inline>
             <wp:extent cx="5334000" cy="3704933"/>
             <wp:effectExtent b="0" l="0" r="0" t="0"/>
-            <wp:docPr descr="Figure 7. Comparison of the 48 simulations at pH 8.2 and pH 10.0 (one run per pH with different seeds). (A, B) Paired final anchor–Asp189 distance and second-half S1 occupancy at 5 Å (dotted lines: 4 Å and 0.70; Wilcoxon signed-rank test). (C–E) pH 8.2 against pH 10.0 for the final distance, MM-GBSA ΔG and PRODIGY ΔG on trajectory frames (dotted line: identity; ρ: Spearman correlation). Blue: linear; teal: macrocycle; highlighted: NGGRPDAP, GGKPGEP, GQNDS and GGHSE." title="" id="46" name="Picture"/>
+            <wp:docPr descr="Figure 7. Comparison of the 48 simulations at pH 8.2 and pH 10.0 (one run per pH with different seeds). (A, B) Paired final anchor–Asp189 distance and second-half S1 occupancy at 5 Å (dotted lines: 4 Å and 0.70; Wilcoxon signed-rank test). (C–E) pH 8.2 against pH 10.0 for the final distance, MM-GBSA ΔG and PRODIGY ΔG on trajectory frames (dotted line: identity; ρ: Spearman correlation). Blue: front L; teal: front M; highlighted: NGGRPDAP, GGKPGEP, GQNDS and GGHSE." title="" id="46" name="Picture"/>
             <a:graphic>
               <a:graphicData uri="http://schemas.openxmlformats.org/drawingml/2006/picture">
                 <pic:pic>
@@ -6183,7 +6183,7 @@
         <w:t xml:space="preserve"> </w:t>
       </w:r>
       <w:r>
-        <w:t xml:space="preserve">Comparison of the 48 simulations at pH 8.2 and pH 10.0 (one run per pH with different seeds). (A, B) Paired final anchor–Asp189 distance and second-half S1 occupancy at 5 Å (dotted lines: 4 Å and 0.70; Wilcoxon signed-rank test). (C–E) pH 8.2 against pH 10.0 for the final distance, MM-GBSA ΔG and PRODIGY ΔG on trajectory frames (dotted line: identity; ρ: Spearman correlation). Blue: linear; teal: macrocycle; highlighted: NGGRPDAP, GGKPGEP, GQNDS and GGHSE.</w:t>
+        <w:t xml:space="preserve">Comparison of the 48 simulations at pH 8.2 and pH 10.0 (one run per pH with different seeds). (A, B) Paired final anchor–Asp189 distance and second-half S1 occupancy at 5 Å (dotted lines: 4 Å and 0.70; Wilcoxon signed-rank test). (C–E) pH 8.2 against pH 10.0 for the final distance, MM-GBSA ΔG and PRODIGY ΔG on trajectory frames (dotted line: identity; ρ: Spearman correlation). Blue: front L; teal: front M; highlighted: NGGRPDAP, GGKPGEP, GQNDS and GGHSE.</w:t>
       </w:r>
     </w:p>
     <w:bookmarkEnd w:id="48"/>
@@ -6300,7 +6300,7 @@
         <w:pStyle w:val="BodyText"/>
       </w:pPr>
       <w:r>
-        <w:t xml:space="preserve">These controls were simulated for a different question — whether S1 occupancy separates sequence from starting pose — which they did not answer (Section 3.5); the matched starting distance that made them uninformative there is what makes them a valid baseline here. The comparison rests on one exposed site, one run and one pH; a near-attack fraction is not a rate; and the criterion is geometric, so it does not encode specificity, which is why the bond that most often approaches the serine in the protected peptides, the glycine–basic bond preceding the anchor, is not a cleavage risk for an enzyme that requires lysine or arginine at P1. The result also says nothing about exopeptidases: the hard criterion evaluates the C-terminal residue but not aminopeptidase N, which processes a free N-terminus whatever the internal sequence, so it applies to the macrocycle without qualification and to the linear peptide only for its internal bonds. A stability assay with trypsin and a larval midgut extract remains the decisive test.</w:t>
+        <w:t xml:space="preserve">These controls were simulated for a different question — whether S1 occupancy separates sequence from starting pose — which they did not answer (Section 3.5); the matched starting distance that made them uninformative there is what makes them a valid baseline here. The comparison rests on one exposed site, one run and one pH; a near-attack fraction is not a rate; and the criterion is geometric, so it does not encode specificity, which is why the bond that most often approaches the serine in the protected peptides, the glycine–basic bond preceding the anchor, is not a cleavage risk for an enzyme that requires lysine or arginine at P1. The result also says nothing about exopeptidases: the hard criterion evaluates the C-terminal residue but not aminopeptidase N, which processes a free N-terminus whatever the internal sequence, so it applies to front M without qualification and to front L only for its internal bonds. A stability assay with trypsin and a larval midgut extract remains the decisive test.</w:t>
       </w:r>
     </w:p>
     <w:p>
@@ -7547,7 +7547,7 @@
         <w:pStyle w:val="BodyText"/>
       </w:pPr>
       <w:r>
-        <w:t xml:space="preserve">Natural inhibitors supplied the subsites (2PTC, 1SFI), the calibration standards and the S1-anchoring logic. They did not supply their defining feature: the designed peptides contain no cysteine, so the disulfide-stabilized loops of BPTI, SKTI and SFTI-1 (Luckett et al., 1999; Kelly et al., 2005) are not reproduced, and the head-to-tail ring is the only constraint retained, in one of the two fronts. Rigidity is not simply an advantage against adapted lepidopteran trypsins: a Bowman–Birk inhibitor with seven disulfide bonds inhibited</w:t>
+        <w:t xml:space="preserve">Natural inhibitors supplied the subsites (2PTC, 1SFI), the calibration standards and the S1-anchoring logic. They did not supply their defining feature: the designed peptides contain no cysteine, so the disulfide-stabilized loops of BPTI, SKTI and SFTI-1 (Luckett et al., 1999; Kelly et al., 2005) are not reproduced, and the head-to-tail closure is the only constraint retained, and only in front M. Rigidity is not simply an advantage against adapted lepidopteran trypsins: a Bowman–Birk inhibitor with seven disulfide bonds inhibited</w:t>
       </w:r>
       <w:r>
         <w:t xml:space="preserve"> </w:t>
@@ -7644,7 +7644,7 @@
         <w:t xml:space="preserve">A. gemmatalis</w:t>
       </w:r>
       <w:r>
-        <w:t xml:space="preserve">, prefer arginine or lysine there (Patarroyo-Vargas et al., 2017; Meriño-Cabrera et al., 2022); the hard criterion therefore selects against the residue best suited to engage Asp189. By forbidding the nine residues that the three documented primary specificities take at P1, it leaves peptides that are almost half glycine and contain only nine basic residues, each protected by a following proline, an exception taken from general enzyme specificity and approximate for each species. The criterion does not forbid every conceivable P1: glycine and serine, which broad elastase rules also list, were kept, because the lepidopteran enzyme characterised to date is elastase-2-like with P1 = Leu and because excluding them leaves 13 of 527 candidates (Sections 2.4 and 3.3). The selection thus trades one risk for another — it removes the sites of the enzymes that have been measured in these midguts and enriches peptides whose P1 positions are small residues that have not been — and the enrichment is a consequence of the rule, not evidence of stability. Such sequences are probably flexible, which may cost binding entropy, and they lack the side chains that define the S1 interaction of canonical inhibitors. The canonical alternative is rigidity, which improves binding by about six orders of magnitude and protects against proteolysis (Kelly et al., 2005); a macrocycle might tolerate one basic P1 that a linear motif rule flags. The three candidates that carry a Lys or Arg (NGGRPDAP, PISQIDSGSR, GGKPGEP) are the ones in which this can be examined, and the present screen cannot tell whether their conformation keeps that residue protected (Section 3.8 reports the attack geometry in the simulations). Cyclization removes the exposed termini but not the interior sites (the macrocycle gained only 16 sequences over the linear set), and aminopeptidase N, which needs a free N-terminus, is not addressed for linear peptides. The motif rules are coarse (a weighted count of sites; the elastase-like rule flags four common residues), and</w:t>
+        <w:t xml:space="preserve">, prefer arginine or lysine there (Patarroyo-Vargas et al., 2017; Meriño-Cabrera et al., 2022); the hard criterion therefore selects against the residue best suited to engage Asp189. By forbidding the nine residues that the three documented primary specificities take at P1, it leaves peptides that are almost half glycine and contain only nine basic residues, each protected by a following proline, an exception taken from general enzyme specificity and approximate for each species. The criterion does not forbid every conceivable P1: glycine and serine, which broad elastase rules also list, were kept, because the lepidopteran enzyme characterised to date is elastase-2-like with P1 = Leu and because excluding them leaves 13 of 527 candidates (Sections 2.4 and 3.3). The selection thus trades one risk for another — it removes the sites of the enzymes that have been measured in these midguts and enriches peptides whose P1 positions are small residues that have not been — and the enrichment is a consequence of the rule, not evidence of stability. Such sequences are probably flexible, which may cost binding entropy, and they lack the side chains that define the S1 interaction of canonical inhibitors. The canonical alternative is rigidity, which improves binding by about six orders of magnitude and protects against proteolysis (Kelly et al., 2005); a closed backbone might tolerate one basic P1 that a linear motif rule flags. The three candidates that carry a Lys or Arg (NGGRPDAP, PISQIDSGSR, GGKPGEP) are the ones in which this can be examined, and the present screen cannot tell whether their conformation keeps that residue protected (Section 3.8 reports the attack geometry in the simulations). Closing the backbone removes the exposed termini but not the interior sites (front M gained only 16 sequences over front L), and aminopeptidase N, which needs a free N-terminus, is not addressed in front L. The motif rules are coarse (a weighted count of sites; the elastase-like rule flags four common residues), and</w:t>
       </w:r>
       <w:r>
         <w:t xml:space="preserve"> </w:t>
@@ -7728,7 +7728,7 @@
         </w:numPr>
       </w:pPr>
       <w:r>
-        <w:t xml:space="preserve">All results are computational; no inhibition or stability assay was performed. (ii) Selectivity was not addressed: S1 is conserved among trypsins, and a peptide anchored there cannot be assumed to spare non-target proteases. (iii) The receptors are AlphaFold models, and midgut expression is not documented for the pest species. (iv) ProteinMPNN redesigned the receptor along with the peptide, and only eight of the 15 hotspot residues reached RFdiffusion. Every backbone was generated as a head-to-tail macrocycle, so the linear front is the same sequence set read with free termini and re-folded by Boltz-2, not a campaign designed for the linear form; a backbone diffused as a linear peptide could give different sequences, and no comparison here can separate the effect of the form from that of this asymmetry. (v) The non-cleavability criterion is a motif-level prediction: it covers the P1 residues of the trypsin-like and chymotrypsin-/elastase-2-like activities measured in lepidopteran midguts, adds Ala and Val for an elastase-1-type specificity not characterised in these species, and leaves glycine and serine unexcluded, so small-P1 and oligopeptidase activity is not addressed; the K/R–Pro exception is statistical and aminopeptidase N is not excluded for linear peptides. (vi) Each simulation is a single 10-ns run with one force field, and single trajectories can yield false-positive conclusions (Knapp et al., 2018); the linear peptide carries NH</w:t>
+        <w:t xml:space="preserve">All results are computational; no inhibition or stability assay was performed. (ii) Selectivity was not addressed: S1 is conserved among trypsins, and a peptide anchored there cannot be assumed to spare non-target proteases. (iii) The receptors are AlphaFold models, and midgut expression is not documented for the pest species. (iv) ProteinMPNN redesigned the receptor along with the peptide, and only eight of the 15 hotspot residues reached RFdiffusion. Diffusion was run with the backbone ends joined, so front L takes the same sequence set with free termini and re-folds it with Boltz-2 rather than resting on a campaign diffused for the open form; a backbone diffused as a linear peptide could give different sequences, and no comparison here can separate the effect of the form from that of this asymmetry. (v) The non-cleavability criterion is a motif-level prediction: it covers the P1 residues of the trypsin-like and chymotrypsin-/elastase-2-like activities measured in lepidopteran midguts, adds Ala and Val for an elastase-1-type specificity not characterised in these species, and leaves glycine and serine unexcluded, so small-P1 and oligopeptidase activity is not addressed; the K/R–Pro exception is statistical and aminopeptidase N is not excluded in front L. (vi) Each simulation is a single 10-ns run with one force field, and single trajectories can yield false-positive conclusions (Knapp et al., 2018); the linear peptide carries NH</w:t>
       </w:r>
       <w:r>
         <w:rPr>
@@ -9126,7 +9126,7 @@
           <wp:inline>
             <wp:extent cx="4679999" cy="1768489"/>
             <wp:effectExtent b="0" l="0" r="0" t="0"/>
-            <wp:docPr descr="Figure S6. Ring integrity in the cyclic simulations of A. gemmatalis (10 ns, pH 10.0): closing C–N distance, absolute closing ω angle over time and distribution of ω. Dashed lines: the limits declared beforehand (C–N ≤ 1.5 Å, ω ≥ 150°)." title="" id="86" name="Picture"/>
+            <wp:docPr descr="Figure S6. Integrity of the closing bond in the front-M simulations of A. gemmatalis (10 ns, pH 10.0): closing C–N distance, absolute closing ω angle over time and distribution of ω. Dashed lines: the limits declared beforehand (C–N ≤ 1.5 Å, ω ≥ 150°)." title="" id="86" name="Picture"/>
             <a:graphic>
               <a:graphicData uri="http://schemas.openxmlformats.org/drawingml/2006/picture">
                 <pic:pic>
@@ -9179,7 +9179,7 @@
         <w:t xml:space="preserve"> </w:t>
       </w:r>
       <w:r>
-        <w:t xml:space="preserve">Ring integrity in the cyclic simulations of</w:t>
+        <w:t xml:space="preserve">Integrity of the closing bond in the front-M simulations of</w:t>
       </w:r>
       <w:r>
         <w:t xml:space="preserve"> </w:t>
@@ -9272,7 +9272,7 @@
           <wp:inline>
             <wp:extent cx="4679999" cy="1546051"/>
             <wp:effectExtent b="0" l="0" r="0" t="0"/>
-            <wp:docPr descr="Figure S8. Boltz-2 co-folding of the 1,829 macrocycles of the first round: ipTM and complex pLDDT per species and mean ipTM by length." title="" id="92" name="Picture"/>
+            <wp:docPr descr="Figure S8. Boltz-2 co-folding of the 1,829 resistant-like sequences of the first round: ipTM and complex pLDDT per species and mean ipTM by length." title="" id="92" name="Picture"/>
             <a:graphic>
               <a:graphicData uri="http://schemas.openxmlformats.org/drawingml/2006/picture">
                 <pic:pic>
@@ -9325,7 +9325,7 @@
         <w:t xml:space="preserve"> </w:t>
       </w:r>
       <w:r>
-        <w:t xml:space="preserve">Boltz-2 co-folding of the 1,829 macrocycles of the first round: ipTM and complex pLDDT per species and mean ipTM by length.</w:t>
+        <w:t xml:space="preserve">Boltz-2 co-folding of the 1,829 resistant-like sequences of the first round: ipTM and complex pLDDT per species and mean ipTM by length.</w:t>
       </w:r>
     </w:p>
     <w:p>
@@ -9337,7 +9337,7 @@
           <wp:inline>
             <wp:extent cx="4679999" cy="2092235"/>
             <wp:effectExtent b="0" l="0" r="0" t="0"/>
-            <wp:docPr descr="Figure S9. Motif-score screen by species under the linear-strict and the circular rule." title="" id="95" name="Picture"/>
+            <wp:docPr descr="Figure S9. Motif-score screen by species under the linear-strict and the circular scan rule." title="" id="95" name="Picture"/>
             <a:graphic>
               <a:graphicData uri="http://schemas.openxmlformats.org/drawingml/2006/picture">
                 <pic:pic>
@@ -9390,7 +9390,7 @@
         <w:t xml:space="preserve"> </w:t>
       </w:r>
       <w:r>
-        <w:t xml:space="preserve">Motif-score screen by species under the linear-strict and the circular rule.</w:t>
+        <w:t xml:space="preserve">Motif-score screen by species under the linear-strict and the circular scan rule.</w:t>
       </w:r>
     </w:p>
     <w:p>
@@ -9467,7 +9467,7 @@
           <wp:inline>
             <wp:extent cx="4679999" cy="2391755"/>
             <wp:effectExtent b="0" l="0" r="0" t="0"/>
-            <wp:docPr descr="Figure S11. Attack geometry of the scissile bond: proline-protected site against exposed site. PGRGDANP, the shuffled control of NGGRPDAP, has the same composition and was simulated with the same receptor and protocol (10 ns, CHARMM36, pH 10.0), with its Arg3 in S1 at the same depth (2.73 Å; occupancy 1.00), but followed by glycine instead of proline. (A) Distribution, over the second half of each run, of the distance from the Ser195 Oγ to the carbonyl carbon of the bond that follows the basic residue (violin: distribution; black bar: median; tick at the left: minimum; dashed line: the 3.5 Å of the near-attack criterion). (B) Fraction of frames of the second half in a near-attack conformation. Orange: exposed site (K/R–Gly); blue: proline-protected site of the linear candidate; teal: proline-protected site of a macrocycle." title="" id="101" name="Picture"/>
+            <wp:docPr descr="Figure S11. Attack geometry of the scissile bond: proline-protected site against exposed site. PGRGDANP, the shuffled control of NGGRPDAP, has the same composition and was simulated with the same receptor and protocol (10 ns, CHARMM36, pH 10.0), with its Arg3 in S1 at the same depth (2.73 Å; occupancy 1.00), but followed by glycine instead of proline. (A) Distribution, over the second half of each run, of the distance from the Ser195 Oγ to the carbonyl carbon of the bond that follows the basic residue (violin: distribution; black bar: median; tick at the left: minimum; dashed line: the 3.5 Å of the near-attack criterion). (B) Fraction of frames of the second half in a near-attack conformation. Orange: exposed site (K/R–Gly); blue: proline-protected site of the linear candidate; teal: proline-protected site of a front-M candidate." title="" id="101" name="Picture"/>
             <a:graphic>
               <a:graphicData uri="http://schemas.openxmlformats.org/drawingml/2006/picture">
                 <pic:pic>
@@ -9520,7 +9520,7 @@
         <w:t xml:space="preserve"> </w:t>
       </w:r>
       <w:r>
-        <w:t xml:space="preserve">Attack geometry of the scissile bond: proline-protected site against exposed site. PGRGDANP, the shuffled control of NGGRPDAP, has the same composition and was simulated with the same receptor and protocol (10 ns, CHARMM36, pH 10.0), with its Arg3 in S1 at the same depth (2.73 Å; occupancy 1.00), but followed by glycine instead of proline. (A) Distribution, over the second half of each run, of the distance from the Ser195 Oγ to the carbonyl carbon of the bond that follows the basic residue (violin: distribution; black bar: median; tick at the left: minimum; dashed line: the 3.5 Å of the near-attack criterion). (B) Fraction of frames of the second half in a near-attack conformation. Orange: exposed site (K/R–Gly); blue: proline-protected site of the linear candidate; teal: proline-protected site of a macrocycle.</w:t>
+        <w:t xml:space="preserve">Attack geometry of the scissile bond: proline-protected site against exposed site. PGRGDANP, the shuffled control of NGGRPDAP, has the same composition and was simulated with the same receptor and protocol (10 ns, CHARMM36, pH 10.0), with its Arg3 in S1 at the same depth (2.73 Å; occupancy 1.00), but followed by glycine instead of proline. (A) Distribution, over the second half of each run, of the distance from the Ser195 Oγ to the carbonyl carbon of the bond that follows the basic residue (violin: distribution; black bar: median; tick at the left: minimum; dashed line: the 3.5 Å of the near-attack criterion). (B) Fraction of frames of the second half in a near-attack conformation. Orange: exposed site (K/R–Gly); blue: proline-protected site of the linear candidate; teal: proline-protected site of a front-M candidate.</w:t>
       </w:r>
     </w:p>
     <w:bookmarkEnd w:id="103"/>
@@ -14089,7 +14089,7 @@
               <w:rPr>
                 <w:sz w:val="18"/>
               </w:rPr>
-              <w:t xml:space="preserve">Head-to-tail macrocycle, all 880 backbones; no linear backbone generated</w:t>
+              <w:t xml:space="preserve">Diffusion with the ends joined (head-to-tail closure) for all 880 backbones; the two chemical forms are then evaluated as fronts L and M</w:t>
             </w:r>
           </w:p>
         </w:tc>

</xml_diff>

<commit_message>
manuscrito: metodos condensados (2.1-2.9 -> 2.1-2.7) EN/PT, autor preenchido, 10 refs orfas removidas
Secao 2 enxugada (RFdiffusion/ProteinMPNN/Boltz-2 sem parametros, criterio
duro sem justificativas por clausula, 2.7+2.8 fundidas, 2.9 removida);
cortes leves equivalentes em 3.1, 3.3, 3.4 e 3.5. Corrige dois erros da
edicao manual do docx PT: percentuais de comprimento (86,8%/12,7%, nao
15,77%/12,3%) e "conjunto de nao clivabilidade" (nao "clivavel", que
invertia o sentido). Remove da bibliografia as 10 referencias que ficaram
sem uso nos dois idiomas (cock2009, mirdita2022, wacha2023, bussi2007,
parrinello1981, essmann1995, michaud2011, gowers2016, miller2012,
onufriev2004): 91 -> 81, todas citadas. Nome do autor preenchido em PT/EN.

Co-Authored-By: Claude Sonnet 5 <noreply@anthropic.com>
</commit_message>
<xml_diff>
--- a/manuscript/Manuscript_EN.docx
+++ b/manuscript/Manuscript_EN.docx
@@ -2,7 +2,7 @@
 <file path=word/document.xml><?xml version="1.0" encoding="utf-8"?>
 <w:document xmlns:w="http://schemas.openxmlformats.org/wordprocessingml/2006/main" xmlns:m="http://schemas.openxmlformats.org/officeDocument/2006/math" xmlns:r="http://schemas.openxmlformats.org/officeDocument/2006/relationships" xmlns:o="urn:schemas-microsoft-com:office:office" xmlns:v="urn:schemas-microsoft-com:vml" xmlns:w10="urn:schemas-microsoft-com:office:word" xmlns:a="http://schemas.openxmlformats.org/drawingml/2006/main" xmlns:pic="http://schemas.openxmlformats.org/drawingml/2006/picture" xmlns:wp="http://schemas.openxmlformats.org/drawingml/2006/wordprocessingDrawing">
   <w:body>
-    <w:bookmarkStart w:id="105" w:name="X5d23facfdc6d935129874e2af45392c183e6475"/>
+    <w:bookmarkStart w:id="103" w:name="X5d23facfdc6d935129874e2af45392c183e6475"/>
     <w:p>
       <w:pPr>
         <w:pStyle w:val="Heading1"/>
@@ -45,10 +45,7 @@
         <w:t xml:space="preserve"> </w:t>
       </w:r>
       <w:r>
-        <w:rPr>
-          <w:rStyle w:val="Pendente"/>
-        </w:rPr>
-        <w:t xml:space="preserve">AUTHOR LIST TO BE COMPLETED</w:t>
+        <w:t xml:space="preserve">Eulálio Gutemberg Dias dos Santos</w:t>
       </w:r>
       <w:r>
         <w:br/>
@@ -617,7 +614,7 @@
       </w:r>
     </w:p>
     <w:bookmarkEnd w:id="13"/>
-    <w:bookmarkStart w:id="23" w:name="materials-and-methods"/>
+    <w:bookmarkStart w:id="21" w:name="materials-and-methods"/>
     <w:p>
       <w:pPr>
         <w:pStyle w:val="Heading2"/>
@@ -640,7 +637,7 @@
         <w:pStyle w:val="FirstParagraph"/>
       </w:pPr>
       <w:r>
-        <w:t xml:space="preserve">Digestive trypsin-like proteases of eight pest species (</w:t>
+        <w:t xml:space="preserve">Digestive trypsin-like proteases of eight lepidopteran pest species (</w:t>
       </w:r>
       <w:r>
         <w:rPr>
@@ -741,7 +738,7 @@
         <w:t xml:space="preserve">A. gemmatalis</w:t>
       </w:r>
       <w:r>
-        <w:t xml:space="preserve">) and the references</w:t>
+        <w:t xml:space="preserve">) were selected as targets, plus two references,</w:t>
       </w:r>
       <w:r>
         <w:t xml:space="preserve"> </w:t>
@@ -770,10 +767,233 @@
         <w:t xml:space="preserve">Bombyx mori</w:t>
       </w:r>
       <w:r>
-        <w:t xml:space="preserve"> </w:t>
-      </w:r>
-      <w:r>
-        <w:t xml:space="preserve">were modeled with AlphaFold v2 structures (Jumper et al., 2021; Varadi et al., 2024) (Table 1). Only the</w:t>
+        <w:t xml:space="preserve">, modeled with AlphaFold v2 structures (Jumper et al., 2021; Varadi et al., 2024) (Table 1). The specificity residue was located six residues before the catalytic serine (motif G[DN]SGG[PT]), an offset calibrated on bovine trypsin (UniProt Consortium, 2025). The positions of the catalytic triad and of the S1 pocket, with Asp189 as the specificity residue, were checked by homology against bovine trypsin (Table S2). Subsites S4–S3′ (Schechter and Berger, 1967) were defined from two crystal complexes of bovine trypsin (Berman et al., 2000), 2PTC (BPTI) and 1SFI (SFTI-1; Luckett et al., 1999). Each trypsin chain was aligned to each receptor with Foldseek in TM-align mode (van Kempen et al., 2024; Zhang and Skolnick, 2005) and accepted with a TM-score of at least 0.5 and an RMSD of at most 3.0 Å.</w:t>
+      </w:r>
+    </w:p>
+    <w:bookmarkEnd w:id="14"/>
+    <w:bookmarkStart w:id="15" w:name="calibration-of-scores"/>
+    <w:p>
+      <w:pPr>
+        <w:pStyle w:val="Heading3"/>
+      </w:pPr>
+      <w:r>
+        <w:t xml:space="preserve">2.2 Calibration of scores</w:t>
+      </w:r>
+    </w:p>
+    <w:p>
+      <w:pPr>
+        <w:pStyle w:val="FirstParagraph"/>
+      </w:pPr>
+      <w:r>
+        <w:t xml:space="preserve">Six natural inhibitors served as positive controls: BPTI (1BPI; Parkin et al., 1996), SFTI-1, soybean Kunitz inhibitor (SKTI, 1AVU; Song and Suh, 1998), Bowman–Birk inhibitor (BBI, 1BBI; Werner and Wemmer, 1992), the</w:t>
+      </w:r>
+      <w:r>
+        <w:t xml:space="preserve"> </w:t>
+      </w:r>
+      <w:r>
+        <w:rPr>
+          <w:i/>
+          <w:iCs/>
+        </w:rPr>
+        <w:t xml:space="preserve">Enterolobium contortisiliquum</w:t>
+      </w:r>
+      <w:r>
+        <w:t xml:space="preserve"> </w:t>
+      </w:r>
+      <w:r>
+        <w:t xml:space="preserve">inhibitor (EcTI, 4J2K; Zhou et al., 2013) and ApTI. A shuffled decoy of the same amino-acid composition was generated for each. Each ligand was modeled with bovine β-trypsin and with the</w:t>
+      </w:r>
+      <w:r>
+        <w:t xml:space="preserve"> </w:t>
+      </w:r>
+      <w:r>
+        <w:rPr>
+          <w:i/>
+          <w:iCs/>
+        </w:rPr>
+        <w:t xml:space="preserve">S. frugiperda</w:t>
+      </w:r>
+      <w:r>
+        <w:t xml:space="preserve"> </w:t>
+      </w:r>
+      <w:r>
+        <w:t xml:space="preserve">model A0A089QDB3 (22 systems). Two kinds of score were compared: (i) Boltz-2 confidence (Passaro et al., 2025), with its ipTM and the pLDDT of the complex; (ii) the RMSD of the ligand backbone after receptor superposition in a 2-ns simulation.</w:t>
+      </w:r>
+    </w:p>
+    <w:bookmarkEnd w:id="15"/>
+    <w:bookmarkStart w:id="16" w:name="backbone-generation-and-sequence-design"/>
+    <w:p>
+      <w:pPr>
+        <w:pStyle w:val="Heading3"/>
+      </w:pPr>
+      <w:r>
+        <w:t xml:space="preserve">2.3 Backbone generation and sequence design</w:t>
+      </w:r>
+    </w:p>
+    <w:p>
+      <w:pPr>
+        <w:pStyle w:val="FirstParagraph"/>
+      </w:pPr>
+      <w:r>
+        <w:t xml:space="preserve">Peptide backbones were generated with RFdiffusion 1.1.0 (Watson et al., 2023), producing ten backbones for each one, across 11 different lengths (5, 6, 7, 8, 10, 12, 14, 16, 18, 19, 20 residues) and each of the eight targets, a total of 880 backbones. Hotspots were the S1 and S2 residues transferred from 1SFI; only the first eight in residue number reached RFdiffusion (equivalents of His57, Leu99, Asp189, Ser190, Cys191, Gln192, Gly193 and Asp194). ProteinMPNN (Dauparas et al., 2022) was run with default chain settings, so the receptor was also redesigned and only the peptide was kept. Identical sequences were merged within each species. Two structural profiles were defined, linear and cyclic, named front L (linear peptide with free termini) and front M (head-to-tail cyclic peptide).</w:t>
+      </w:r>
+    </w:p>
+    <w:bookmarkEnd w:id="16"/>
+    <w:bookmarkStart w:id="17" w:name="non-cleavability-screens"/>
+    <w:p>
+      <w:pPr>
+        <w:pStyle w:val="Heading3"/>
+      </w:pPr>
+      <w:r>
+        <w:t xml:space="preserve">2.4 Non-cleavability screens</w:t>
+      </w:r>
+    </w:p>
+    <w:p>
+      <w:pPr>
+        <w:pStyle w:val="FirstParagraph"/>
+      </w:pPr>
+      <w:r>
+        <w:t xml:space="preserve">Each sequence was scanned with seven simplified P1-motif rules based on PeptideCutter (Gasteiger et al., 2005) (trypsin, chymotrypsin, elastase and pepsin). A weighted count of sites (weights 1.0, 0.6 and 0.3 for enzyme priorities 1–3; only internal sites for trypsin; divided by 10 and capped at 1) gave the score. Sequences were classified as resistant, with no internal trypsin site and a score below 0.3; marginal, with at most one internal site and a score below 0.5; susceptible otherwise. Anti-cleavage criterion: a sequence was kept only if no residue was K or R (trypsin), F, Y, W, L or M (chymotrypsin and elastase-2), or A or V (elastase-1).</w:t>
+      </w:r>
+    </w:p>
+    <w:bookmarkEnd w:id="17"/>
+    <w:bookmarkStart w:id="18" w:name="co-folding-re-scoring-and-pose-quality"/>
+    <w:p>
+      <w:pPr>
+        <w:pStyle w:val="Heading3"/>
+      </w:pPr>
+      <w:r>
+        <w:t xml:space="preserve">2.5 Co-folding, re-scoring and pose quality</w:t>
+      </w:r>
+    </w:p>
+    <w:p>
+      <w:pPr>
+        <w:pStyle w:val="FirstParagraph"/>
+      </w:pPr>
+      <w:r>
+        <w:t xml:space="preserve">Candidates were co-folded with Boltz-2 2.2.1 (Passaro et al., 2025). Quality metrics were assessed (pLDDT and ipTM). The ten best candidates per species and front (L or M) were re-predicted with five diffusion samples, three recycling steps, inference-time potentials and three seeds (15 predictions); the score is the mean and the best sample is the starting structure. Three shuffled controls per candidate were built and predicted with the same protocol, and Δ = score of the candidate − mean score of its controls. The best candidate of each species was also co-folded with the seven other receptors (8 × 8 cross matrix). The three candidates per species and front with the highest mean confidence among distinct sequences (24 per front) went to simulation; Δ was not used for selection.</w:t>
+      </w:r>
+    </w:p>
+    <w:bookmarkEnd w:id="18"/>
+    <w:bookmarkStart w:id="19" w:name="molecular-dynamics"/>
+    <w:p>
+      <w:pPr>
+        <w:pStyle w:val="Heading3"/>
+      </w:pPr>
+      <w:r>
+        <w:t xml:space="preserve">2.6 Molecular dynamics</w:t>
+      </w:r>
+    </w:p>
+    <w:p>
+      <w:pPr>
+        <w:pStyle w:val="FirstParagraph"/>
+      </w:pPr>
+      <w:r>
+        <w:t xml:space="preserve">Each of the 48 complexes was simulated for 10 ns at pH 8.2 and pH 10.0; protonation was assigned with PROPKA 3 (Olsson et al., 2011) through PDB2PQR (Dolinsky et al., 2007). Systems were built with GROMACS 2025.4 (Abraham et al., 2015); the force field used was CHARMM36 (Huang and MacKerell, 2013) and TIP3P water (Jorgensen et al., 1983), in a dodecahedral box (1.2-nm buffer, 0.10 M KCl). The linear peptide carries NH</w:t>
+      </w:r>
+      <w:r>
+        <w:rPr>
+          <w:vertAlign w:val="subscript"/>
+        </w:rPr>
+        <w:t xml:space="preserve">3</w:t>
+      </w:r>
+      <w:r>
+        <w:rPr>
+          <w:vertAlign w:val="superscript"/>
+        </w:rPr>
+        <w:t xml:space="preserve">+</w:t>
+      </w:r>
+      <w:r>
+        <w:t xml:space="preserve"> </w:t>
+      </w:r>
+      <w:r>
+        <w:t xml:space="preserve">and COO</w:t>
+      </w:r>
+      <w:r>
+        <w:rPr>
+          <w:vertAlign w:val="superscript"/>
+        </w:rPr>
+        <w:t xml:space="preserve">−</w:t>
+      </w:r>
+      <w:r>
+        <w:t xml:space="preserve"> </w:t>
+      </w:r>
+      <w:r>
+        <w:t xml:space="preserve">termini at both pH; front M has no termini. After minimization, 200 ps NVT and 500 ps NPT with position restraints (1,000 kJ mol</w:t>
+      </w:r>
+      <w:r>
+        <w:rPr>
+          <w:vertAlign w:val="superscript"/>
+        </w:rPr>
+        <w:t xml:space="preserve">−1</w:t>
+      </w:r>
+      <w:r>
+        <w:t xml:space="preserve"> </w:t>
+      </w:r>
+      <w:r>
+        <w:t xml:space="preserve">nm</w:t>
+      </w:r>
+      <w:r>
+        <w:rPr>
+          <w:vertAlign w:val="superscript"/>
+        </w:rPr>
+        <w:t xml:space="preserve">−2</w:t>
+      </w:r>
+      <w:r>
+        <w:t xml:space="preserve">), production ran for 10 ns at 300 K and 1 bar, and each system was run once per pH with a random seed.</w:t>
+      </w:r>
+    </w:p>
+    <w:bookmarkEnd w:id="19"/>
+    <w:bookmarkStart w:id="20" w:name="trajectory-analysis-and-energy-filters"/>
+    <w:p>
+      <w:pPr>
+        <w:pStyle w:val="Heading3"/>
+      </w:pPr>
+      <w:r>
+        <w:t xml:space="preserve">2.7 Trajectory analysis and energy filters</w:t>
+      </w:r>
+    </w:p>
+    <w:p>
+      <w:pPr>
+        <w:pStyle w:val="FirstParagraph"/>
+      </w:pPr>
+      <w:r>
+        <w:t xml:space="preserve">Trajectories were analyzed by tracking over time the residue interacting with the Asp189 equivalent, with the residue of smallest mean distance identified as the anchor. S1 occupancy is the fraction of frames with anchor–Asp189 distance within 4–6 Å, as computed. The anchor–Asp189 distance and the peptide Cα RMSD after receptor superposition are reported for an initial (first 0.4 ns) and a final window (last 2 ns). The screen declared beforehand required second-half occupancy ≥ 70%, the same anchor. For free-energy calculations, MM-GBSA (Valdés-Tresanco et al., 2021) and PRODIGY (Vangone and Bonvin, 2015) were used. The pH 8.2 and pH 10.0 simulations are paired and compared by the paired difference of each metric (Wilcoxon signed-rank test) and the rank correlation between pH.</w:t>
+      </w:r>
+    </w:p>
+    <w:p>
+      <w:r>
+        <w:pict>
+          <v:rect style="width:0;height:1.5pt" o:hralign="center" o:hrstd="t" o:hr="t"/>
+        </w:pict>
+      </w:r>
+    </w:p>
+    <w:bookmarkEnd w:id="20"/>
+    <w:bookmarkEnd w:id="21"/>
+    <w:bookmarkStart w:id="51" w:name="results"/>
+    <w:p>
+      <w:pPr>
+        <w:pStyle w:val="Heading2"/>
+      </w:pPr>
+      <w:r>
+        <w:t xml:space="preserve">3 Results</w:t>
+      </w:r>
+    </w:p>
+    <w:bookmarkStart w:id="22" w:name="receptor-panel-and-subsite-transfer"/>
+    <w:p>
+      <w:pPr>
+        <w:pStyle w:val="Heading3"/>
+      </w:pPr>
+      <w:r>
+        <w:t xml:space="preserve">3.1 Receptor panel and subsite transfer</w:t>
+      </w:r>
+    </w:p>
+    <w:p>
+      <w:pPr>
+        <w:pStyle w:val="FirstParagraph"/>
+      </w:pPr>
+      <w:r>
+        <w:t xml:space="preserve">All ten sequences carry the catalytic motif G[DN]SGG[PT] and an aspartate at the specificity position, the Asp189 residue homologous to bovine trypsin (Table 1). Identity to</w:t>
       </w:r>
       <w:r>
         <w:t xml:space="preserve"> </w:t>
@@ -789,822 +1009,6 @@
         <w:t xml:space="preserve"> </w:t>
       </w:r>
       <w:r>
-        <w:t xml:space="preserve">entries are reviewed with midgut evidence; for the other species the entries were selected by homology. Sequence identity to</w:t>
-      </w:r>
-      <w:r>
-        <w:t xml:space="preserve"> </w:t>
-      </w:r>
-      <w:r>
-        <w:rPr>
-          <w:i/>
-          <w:iCs/>
-        </w:rPr>
-        <w:t xml:space="preserve">M. sexta</w:t>
-      </w:r>
-      <w:r>
-        <w:t xml:space="preserve"> </w:t>
-      </w:r>
-      <w:r>
-        <w:t xml:space="preserve">trypsin B (P35046) used a global BLOSUM62 alignment (Cock et al., 2009). The specificity residue was located six residues before the catalytic serine (motif G[DN]SGG[PT]), an offset calibrated on bovine trypsin (UniProt Consortium, 2025). The positions of the catalytic triad and of the S1 pocket, with Asp189 as the specificity residue, were checked in every model by global alignment to bovine trypsin and by the hydrogen-bond distances in the AlphaFold coordinates (Table S2).</w:t>
-      </w:r>
-    </w:p>
-    <w:p>
-      <w:pPr>
-        <w:pStyle w:val="BodyText"/>
-      </w:pPr>
-      <w:r>
-        <w:t xml:space="preserve">Subsites S4–S3′ (Schechter and Berger, 1967) were defined from two crystal complexes of bovine trypsin (Berman et al., 2000), 2PTC (BPTI) and 1SFI (SFTI-1; Luckett et al., 1999). P1 was the inhibitor residue whose carbonyl carbon lies closest to the Oγ of the catalytic serine, and a trypsin residue was assigned to a subsite when any of its atoms was within 4.5 Å of the corresponding inhibitor residue. Each trypsin chain was aligned to each receptor with Foldseek in TM-align mode (van Kempen et al., 2024; Zhang and Skolnick, 2005), residues were transferred through the alignment, and a receptor–template pair was accepted with a TM-score of at least 0.5, the value above which two structures are mostly of the same fold (Xu and Zhang, 2010), and an RMSD of at most 3.0 Å.</w:t>
-      </w:r>
-    </w:p>
-    <w:bookmarkEnd w:id="14"/>
-    <w:bookmarkStart w:id="15" w:name="calibration-of-the-scoring-ladder"/>
-    <w:p>
-      <w:pPr>
-        <w:pStyle w:val="Heading3"/>
-      </w:pPr>
-      <w:r>
-        <w:t xml:space="preserve">2.2 Calibration of the scoring ladder</w:t>
-      </w:r>
-    </w:p>
-    <w:p>
-      <w:pPr>
-        <w:pStyle w:val="FirstParagraph"/>
-      </w:pPr>
-      <w:r>
-        <w:t xml:space="preserve">Six natural inhibitors served as positive controls: BPTI (1BPI; Parkin et al., 1996), SFTI-1 (1SFI; naturally a head-to-tail bicyclic peptide, modeled here as the linear 14-residue sequence), soybean Kunitz inhibitor (SKTI, 1AVU; Song and Suh, 1998), Bowman–Birk inhibitor (BBI, 1BBI; Werner and Wemmer, 1992), the</w:t>
-      </w:r>
-      <w:r>
-        <w:t xml:space="preserve"> </w:t>
-      </w:r>
-      <w:r>
-        <w:rPr>
-          <w:i/>
-          <w:iCs/>
-        </w:rPr>
-        <w:t xml:space="preserve">Enterolobium contortisiliquum</w:t>
-      </w:r>
-      <w:r>
-        <w:t xml:space="preserve"> </w:t>
-      </w:r>
-      <w:r>
-        <w:t xml:space="preserve">inhibitor (EcTI, 4J2K; Zhou et al., 2013) and ApTI (UniProt; no structure). A shuffled decoy of the same composition was generated for each except ApTI. Each ligand was modeled with bovine β-trypsin and with the</w:t>
-      </w:r>
-      <w:r>
-        <w:t xml:space="preserve"> </w:t>
-      </w:r>
-      <w:r>
-        <w:rPr>
-          <w:i/>
-          <w:iCs/>
-        </w:rPr>
-        <w:t xml:space="preserve">S. frugiperda</w:t>
-      </w:r>
-      <w:r>
-        <w:t xml:space="preserve"> </w:t>
-      </w:r>
-      <w:r>
-        <w:t xml:space="preserve">model A0A089QDB3 (22 systems). Two kinds of score were compared: (i) Boltz-2 confidence (Passaro et al., 2025) (ColabFold MSA (Mirdita et al., 2022); one sample), with its ipTM and the pLDDT of the complex; (ii) the RMSD of the ligand backbone after receptor superposition in a 2-ns simulation (Section 2.6; last third; pH 8.0 for bovine trypsin and 10.0 for the</w:t>
-      </w:r>
-      <w:r>
-        <w:t xml:space="preserve"> </w:t>
-      </w:r>
-      <w:r>
-        <w:rPr>
-          <w:i/>
-          <w:iCs/>
-        </w:rPr>
-        <w:t xml:space="preserve">S. frugiperda</w:t>
-      </w:r>
-      <w:r>
-        <w:t xml:space="preserve"> </w:t>
-      </w:r>
-      <w:r>
-        <w:t xml:space="preserve">model). A score separated a pair when the real inhibitor had the better value, with the direction fixed beforehand. The ten pairs are not independent, because each decoy is used with two receptors.</w:t>
-      </w:r>
-    </w:p>
-    <w:bookmarkEnd w:id="15"/>
-    <w:bookmarkStart w:id="16" w:name="backbone-generation-and-sequence-design"/>
-    <w:p>
-      <w:pPr>
-        <w:pStyle w:val="Heading3"/>
-      </w:pPr>
-      <w:r>
-        <w:t xml:space="preserve">2.3 Backbone generation and sequence design</w:t>
-      </w:r>
-    </w:p>
-    <w:p>
-      <w:pPr>
-        <w:pStyle w:val="FirstParagraph"/>
-      </w:pPr>
-      <w:r>
-        <w:t xml:space="preserve">Peptide backbones were generated with RFdiffusion 1.1.0 (Watson et al., 2023) (</w:t>
-      </w:r>
-      <w:r>
-        <w:rPr>
-          <w:rStyle w:val="VerbatimChar"/>
-        </w:rPr>
-        <w:t xml:space="preserve">Complex_base_ckpt</w:t>
-      </w:r>
-      <w:r>
-        <w:t xml:space="preserve">, 50 steps,</w:t>
-      </w:r>
-      <w:r>
-        <w:t xml:space="preserve"> </w:t>
-      </w:r>
-      <w:r>
-        <w:rPr>
-          <w:rStyle w:val="VerbatimChar"/>
-        </w:rPr>
-        <w:t xml:space="preserve">noise_scale_ca</w:t>
-      </w:r>
-      <w:r>
-        <w:t xml:space="preserve"> </w:t>
-      </w:r>
-      <w:r>
-        <w:t xml:space="preserve">0.2,</w:t>
-      </w:r>
-      <w:r>
-        <w:t xml:space="preserve"> </w:t>
-      </w:r>
-      <w:r>
-        <w:rPr>
-          <w:rStyle w:val="VerbatimChar"/>
-        </w:rPr>
-        <w:t xml:space="preserve">noise_scale_frame</w:t>
-      </w:r>
-      <w:r>
-        <w:t xml:space="preserve"> </w:t>
-      </w:r>
-      <w:r>
-        <w:t xml:space="preserve">0.1, cyclic mode with head-to-tail closure, receptor fixed): ten backbones for each of 11 lengths (5, 6, 7, 8, 10, 12, 14, 16, 18, 19, 20 residues) and each of the eight targets (880 backbones). Hotspots were the S1 and S2 residues transferred from 1SFI; only the first eight in residue number reached RFdiffusion (equivalents of His57, Leu99, Asp189, Ser190, Cys191, Gln192, Gly193 and Asp194). ProteinMPNN (Dauparas et al., 2022) (</w:t>
-      </w:r>
-      <w:r>
-        <w:rPr>
-          <w:rStyle w:val="VerbatimChar"/>
-        </w:rPr>
-        <w:t xml:space="preserve">v_48_020</w:t>
-      </w:r>
-      <w:r>
-        <w:t xml:space="preserve">, T = 0.1, backbone noise 0.05, no cysteine, 30 sequences per backbone) was run with default chain settings, so the receptor was also redesigned and only the peptide was kept. Identical sequences were merged within each species.</w:t>
-      </w:r>
-    </w:p>
-    <w:p>
-      <w:pPr>
-        <w:pStyle w:val="BodyText"/>
-      </w:pPr>
-      <w:r>
-        <w:t xml:space="preserve">Three decisions define this stage. (i)</w:t>
-      </w:r>
-      <w:r>
-        <w:t xml:space="preserve"> </w:t>
-      </w:r>
-      <w:r>
-        <w:rPr>
-          <w:i/>
-          <w:iCs/>
-        </w:rPr>
-        <w:t xml:space="preserve">A closure constraint during diffusion.</w:t>
-      </w:r>
-      <w:r>
-        <w:t xml:space="preserve"> </w:t>
-      </w:r>
-      <w:r>
-        <w:t xml:space="preserve">The backbones were diffused with the ends joined, because SFTI-1, the smallest natural trypsin inhibitor, is itself a head-to-tail macrocycle (Luckett et al., 1999), rigidity of the reactive loop raises affinity and resistance to proteolysis (Kelly et al., 2005), bicyclic peptides built on inhibitor loops were ten-fold more potent against</w:t>
-      </w:r>
-      <w:r>
-        <w:t xml:space="preserve"> </w:t>
-      </w:r>
-      <w:r>
-        <w:rPr>
-          <w:i/>
-          <w:iCs/>
-        </w:rPr>
-        <w:t xml:space="preserve">H. armigera</w:t>
-      </w:r>
-      <w:r>
-        <w:t xml:space="preserve"> </w:t>
-      </w:r>
-      <w:r>
-        <w:t xml:space="preserve">proteases than the corresponding linear peptides (Saikhedkar et al., 2019), and a closed ring has no free terminus for the exopeptidases of the midgut (Valaitis, 1995; Valaitis et al., 1999). The constraint acts on the geometry used for sequence design; whether the final peptide carries the closing bond is the question asked by the two fronts below. (ii)</w:t>
-      </w:r>
-      <w:r>
-        <w:t xml:space="preserve"> </w:t>
-      </w:r>
-      <w:r>
-        <w:rPr>
-          <w:i/>
-          <w:iCs/>
-        </w:rPr>
-        <w:t xml:space="preserve">No cysteine.</w:t>
-      </w:r>
-      <w:r>
-        <w:t xml:space="preserve"> </w:t>
-      </w:r>
-      <w:r>
-        <w:t xml:space="preserve">The alternative constraint, a disulfide, cannot be assumed to hold in this environment: midgut redox potential differs among lepidopteran larvae, reducing in some species and oxidizing in others (Appel and Martin, 1990; Johnson and Felton, 1996), so a scaffold that depends on an oxidized cystine is not transferable across the pest complex. Cysteine was therefore excluded at design time, so the backbone closure is the only conformational constraint considered. (iii)</w:t>
-      </w:r>
-      <w:r>
-        <w:t xml:space="preserve"> </w:t>
-      </w:r>
-      <w:r>
-        <w:rPr>
-          <w:i/>
-          <w:iCs/>
-        </w:rPr>
-        <w:t xml:space="preserve">Lengths 5–20 residues.</w:t>
-      </w:r>
-      <w:r>
-        <w:t xml:space="preserve"> </w:t>
-      </w:r>
-      <w:r>
-        <w:t xml:space="preserve">The ladder brackets the peptides for which inhibition of lepidopteran digestive trypsins has been measured, from the tripeptides GORE1 and GORE2 (de Almeida Barros et al., 2021) to the 14-residue SFTI-1 (Luckett et al., 1999).</w:t>
-      </w:r>
-    </w:p>
-    <w:p>
-      <w:pPr>
-        <w:pStyle w:val="BodyText"/>
-      </w:pPr>
-      <w:r>
-        <w:rPr>
-          <w:i/>
-          <w:iCs/>
-        </w:rPr>
-        <w:t xml:space="preserve">The two fronts.</w:t>
-      </w:r>
-      <w:r>
-        <w:t xml:space="preserve"> </w:t>
-      </w:r>
-      <w:r>
-        <w:t xml:space="preserve">Each designed sequence was taken forward in two forms, and the whole pipeline downstream of design was run on both. Front L treats the sequence as a linear peptide with free termini; front M treats it as a head-to-tail cyclic peptide. The distinction is not a second design campaign but a chemical form, declared before the screens and carried through the non-cleavability criterion (Section 2.4), the co-folding (Section 2.5) and the simulations (Section 2.6): in front L the three-dimensional structure is predicted de novo by Boltz-2 from the sequence alone and is not taken from the backbone, whereas in front M the closing bond is imposed in the prediction and monitored in the trajectory. Front L is kept because it is the form in which peptide inhibitors of these enzymes have been assayed (de Almeida Barros et al., 2021; Meriño-Cabrera et al., 2020b; Mariano et al., 2026) and the one that needs no ring-closing chemistry, and front M because the closure removes the free termini that the midgut exopeptidases require. The two fronts therefore apply to one sequence set and are not disjoint (Section 3.3).</w:t>
-      </w:r>
-    </w:p>
-    <w:bookmarkEnd w:id="16"/>
-    <w:bookmarkStart w:id="17" w:name="non-cleavability-screens"/>
-    <w:p>
-      <w:pPr>
-        <w:pStyle w:val="Heading3"/>
-      </w:pPr>
-      <w:r>
-        <w:t xml:space="preserve">2.4 Non-cleavability screens</w:t>
-      </w:r>
-    </w:p>
-    <w:p>
-      <w:pPr>
-        <w:pStyle w:val="FirstParagraph"/>
-      </w:pPr>
-      <w:r>
-        <w:rPr>
-          <w:i/>
-          <w:iCs/>
-        </w:rPr>
-        <w:t xml:space="preserve">Motif-score screen (first round).</w:t>
-      </w:r>
-      <w:r>
-        <w:t xml:space="preserve"> </w:t>
-      </w:r>
-      <w:r>
-        <w:t xml:space="preserve">Each sequence was scanned circularly with seven simplified P1-motif rules based on PeptideCutter (Gasteiger et al., 2005) (trypsin, chymotrypsin at two specificities, an elastase-like rule, Lys-C, Arg-C and a pepsin-like rule). A weighted count of sites (weights 1.0, 0.6, 0.3 for enzyme priorities 1–3; only internal sites for trypsin; divided by 10 and capped at 1) gave a score. A sequence was labelled</w:t>
-      </w:r>
-      <w:r>
-        <w:t xml:space="preserve"> </w:t>
-      </w:r>
-      <w:r>
-        <w:rPr>
-          <w:i/>
-          <w:iCs/>
-        </w:rPr>
-        <w:t xml:space="preserve">resistant-like</w:t>
-      </w:r>
-      <w:r>
-        <w:t xml:space="preserve"> </w:t>
-      </w:r>
-      <w:r>
-        <w:t xml:space="preserve">with no internal trypsin site and a score below 0.3,</w:t>
-      </w:r>
-      <w:r>
-        <w:t xml:space="preserve"> </w:t>
-      </w:r>
-      <w:r>
-        <w:rPr>
-          <w:i/>
-          <w:iCs/>
-        </w:rPr>
-        <w:t xml:space="preserve">marginal</w:t>
-      </w:r>
-      <w:r>
-        <w:t xml:space="preserve"> </w:t>
-      </w:r>
-      <w:r>
-        <w:t xml:space="preserve">with at most one internal site and a score below 0.5, and</w:t>
-      </w:r>
-      <w:r>
-        <w:t xml:space="preserve"> </w:t>
-      </w:r>
-      <w:r>
-        <w:rPr>
-          <w:i/>
-          <w:iCs/>
-        </w:rPr>
-        <w:t xml:space="preserve">susceptible</w:t>
-      </w:r>
-      <w:r>
-        <w:t xml:space="preserve"> </w:t>
-      </w:r>
-      <w:r>
-        <w:t xml:space="preserve">otherwise. The labels are motif-based predictions and do not measure proteolysis.</w:t>
-      </w:r>
-    </w:p>
-    <w:p>
-      <w:pPr>
-        <w:pStyle w:val="BodyText"/>
-      </w:pPr>
-      <w:r>
-        <w:rPr>
-          <w:i/>
-          <w:iCs/>
-        </w:rPr>
-        <w:t xml:space="preserve">Hard criterion.</w:t>
-      </w:r>
-      <w:r>
-        <w:t xml:space="preserve"> </w:t>
-      </w:r>
-      <w:r>
-        <w:t xml:space="preserve">A sequence was kept only if no residue was K or R (trypsin-like), F, Y, W, L or M (chymotrypsin- and elastase-2-like), or A or V (elastase-1-like), unless the next residue was proline. In the linear peptide the C-terminal residue was also evaluated (it must not belong to this set or be isoleucine); in front M the closing bond was evaluated like any other. Isoleucine was allowed in the interior. The rule was applied to the same sequences for the linear (front L) and cyclic (front M) interpretation.</w:t>
-      </w:r>
-    </w:p>
-    <w:p>
-      <w:pPr>
-        <w:pStyle w:val="BodyText"/>
-      </w:pPr>
-      <w:r>
-        <w:t xml:space="preserve">Each clause has a stated basis, and where no measurement in Lepidoptera supports it the clause is declared conservative.</w:t>
-      </w:r>
-      <w:r>
-        <w:t xml:space="preserve"> </w:t>
-      </w:r>
-      <w:r>
-        <w:rPr>
-          <w:i/>
-          <w:iCs/>
-        </w:rPr>
-        <w:t xml:space="preserve">K and R:</w:t>
-      </w:r>
-      <w:r>
-        <w:t xml:space="preserve"> </w:t>
-      </w:r>
-      <w:r>
-        <w:t xml:space="preserve">trypsin-like enzymes are the main digestive proteases of these larvae (da Silva Júnior et al., 2020; de Almeida Barros et al., 2021; Valaitis, 1995) and require lysine or arginine at P1 (Perona and Craik, 1995; Patarroyo-Vargas et al., 2017).</w:t>
-      </w:r>
-      <w:r>
-        <w:t xml:space="preserve"> </w:t>
-      </w:r>
-      <w:r>
-        <w:rPr>
-          <w:i/>
-          <w:iCs/>
-        </w:rPr>
-        <w:t xml:space="preserve">F, Y, W, L and M:</w:t>
-      </w:r>
-      <w:r>
-        <w:t xml:space="preserve"> </w:t>
-      </w:r>
-      <w:r>
-        <w:t xml:space="preserve">the luminal</w:t>
-      </w:r>
-      <w:r>
-        <w:t xml:space="preserve"> </w:t>
-      </w:r>
-      <w:r>
-        <w:t xml:space="preserve">“elastase”</w:t>
-      </w:r>
-      <w:r>
-        <w:t xml:space="preserve"> </w:t>
-      </w:r>
-      <w:r>
-        <w:t xml:space="preserve">purified from a lepidopteran midgut is elastase-2-like, its best synthetic substrate being Suc-Ala-Ala-Pro-Leu-</w:t>
-      </w:r>
-      <w:r>
-        <w:rPr>
-          <w:i/>
-          <w:iCs/>
-        </w:rPr>
-        <w:t xml:space="preserve">p</w:t>
-      </w:r>
-      <w:r>
-        <w:t xml:space="preserve">-nitroanilide, that is P1 = Leu (Valaitis, 1995), and budworm chymotrypsin hydrolyses both the Phe and the Leu substrate (Valaitis et al., 1999); chymotrypsin-like transcripts and activities are reported in the pest species themselves (Yang et al., 2013; Zhan et al., 2011; Nakonieczny et al., 2007), so this set covers the documented large-hydrophobic P1 preference.</w:t>
-      </w:r>
-      <w:r>
-        <w:t xml:space="preserve"> </w:t>
-      </w:r>
-      <w:r>
-        <w:rPr>
-          <w:i/>
-          <w:iCs/>
-        </w:rPr>
-        <w:t xml:space="preserve">A and V:</w:t>
-      </w:r>
-      <w:r>
-        <w:t xml:space="preserve"> </w:t>
-      </w:r>
-      <w:r>
-        <w:t xml:space="preserve">the small-aliphatic P1 specificity of elastase-1-type enzymes (Gasteiger et al., 2005; Rawlings et al., 2018), which has not been characterised in these species; the clause is a conservative addition rather than a documented requirement.</w:t>
-      </w:r>
-      <w:r>
-        <w:t xml:space="preserve"> </w:t>
-      </w:r>
-      <w:r>
-        <w:rPr>
-          <w:i/>
-          <w:iCs/>
-        </w:rPr>
-        <w:t xml:space="preserve">G and S, which are not forbidden:</w:t>
-      </w:r>
-      <w:r>
-        <w:t xml:space="preserve"> </w:t>
-      </w:r>
-      <w:r>
-        <w:t xml:space="preserve">the broad elastase rule of the motif-score screen counts them at P1, but the activity actually characterised in lepidopteran midguts is elastase-2-like (P1 = Leu, already excluded), and forbidding them as well leaves 13 of the 527 front-L and 14 of the 543 front-M candidates (4 and 5 if threonine is added). They were kept, with the consequence stated: the surviving peptides are glycine-rich (Section 3.3) and remain exposed to any small-P1 activity, which an enzymatic stability assay, not a motif rule, has to settle.</w:t>
-      </w:r>
-      <w:r>
-        <w:t xml:space="preserve"> </w:t>
-      </w:r>
-      <w:r>
-        <w:rPr>
-          <w:i/>
-          <w:iCs/>
-        </w:rPr>
-        <w:t xml:space="preserve">The proline exception:</w:t>
-      </w:r>
-      <w:r>
-        <w:t xml:space="preserve"> </w:t>
-      </w:r>
-      <w:r>
-        <w:t xml:space="preserve">P1′ = Pro blocks or slows cleavage in the rules compiled for these enzymes (Gasteiger et al., 2005; Rawlings et al., 2018), but the barrier is statistical rather than absolute (Rodriguez et al., 2008; Pan et al., 2014), which is why the attack geometry of the K/R–Pro bonds is examined explicitly (Sections 2.7 and 3.8).</w:t>
-      </w:r>
-      <w:r>
-        <w:t xml:space="preserve"> </w:t>
-      </w:r>
-      <w:r>
-        <w:rPr>
-          <w:i/>
-          <w:iCs/>
-        </w:rPr>
-        <w:t xml:space="preserve">The C-terminal clause:</w:t>
-      </w:r>
-      <w:r>
-        <w:t xml:space="preserve"> </w:t>
-      </w:r>
-      <w:r>
-        <w:t xml:space="preserve">carboxypeptidase A activity predominates in lepidopteran midgut extracts, with carboxypeptidase B at a lower level, and it is induced by ingested soybean Kunitz inhibitor (Bown et al., 1998); carboxypeptidase activity is also high in field-collected larvae of another species (Valaitis et al., 1999); carboxypeptidase A removes C-terminal aromatic and branched aliphatic residues and carboxypeptidase B basic ones (Rawlings et al., 2018), so the forbidden set plus isoleucine was applied to the free C-terminus of the linear peptide. Front M has no terminus and is not screened for exopeptidases, whereas aminopeptidases of the brush border, purified from lepidopteran midguts as a leucine aminopeptidase and as aminopeptidase N (Valaitis, 1995; Valaitis et al., 1999), act on the free N-terminus of a linear peptide whatever its sequence and is therefore not excluded by any rule. The two cut-offs of the motif score (0.3 and 0.5) are operational and were fixed before the screen; they have no literature basis.</w:t>
-      </w:r>
-    </w:p>
-    <w:bookmarkEnd w:id="17"/>
-    <w:bookmarkStart w:id="18" w:name="co-folding-re-scoring-and-pose-quality"/>
-    <w:p>
-      <w:pPr>
-        <w:pStyle w:val="Heading3"/>
-      </w:pPr>
-      <w:r>
-        <w:t xml:space="preserve">2.5 Co-folding, re-scoring and pose quality</w:t>
-      </w:r>
-    </w:p>
-    <w:p>
-      <w:pPr>
-        <w:pStyle w:val="FirstParagraph"/>
-      </w:pPr>
-      <w:r>
-        <w:t xml:space="preserve">Candidates were co-folded with Boltz-2 2.2.1 (Passaro et al., 2025) (receptor MSA from ColabFold (Mirdita et al., 2022); peptide without MSA,</w:t>
-      </w:r>
-      <w:r>
-        <w:t xml:space="preserve"> </w:t>
-      </w:r>
-      <w:r>
-        <w:rPr>
-          <w:rStyle w:val="VerbatimChar"/>
-        </w:rPr>
-        <w:t xml:space="preserve">cyclic: true</w:t>
-      </w:r>
-      <w:r>
-        <w:t xml:space="preserve"> </w:t>
-      </w:r>
-      <w:r>
-        <w:t xml:space="preserve">for front M). We report the</w:t>
-      </w:r>
-      <w:r>
-        <w:t xml:space="preserve"> </w:t>
-      </w:r>
-      <w:r>
-        <w:rPr>
-          <w:rStyle w:val="VerbatimChar"/>
-        </w:rPr>
-        <w:t xml:space="preserve">confidence_score</w:t>
-      </w:r>
-      <w:r>
-        <w:t xml:space="preserve"> </w:t>
-      </w:r>
-      <w:r>
-        <w:t xml:space="preserve">(verified equal to 0.8·pLDDT + 0.2·ipTM), pLDDT and ipTM; affinity outputs were not used.</w:t>
-      </w:r>
-      <w:r>
-        <w:t xml:space="preserve"> </w:t>
-      </w:r>
-      <w:r>
-        <w:rPr>
-          <w:i/>
-          <w:iCs/>
-        </w:rPr>
-        <w:t xml:space="preserve">E1:</w:t>
-      </w:r>
-      <w:r>
-        <w:t xml:space="preserve"> </w:t>
-      </w:r>
-      <w:r>
-        <w:t xml:space="preserve">the 527 front-L and 543 front-M candidates of the hard criterion, one prediction each.</w:t>
-      </w:r>
-      <w:r>
-        <w:t xml:space="preserve"> </w:t>
-      </w:r>
-      <w:r>
-        <w:rPr>
-          <w:i/>
-          <w:iCs/>
-        </w:rPr>
-        <w:t xml:space="preserve">E2:</w:t>
-      </w:r>
-      <w:r>
-        <w:t xml:space="preserve"> </w:t>
-      </w:r>
-      <w:r>
-        <w:t xml:space="preserve">the ten best candidates per species and front were re-predicted with five diffusion samples, three recycling steps, inference-time potentials and three seeds (15 predictions); the score is the mean and the best sample is the starting structure.</w:t>
-      </w:r>
-      <w:r>
-        <w:t xml:space="preserve"> </w:t>
-      </w:r>
-      <w:r>
-        <w:rPr>
-          <w:i/>
-          <w:iCs/>
-        </w:rPr>
-        <w:t xml:space="preserve">E3:</w:t>
-      </w:r>
-      <w:r>
-        <w:t xml:space="preserve"> </w:t>
-      </w:r>
-      <w:r>
-        <w:t xml:space="preserve">three shuffled controls per E2 candidate were predicted with the same protocol, and Δ = score of the candidate − mean score of its controls.</w:t>
-      </w:r>
-      <w:r>
-        <w:t xml:space="preserve"> </w:t>
-      </w:r>
-      <w:r>
-        <w:rPr>
-          <w:i/>
-          <w:iCs/>
-        </w:rPr>
-        <w:t xml:space="preserve">E4:</w:t>
-      </w:r>
-      <w:r>
-        <w:t xml:space="preserve"> </w:t>
-      </w:r>
-      <w:r>
-        <w:t xml:space="preserve">pose quality control, with thresholds fixed beforehand: no peptide–receptor heavy-atom pair closer than 2.2 Å; |ω| ≥ 150° (Pro cis accepted); L chirality; His57 Nε2–Ser195 Oγ ≤ 3.8 Å; in front M, closing C–N ≤ 1.5 Å and closing ω ≥ 150°. The best candidate of each species was also co-folded with the seven other receptors (8 × 8 cross matrix). The three candidates per species and front with the highest mean E2 confidence among distinct sequences (24 per front) went to simulation; Δ was not used for selection.</w:t>
-      </w:r>
-    </w:p>
-    <w:bookmarkEnd w:id="18"/>
-    <w:bookmarkStart w:id="19" w:name="molecular-dynamics"/>
-    <w:p>
-      <w:pPr>
-        <w:pStyle w:val="Heading3"/>
-      </w:pPr>
-      <w:r>
-        <w:t xml:space="preserve">2.6 Molecular dynamics</w:t>
-      </w:r>
-    </w:p>
-    <w:p>
-      <w:pPr>
-        <w:pStyle w:val="FirstParagraph"/>
-      </w:pPr>
-      <w:r>
-        <w:t xml:space="preserve">Each of the 48 complexes was simulated for 10 ns at pH 10.0 (screening pH, chosen for the larval midgut:</w:t>
-      </w:r>
-      <w:r>
-        <w:t xml:space="preserve"> </w:t>
-      </w:r>
-      <w:r>
-        <w:rPr>
-          <w:i/>
-          <w:iCs/>
-        </w:rPr>
-        <w:t xml:space="preserve">H. virescens</w:t>
-      </w:r>
-      <w:r>
-        <w:t xml:space="preserve"> </w:t>
-      </w:r>
-      <w:r>
-        <w:t xml:space="preserve">gut extracts at pH 9.56–10.0 (Karumbaiah et al., 2007); (Dow, 1992)) and at pH 8.2, the pH of the enzymatic assays with the GORE peptides (0.1 M Tris-HCl, 20 mM CaCl</w:t>
-      </w:r>
-      <w:r>
-        <w:rPr>
-          <w:vertAlign w:val="subscript"/>
-        </w:rPr>
-        <w:t xml:space="preserve">2</w:t>
-      </w:r>
-      <w:r>
-        <w:t xml:space="preserve"> </w:t>
-      </w:r>
-      <w:r>
-        <w:t xml:space="preserve">(Schultz et al., 2026)). The two values were chosen together because the midgut pH is not the same in all lepidopteran larvae, so an inhibitor that is effective across this range is more viable against the pest complex than one that works at a single pH; the pair also matches the conditions under which a Ki would be measured. Protonation was assigned with PROPKA 3 (Olsson et al., 2011) through PDB2PQR (Dolinsky et al., 2007). Systems were built with GROMACS 2025.4 (Abraham et al., 2015), the CHARMM36 force field (Huang and MacKerell, 2013) (port made with charmm2gmx (Wacha and Lemkul, 2023)) and TIP3P water Jorgensen et al., 1983 in a dodecahedral box (1.2-nm buffer, 0.10 M KCl). The linear peptide carries NH</w:t>
-      </w:r>
-      <w:r>
-        <w:rPr>
-          <w:vertAlign w:val="subscript"/>
-        </w:rPr>
-        <w:t xml:space="preserve">3</w:t>
-      </w:r>
-      <w:r>
-        <w:rPr>
-          <w:vertAlign w:val="superscript"/>
-        </w:rPr>
-        <w:t xml:space="preserve">+</w:t>
-      </w:r>
-      <w:r>
-        <w:t xml:space="preserve"> </w:t>
-      </w:r>
-      <w:r>
-        <w:t xml:space="preserve">and COO</w:t>
-      </w:r>
-      <w:r>
-        <w:rPr>
-          <w:vertAlign w:val="superscript"/>
-        </w:rPr>
-        <w:t xml:space="preserve">−</w:t>
-      </w:r>
-      <w:r>
-        <w:t xml:space="preserve"> </w:t>
-      </w:r>
-      <w:r>
-        <w:t xml:space="preserve">termini at both pH; in front M there are no termini, and pdb2gmx forms the head-to-tail bond from the Boltz-2 geometry (the assembly script stops if the closing bond or CMAP term is missing). After minimization, 200 ps NVT and 500 ps NPT with position restraints (1,000 kJ mol</w:t>
-      </w:r>
-      <w:r>
-        <w:rPr>
-          <w:vertAlign w:val="superscript"/>
-        </w:rPr>
-        <w:t xml:space="preserve">−1</w:t>
-      </w:r>
-      <w:r>
-        <w:t xml:space="preserve"> </w:t>
-      </w:r>
-      <w:r>
-        <w:t xml:space="preserve">nm</w:t>
-      </w:r>
-      <w:r>
-        <w:rPr>
-          <w:vertAlign w:val="superscript"/>
-        </w:rPr>
-        <w:t xml:space="preserve">−2</w:t>
-      </w:r>
-      <w:r>
-        <w:t xml:space="preserve">), production ran for 10 ns at 300 K and 1 bar (velocity-rescaling thermostat Bussi et al., 2007; Parrinello–Rahman barostat Parrinello and Rahman, 1981; PME Essmann et al., 1995; 1.2-nm cutoffs, force-switched van der Waals; LINCS; 2-fs step). Each system was run once per pH with a random seed; four candidates per front (NGGRPDAP, GQNDS, PTTTQT and GSNIN linear; GGHSE, GGKPGEP, IYPETG and SGSTDIE cyclic) were run again at each pH with another seed to estimate run-to-run variation.</w:t>
-      </w:r>
-    </w:p>
-    <w:bookmarkEnd w:id="19"/>
-    <w:bookmarkStart w:id="20" w:name="trajectory-analysis"/>
-    <w:p>
-      <w:pPr>
-        <w:pStyle w:val="Heading3"/>
-      </w:pPr>
-      <w:r>
-        <w:t xml:space="preserve">2.7 Trajectory analysis</w:t>
-      </w:r>
-    </w:p>
-    <w:p>
-      <w:pPr>
-        <w:pStyle w:val="FirstParagraph"/>
-      </w:pPr>
-      <w:r>
-        <w:t xml:space="preserve">Trajectories were made whole and centered (</w:t>
-      </w:r>
-      <w:r>
-        <w:rPr>
-          <w:rStyle w:val="VerbatimChar"/>
-        </w:rPr>
-        <w:t xml:space="preserve">gmx trjconv -pbc mol -center</w:t>
-      </w:r>
-      <w:r>
-        <w:t xml:space="preserve">), because receptor and peptide are separate molecules that can be written to different periodic images; analyses used MDAnalysis 2.9.0 (Michaud-Agrawal et al., 2011; Gowers et al., 2016). In each frame, the distance from each peptide residue to the carboxylate oxygens of the Asp189 equivalent was the minimum heavy-atom distance, and the residue with the smallest mean distance was the anchor (defined post hoc, without assuming which residue). S1 occupancy is the fraction of frames with anchor–Asp189 distance below 5 Å (4 and 6 Å also computed), for the whole trajectory and each half. The anchor–Asp189 distance and the peptide Cα RMSD after receptor superposition are reported for an initial (first 0.4 ns) and a final window (last 2 ns). We also report the fraction of frames with any peptide atom within 4.5 Å of the catalytic Ser Oγ or His Nε2 or of the receptor and, in front M, the closing C–N distance and ω in every frame. The screen declared beforehand required second-half occupancy ≥ 70%, the same anchor in both halves and, in front M, an intact ring (C–N ≤ 1.5 Å, ω ≥ 150° in every frame). On 2 October 2026, after the first 16 simulations, occupancy was demoted from a gate to a description (Section 3.5), a change of the declared procedure made after seeing data. With one run per candidate no statistical inference is made.</w:t>
-      </w:r>
-    </w:p>
-    <w:p>
-      <w:pPr>
-        <w:pStyle w:val="BodyText"/>
-      </w:pPr>
-      <w:r>
-        <w:rPr>
-          <w:i/>
-          <w:iCs/>
-        </w:rPr>
-        <w:t xml:space="preserve">Attack geometry.</w:t>
-      </w:r>
-      <w:r>
-        <w:t xml:space="preserve"> </w:t>
-      </w:r>
-      <w:r>
-        <w:t xml:space="preserve">In the second half of each run, for every peptide bond (the closing bond included; the C-terminal carboxylate excluded) we measured the Ser195 Oγ–carbonyl C distance, the Oγ···C=O angle and the carbonyl O distance to the backbone N of Gly193 and Ser195 (oxyanion hole). A near-attack conformation required &lt; 3.5 Å, 90–125° and &lt; 3.5 Å (</w:t>
-      </w:r>
-      <w:r>
-        <w:rPr>
-          <w:rStyle w:val="VerbatimChar"/>
-        </w:rPr>
-        <w:t xml:space="preserve">scripts/scissile_geometry.py</w:t>
-      </w:r>
-      <w:r>
-        <w:t xml:space="preserve">). The criterion follows the near-attack-conformer description of catalysis, in which the reactive fraction of ground-state conformers governs the rate (Hur and Bruice, 2003), and the angular window brackets the Bürgi–Dunitz trajectory of nucleophilic addition to a carbonyl (Bürgi et al., 1973); the numerical cut-offs are operational for this analysis and are calibrated here not against a known substrate but against an internal control, the shuffled sequences of Section 3.5, which place a basic residue in S1 without the following proline under the identical protocol.</w:t>
-      </w:r>
-    </w:p>
-    <w:bookmarkEnd w:id="20"/>
-    <w:bookmarkStart w:id="21" w:name="energy-filter-ranking-and-ph-comparison"/>
-    <w:p>
-      <w:pPr>
-        <w:pStyle w:val="Heading3"/>
-      </w:pPr>
-      <w:r>
-        <w:t xml:space="preserve">2.8 Energy filter, ranking and pH comparison</w:t>
-      </w:r>
-    </w:p>
-    <w:p>
-      <w:pPr>
-        <w:pStyle w:val="FirstParagraph"/>
-      </w:pPr>
-      <w:r>
-        <w:t xml:space="preserve">MM-GBSA used gmx_MMPBSA (Valdés-Tresanco et al., 2021) (MMPBSA.py (Miller et al., 2012); generalized Born igb = 5 (Onufriev et al., 2004); 0.150 M salt; single trajectory; no entropy) on the second half of each trajectory (126 frames; receptor chain A, peptide chain B), with a standard error over five blocks of frames. PRODIGY (Vangone and Bonvin, 2015), a contact-based predictor with no explicit protonation, was applied to the initial pose (protonated at pH 8.2) and to 30 frames of the second half. Both scores grow with interface size, so each is also given per residue; neither was calibrated as a discriminator between real and shuffled inhibitors, and they order candidates against the same receptor without being read as affinities. Each stage ranks the candidates within a front (1 = best; ties receive the mean rank): Boltz-2 E2 confidence, paired Δ (E3), final peptide RMSD at pH 8.2, PRODIGY on the pose, and PRODIGY and MM-GBSA on the trajectory at pH 8.2; the aggregate is the mean rank over the stages. The ranking covers candidates that passed the pose quality control, had Δ &gt; 0 and, in front M, met the strict ring criterion; S1 occupancy does not enter (Section 3.5). The pH 8.2 and pH 10.0 simulations are paired (same pose and protocol; they differ in side-chain protonation, counter-ions and seed) and compared by the paired difference of each metric (Wilcoxon signed-rank test), the rank correlation between pH and the agreement of categorical outcomes, read against the difference between runs of the same pH.</w:t>
-      </w:r>
-    </w:p>
-    <w:bookmarkEnd w:id="21"/>
-    <w:bookmarkStart w:id="22" w:name="software-and-data"/>
-    <w:p>
-      <w:pPr>
-        <w:pStyle w:val="Heading3"/>
-      </w:pPr>
-      <w:r>
-        <w:t xml:space="preserve">2.9 Software and data</w:t>
-      </w:r>
-    </w:p>
-    <w:p>
-      <w:pPr>
-        <w:pStyle w:val="FirstParagraph"/>
-      </w:pPr>
-      <w:r>
-        <w:t xml:space="preserve">Calculations ran on one NVIDIA RTX 5070 Ti (16 GB) with 32 CPU cores (Python 3.10/3.11; PyTorch 2.12/2.13, CUDA 12.8/13.0). Code, configuration, subsite table, calibration data, candidate lists and scores are available in the project repository (https://github.com/eulaliobqi/design-inibidores) [repository visibility and archival DOI to be confirmed]. Trajectories are available on request.</w:t>
-      </w:r>
-    </w:p>
-    <w:p>
-      <w:r>
-        <w:pict>
-          <v:rect style="width:0;height:1.5pt" o:hralign="center" o:hrstd="t" o:hr="t"/>
-        </w:pict>
-      </w:r>
-    </w:p>
-    <w:bookmarkEnd w:id="22"/>
-    <w:bookmarkEnd w:id="23"/>
-    <w:bookmarkStart w:id="53" w:name="results"/>
-    <w:p>
-      <w:pPr>
-        <w:pStyle w:val="Heading2"/>
-      </w:pPr>
-      <w:r>
-        <w:t xml:space="preserve">3 Results</w:t>
-      </w:r>
-    </w:p>
-    <w:bookmarkStart w:id="24" w:name="receptor-panel-and-subsite-transfer"/>
-    <w:p>
-      <w:pPr>
-        <w:pStyle w:val="Heading3"/>
-      </w:pPr>
-      <w:r>
-        <w:t xml:space="preserve">3.1 Receptor panel and subsite transfer</w:t>
-      </w:r>
-    </w:p>
-    <w:p>
-      <w:pPr>
-        <w:pStyle w:val="FirstParagraph"/>
-      </w:pPr>
-      <w:r>
-        <w:t xml:space="preserve">All ten sequences carry the catalytic motif G[DN]SGG[PT] and an aspartate at the specificity position, the residue of bovine trypsin (Table 1). Identity to</w:t>
-      </w:r>
-      <w:r>
-        <w:t xml:space="preserve"> </w:t>
-      </w:r>
-      <w:r>
-        <w:rPr>
-          <w:i/>
-          <w:iCs/>
-        </w:rPr>
-        <w:t xml:space="preserve">M. sexta</w:t>
-      </w:r>
-      <w:r>
-        <w:t xml:space="preserve"> </w:t>
-      </w:r>
-      <w:r>
         <w:t xml:space="preserve">trypsin B ranged from 44.3% (</w:t>
       </w:r>
       <w:r>
@@ -1625,7 +1029,7 @@
         <w:t xml:space="preserve">C. includens</w:t>
       </w:r>
       <w:r>
-        <w:t xml:space="preserve">) among the pests; mean pLDDT was 89.7–91.0 for the eight pest models and 88.9–92.2 across the ten. In every model the residues equivalent to His57, Asp102 and Ser195 are His, Asp and Ser, and the His–Ser and His–Asp distances (2.92–3.13 Å and 2.70–2.75 Å) are those of an assembled triad; the pocket residues Asp189, Cys191, Gly193, Asp194, Gly216 and Gly226 are conserved, whereas Ser190, Val213, Trp215 and Gly219 vary among species (Table S2). The panel is therefore trypsin-type, but expression of these enzymes in the pest midguts is not documented (Section 2.1). P1 was Lys15 in BPTI and Lys5 in SFTI-1; in both complexes the S1 contact set had 14 trypsin residues, including Asp189, Ser190, Cys191, Gln192, Gly193, Asp194, His57, Ser195, Val213, Ser214, Trp215, Gly216, Gly219 and Gly226 (Table S1). All 20 receptor–template pairs were accepted (TM-score 0.946–0.957; RMSD 1.18–1.41 Å), all subsite residues were transferred (48 of 48 for 2PTC and 49 of 49 for 1SFI, exosite included), and the Asp189 equivalent found by structure matched the one found from sequence in all ten receptors.</w:t>
+        <w:t xml:space="preserve">) among the pests; mean pLDDT was 89.7–91.0 for the eight pest models and 88.9–92.2 across the ten. In every model the residues equivalent to His57, Asp102 and Ser195 are His, Asp and Ser, and the His–Ser and His–Asp distances (2.92–3.13 Å and 2.70–2.75 Å) are those of an assembled triad; the pocket residues Asp189, Cys191, Gly193, Asp194, Gly216 and Gly226 are conserved, whereas Ser190, Val213, Trp215 and Gly219 vary among species (Table S2). P1 was Lys15 in BPTI and Lys5 in SFTI-1; in both complexes the S1 contact set had 14 trypsin residues, including Asp189, Ser190, Cys191, Gln192, Gly193, Asp194, His57, Ser195, Val213, Ser214, Trp215, Gly216, Gly219 and Gly226 (Table S1). All 20 receptor–template pairs were accepted (TM-score 0.946–0.957; RMSD 1.18–1.41 Å).</w:t>
       </w:r>
     </w:p>
     <w:p>
@@ -3060,14 +2464,14 @@
         </w:tc>
       </w:tr>
     </w:tbl>
-    <w:bookmarkEnd w:id="24"/>
-    <w:bookmarkStart w:id="28" w:name="calibration-of-the-scoring-ladder-1"/>
+    <w:bookmarkEnd w:id="22"/>
+    <w:bookmarkStart w:id="26" w:name="calibration-of-scores-1"/>
     <w:p>
       <w:pPr>
         <w:pStyle w:val="Heading3"/>
       </w:pPr>
       <w:r>
-        <w:t xml:space="preserve">3.2 Calibration of the scoring ladder</w:t>
+        <w:t xml:space="preserve">3.2 Calibration of scores</w:t>
       </w:r>
     </w:p>
     <w:p>
@@ -4187,18 +3591,18 @@
           <wp:inline>
             <wp:extent cx="5334000" cy="3556836"/>
             <wp:effectExtent b="0" l="0" r="0" t="0"/>
-            <wp:docPr descr="Figure 2. Calibration of the scoring ladder with six natural inhibitors and shuffled decoys (22 systems; Bt: bovine trypsin, Sf: S. frugiperda). Real inhibitor (filled) and shuffled decoy (open) for (A) Boltz-2 confidence, (B) Boltz-2 ipTM, (C) pLDDT of the complex and (D) ligand backbone RMSD after receptor superposition (2 ns, last third); a connector is red when the decoy scored better, and the number of pairs (out of 10) in which the inhibitor scored better is given in each panel." title="" id="26" name="Picture"/>
+            <wp:docPr descr="Figure 2. Calibration of the scoring ladder with six natural inhibitors and shuffled decoys (22 systems; Bt: bovine trypsin, Sf: S. frugiperda). Real inhibitor (filled) and shuffled decoy (open) for (A) Boltz-2 confidence, (B) Boltz-2 ipTM, (C) pLDDT of the complex and (D) ligand backbone RMSD after receptor superposition (2 ns, last third); a connector is red when the decoy scored better, and the number of pairs (out of 10) in which the inhibitor scored better is given in each panel." title="" id="24" name="Picture"/>
             <a:graphic>
               <a:graphicData uri="http://schemas.openxmlformats.org/drawingml/2006/picture">
                 <pic:pic>
                   <pic:nvPicPr>
-                    <pic:cNvPr descr="figures/final/Figure2_calibration.png" id="27" name="Picture"/>
+                    <pic:cNvPr descr="figures/final/Figure2_calibration.png" id="25" name="Picture"/>
                     <pic:cNvPicPr>
                       <a:picLocks noChangeArrowheads="1" noChangeAspect="1"/>
                     </pic:cNvPicPr>
                   </pic:nvPicPr>
                   <pic:blipFill>
-                    <a:blip r:embed="rId25"/>
+                    <a:blip r:embed="rId23"/>
                     <a:stretch>
                       <a:fillRect/>
                     </a:stretch>
@@ -4256,8 +3660,8 @@
         <w:t xml:space="preserve">). Real inhibitor (filled) and shuffled decoy (open) for (A) Boltz-2 confidence, (B) Boltz-2 ipTM, (C) pLDDT of the complex and (D) ligand backbone RMSD after receptor superposition (2 ns, last third); a connector is red when the decoy scored better, and the number of pairs (out of 10) in which the inhibitor scored better is given in each panel.</w:t>
       </w:r>
     </w:p>
-    <w:bookmarkEnd w:id="28"/>
-    <w:bookmarkStart w:id="32" w:name="X1e1655b08927a022bca815893a3d189995867b4"/>
+    <w:bookmarkEnd w:id="26"/>
+    <w:bookmarkStart w:id="30" w:name="X1e1655b08927a022bca815893a3d189995867b4"/>
     <w:p>
       <w:pPr>
         <w:pStyle w:val="Heading3"/>
@@ -4271,7 +3675,7 @@
         <w:pStyle w:val="FirstParagraph"/>
       </w:pPr>
       <w:r>
-        <w:t xml:space="preserve">Generation produced 880 backbones (110 per species) with the requested length and an N–C closure distance of 0.76–1.40 Å (not relaxed at all-atom level), and ProteinMPNN yielded 22,066 unique sequences (2,692–2,839 per species; Table 3). The motif-score screen kept 1,829 (8.3%) as resistant-like, 4,987 (22.6%) as marginal and 15,250 (69.1%) as susceptible; it mainly removed long sequences (mean length 7.05 residues and 95.6% with 10 residues or fewer in the resistant-like set against 15.74 and 12.7% in the susceptible set), and only 4.3% of the resistant-like sequences contained lysine or arginine (Figure S2). The 1,829 resistant-like sequences were co-folded with Boltz-2 in a first round (mean confidence 0.862, range 0.695–0.953; Figure S8), values that overlap those of the natural inhibitors and decoys of the calibration.</w:t>
+        <w:t xml:space="preserve">RFdiffusion generation produced 880 backbones (110 per species) with lengths between 5 and 20 amino acids, and ProteinMPNN yielded 22,066 unique sequences, ranging between 2,692–2,839 per species (Table 3). The motif-score screen kept 1,829 (8.3%) marked as resistant, 4,987 (22.6%) labelled as marginal and 15,250 (69.1%) classified as susceptible. During the cleavage-site screen, mostly long sequences were removed, leaving 95.6% of the sequences with fewer than 10 residues in the group declared resistant, against 86.8% in the marginal and 12.7% in the susceptible group, and only 4.3% of the resistant sequences contained lysine or arginine (Figure S2). The 1,829 sequences in the resistant group were co-folded with Boltz-2 with a mean confidence of 0.862, ranging from 0.695–0.953 (Figure S8).</w:t>
       </w:r>
     </w:p>
     <w:p>
@@ -5265,7 +4669,7 @@
         <w:pStyle w:val="BodyText"/>
       </w:pPr>
       <w:r>
-        <w:t xml:space="preserve">The hard criterion (Figure S1) left 527 sequences (2.4%) in front L and 543 (2.5%) in front M, 41–86 and 41–87 per species (Figure 3); because sequences were merged within a species and not across species, these counts are sequence–target pairs and correspond to 445 and 461 distinct sequences. All 527 front-L sequences are also in front M; of the 16 that pass only in front M, 14 end in a forbidden residue followed across the closure by a proline that is also the first residue, and two end in isoleucine. The two fronts are therefore nested and not a partition of the set. The hard set and the motif-score set, by contrast, do not nest (396 of the 543 front-M candidates, 73%, were also resistant-like), and the discrepancy has a single cause: the elastase rule of the motif score counts glycine and serine at P1, which the hard criterion does not forbid (Section 2.4), so the 147 candidates that the motif score does not call resistant-like are the glycine-rich ones (85.9% glycine and mean length 10.1 residues, against 27.9% and 6.8 in the 396 that both screens accept). The hard set is short and glycine-rich (Figure S3): mean length 7.7 residues, 430 of the 527 front-L sequences (81.6%) with 8 residues or fewer, and glycine 49.4% of the 4,060 residues, followed by serine (11.7%), proline (9.8%), threonine (9.0%) and aspartate (5.8%). Lysine or arginine accounted for nine residues (0.22%), each followed by proline (six Arg–Pro, three Lys–Pro). The criterion is sensitive to where its boundary is drawn: forbidding isoleucine in the interior as well leaves 393 front-L sequences, forbidding glycine leaves 49, forbidding glycine and serine leaves 13, and adding threonine leaves 4.</w:t>
+        <w:t xml:space="preserve">The non-cleavability criterion (Figure S1) left 527 sequences (2.4%) in front L and 543 (2.5%) in front M, with 41–86 and 41–87 per species (Figure 3); because sequences were merged within a species and not across species, these counts are sequence–target pairs and correspond to 445 and 461 distinct sequences. All 527 front-L sequences are also in front M; of the 16 that pass only in front M, 14 end in a forbidden residue followed across the closure by a proline that is also the first residue, and two end in isoleucine. The non-cleavability set and the motif-score set, by contrast, do not nest (396 of the 543 front-M candidates, 73%, were also resistant), and the discrepancy has a single cause: the elastase rule of the motif score counts glycine and serine at P1, which the hard criterion does not forbid (Section 2.4), so the 147 candidates that the motif score does not call resistant are the glycine-rich ones (85.9% glycine and mean length 10.1 residues, against 27.9% and 6.8 in the 396 that both screens accept). The non-cleavability set is short and glycine-rich (Figure S3): mean length 7.7 residues, 430 of the 527 front-L sequences (81.6%) with 8 residues or fewer, and glycine 49.4% of the 4,060 residues, followed by serine (11.7%), proline (9.8%), threonine (9.0%) and aspartate (5.8%). Lysine or arginine accounted for nine residues (0.22%), each followed by proline (six Arg–Pro, three Lys–Pro).</w:t>
       </w:r>
     </w:p>
     <w:p>
@@ -5277,18 +4681,18 @@
           <wp:inline>
             <wp:extent cx="5334000" cy="1982992"/>
             <wp:effectExtent b="0" l="0" r="0" t="0"/>
-            <wp:docPr descr="Figure 3. Candidates surviving each screen. Left: sequences per species labelled resistant-like by the first-round motif score and by the hard criterion in each of the two fronts; right: totals out of 22,066 sequences." title="" id="30" name="Picture"/>
+            <wp:docPr descr="Figure 3. Candidates surviving each screen. Left: sequences per species labelled resistant-like by the first-round motif score and by the hard criterion in each of the two fronts; right: totals out of 22,066 sequences." title="" id="28" name="Picture"/>
             <a:graphic>
               <a:graphicData uri="http://schemas.openxmlformats.org/drawingml/2006/picture">
                 <pic:pic>
                   <pic:nvPicPr>
-                    <pic:cNvPr descr="figures/final/Figure3_hard_funnel.png" id="31" name="Picture"/>
+                    <pic:cNvPr descr="figures/final/Figure3_hard_funnel.png" id="29" name="Picture"/>
                     <pic:cNvPicPr>
                       <a:picLocks noChangeArrowheads="1" noChangeAspect="1"/>
                     </pic:cNvPicPr>
                   </pic:nvPicPr>
                   <pic:blipFill>
-                    <a:blip r:embed="rId29"/>
+                    <a:blip r:embed="rId27"/>
                     <a:stretch>
                       <a:fillRect/>
                     </a:stretch>
@@ -5333,8 +4737,8 @@
         <w:t xml:space="preserve">Candidates surviving each screen. Left: sequences per species labelled resistant-like by the first-round motif score and by the hard criterion in each of the two fronts; right: totals out of 22,066 sequences.</w:t>
       </w:r>
     </w:p>
-    <w:bookmarkEnd w:id="32"/>
-    <w:bookmarkStart w:id="36" w:name="Xfdbbc48056d1ba06070a51ec969ff941901c86d"/>
+    <w:bookmarkEnd w:id="30"/>
+    <w:bookmarkStart w:id="34" w:name="Xfdbbc48056d1ba06070a51ec969ff941901c86d"/>
     <w:p>
       <w:pPr>
         <w:pStyle w:val="Heading3"/>
@@ -5348,7 +4752,7 @@
         <w:pStyle w:val="FirstParagraph"/>
       </w:pPr>
       <w:r>
-        <w:t xml:space="preserve">All 527 front-L and 543 front-M candidates were predicted (E1; mean confidence 0.874 and 0.862). Predicting 442 candidates a second time with identical input gave a rank correlation of only 0.57 between runs (mean absolute difference 0.028; 0.21–0.69 by species), and the two fronts of the same sequence (n = 527) correlated at 0.50 (Figure 4). The agreement between the two forms is therefore close to the agreement between two runs of one of them, and a single prediction cannot separate an effect of the form from sampling noise. In E2, the ten best candidates per species and front were re-predicted (15 predictions each): mean confidence fell from 0.922 to 0.900 (front L) and from 0.911 to 0.888 (front M), the regression expected for a top-ranked set; the standard deviation among the 15 predictions of one candidate averaged 0.019 and 0.022, of the order of the spread among the ten candidates of a species, so the order within a top ten is not resolved (Figure S4). Every candidate had at least one sample that passed the pose quality control, and the 48 selected candidates all passed it, with the catalytic triad intact (His57–Ser195 distance 2.4–3.4 Å) and no peptide–receptor heavy-atom pair closer than 2.4 Å (Figure S5). The minimum distance to the Asp189 carboxylate in the starting structure was 5 Å or less in 9 of the 24 front-L and 18 of the 24 front-M structures. Only three of the 48 contain lysine or arginine (NGGRPDAP in front L; PISQIDSGSR and GGKPGEP in front M).</w:t>
+        <w:t xml:space="preserve">All 527 front-L and 543 front-M candidates were predicted with high confidence. Predicting 442 candidates a second time with identical input gave a rank correlation of only 0.57 between runs (mean absolute difference 0.028; 0.21–0.69 by species), and the two fronts of the same sequence (n = 527) correlated at 0.50 (Figure 4). The agreement between the two forms is therefore close to the agreement between two runs of one of them, and a single prediction cannot separate an effect of the form from sampling noise. To increase confidence, the ten best candidates per species and front were re-predicted (15 predictions each): mean confidence went from 0.922, adjusted to 0.900 (front L) and from 0.911 to 0.888 (front M), the regression expected for a top-ranked set; the standard deviation among the 15 predictions of one candidate averaged 0.019 and 0.022. Every candidate had at least one sample that passed the pose quality control, and the 48 selected candidates all passed it, with the catalytic triad kept conserved (His57–Ser195 distance 2.4–3.4 Å) and no peptide–receptor heavy-atom pair closer than 2.4 Å (Figure S5). The minimum distance to the Asp189 carboxylate in the starting structure was 5 Å or less in 9 of the 24 front-L and 18 of the 24 front-M structures. Only three of the 48 contain lysine or arginine (NGGRPDAP in front L; PISQIDSGSR and GGKPGEP in front M).</w:t>
       </w:r>
     </w:p>
     <w:p>
@@ -5356,7 +4760,7 @@
         <w:pStyle w:val="BodyText"/>
       </w:pPr>
       <w:r>
-        <w:t xml:space="preserve">The paired difference Δ against three shuffled controls (E3) was positive in 63 of 78 linear candidates (81%; median 0.013, interquartile range 0.003–0.030) and in 60 of 79 cyclic ones (76%; median 0.014; the other two linear and one cyclic candidate of the 80 per front are poly-glycine and cannot be shuffled); among the 48 final candidates it was positive in 23 of 24 linear and 22 of 24 cyclic. The differences are of the order of the standard deviation among the 15 predictions of a candidate (0.02), each Δ rests on three controls, and the shuffled controls of glycine-rich sequences are similar to the candidate (mean identity 0.35 in front L, 0.29 in front M); a positive Δ therefore means that the candidate did not score below its controls, and not that it binds; that poly-glycine sequences, which have no shuffled control, were among the ten best by first-pass (E1) confidence in both fronts points the same way, since a score that rewards a homopolymer is not reporting specific recognition. The cross matrix (best candidate of each species against its own and the seven other receptors) showed no species-specific preference: the own receptor gave the highest confidence in 4 of 8 (linear) and 3 of 8 (cyclic) species, and the receptor explained more variation than the peptide (the</w:t>
+        <w:t xml:space="preserve">The paired difference Δ against three shuffled controls was positive in 63 of 78 linear candidates (81%; median 0.013, interquartile range 0.003–0.030) and in 60 of 79 cyclic ones (76%; median 0.014; the other two linear and one cyclic candidate of the 80 per front are poly-glycine and cannot be shuffled); among the 48 final candidates it was positive in 23 of 24 linear and 22 of 24 cyclic. The differences are of the order of the standard deviation among the 15 predictions of a candidate (0.02), each Δ rests on three controls, and the shuffled controls of glycine-rich sequences are similar to the candidate (mean identity 0.35 in front L, 0.29 in front M); a positive Δ therefore means that the candidate did not score below its controls, and not that it binds; that poly-glycine sequences, which have no shuffled control, were among the ten best by first-pass confidence in both fronts points the same way, since a score that rewards a homopolymer is not reporting specific recognition. The cross matrix (best candidate of each species against its own and the seven other receptors) showed no species-specific preference: the own receptor gave the highest confidence in 4 of 8 (linear) and 3 of 8 (cyclic) species, and the receptor explained more variation than the peptide (the</w:t>
       </w:r>
       <w:r>
         <w:t xml:space="preserve"> </w:t>
@@ -5372,7 +4776,7 @@
         <w:t xml:space="preserve"> </w:t>
       </w:r>
       <w:r>
-        <w:t xml:space="preserve">model gave the lowest mean confidence in both fronts). Because Boltz-2 confidence is not affinity (Section 3.2), this is neither a demonstration nor a refutation of selectivity.</w:t>
+        <w:t xml:space="preserve">model gave the lowest mean confidence in both fronts).</w:t>
       </w:r>
     </w:p>
     <w:p>
@@ -5384,18 +4788,18 @@
           <wp:inline>
             <wp:extent cx="5334000" cy="2414733"/>
             <wp:effectExtent b="0" l="0" r="0" t="0"/>
-            <wp:docPr descr="Figure 4. Reproducibility of Boltz-2 confidence in the two-front screen. (A) The same 442 candidates predicted in the first round and again in the two-front screen with identical input. (B) The same 527 sequences predicted in each of the two fronts. The dotted line is identity; ρ is the Spearman correlation and |Δ| the mean absolute difference." title="" id="34" name="Picture"/>
+            <wp:docPr descr="Figure 4. Reproducibility of Boltz-2 confidence in the two-front screen. (A) The same 442 candidates predicted in the first round and again in the two-front screen with identical input. (B) The same 527 sequences predicted in each of the two fronts. The dotted line is identity; ρ is the Spearman correlation and |Δ| the mean absolute difference." title="" id="32" name="Picture"/>
             <a:graphic>
               <a:graphicData uri="http://schemas.openxmlformats.org/drawingml/2006/picture">
                 <pic:pic>
                   <pic:nvPicPr>
-                    <pic:cNvPr descr="figures/final/Figure4_boltz2_reproducibility.png" id="35" name="Picture"/>
+                    <pic:cNvPr descr="figures/final/Figure4_boltz2_reproducibility.png" id="33" name="Picture"/>
                     <pic:cNvPicPr>
                       <a:picLocks noChangeArrowheads="1" noChangeAspect="1"/>
                     </pic:cNvPicPr>
                   </pic:nvPicPr>
                   <pic:blipFill>
-                    <a:blip r:embed="rId33"/>
+                    <a:blip r:embed="rId31"/>
                     <a:stretch>
                       <a:fillRect/>
                     </a:stretch>
@@ -5440,8 +4844,8 @@
         <w:t xml:space="preserve">Reproducibility of Boltz-2 confidence in the two-front screen. (A) The same 442 candidates predicted in the first round and again in the two-front screen with identical input. (B) The same 527 sequences predicted in each of the two fronts. The dotted line is identity; ρ is the Spearman correlation and |Δ| the mean absolute difference.</w:t>
       </w:r>
     </w:p>
-    <w:bookmarkEnd w:id="36"/>
-    <w:bookmarkStart w:id="40" w:name="ten-nanosecond-simulations-at-ph-10.0"/>
+    <w:bookmarkEnd w:id="34"/>
+    <w:bookmarkStart w:id="38" w:name="ten-nanosecond-simulations-at-ph-10.0"/>
     <w:p>
       <w:pPr>
         <w:pStyle w:val="Heading3"/>
@@ -5455,7 +4859,7 @@
         <w:pStyle w:val="FirstParagraph"/>
       </w:pPr>
       <w:r>
-        <w:t xml:space="preserve">All 48 simulations (one run each) finished and were analysed with the procedure of Section 2.7 (Figure 5). The median anchor–Asp189 distance rose from 5.72 Å in the initial window to 6.77 Å in the final window for the linear candidates, and from 5.07 to 6.11 Å for the cyclic ones. In the final window the anchor was within 4 Å of Asp189 in 2 of 24 linear and 2 of 24 cyclic simulations, and farther than 10 Å in 6 and 4. Second-half occupancy at 5 Å reached at least 0.70 in 5 of 48: NGGRPDAP (Arg anchor, 1.00) and GQNDS (Gln, 1.00) in the linear front, and GGKPGEP (Lys, 1.00), GGHSE (His, 0.99) and GGGGH (His, 0.82) in the cyclic front. The anchor was the same in both halves in 21 of 24 linear and 24 of 24 cyclic simulations. The peptide kept some receptor contact within 4.5 Å in at least 0.82 (linear) and 0.97 (cyclic) of the frames, so leaving S1 did not mean dissociation; contact with the catalytic serine and histidine was present when the anchor was far from S1 and does not discriminate. The final-window peptide RMSD had a median of 0.56 nm (0.21–2.64) in the linear and 0.30 nm (0.16–1.69) in the cyclic front. In all 24 cyclic simulations the ring stayed closed (C–N at most 1.462 Å); 11 met the strict criterion, and the other 13 fell below the ω limit (minimum 137.2–149.9°) in at least one frame, in 12 of them in fewer than 2.2% of the frames (Figure S6).</w:t>
+        <w:t xml:space="preserve">All 48 simulations were run and analysed with the procedure of Section 2.7 (Figure 5). The median anchor–Asp189 distance rose from 5.72 Å in the initial window to 6.77 Å in the final window for the linear candidates, and from 5.07 to 6.11 Å for the cyclic ones. In the final window, the anchor was within 4 Å of Asp189 in 2 of 24 linear and 2 of 24 cyclic simulations, and farther than 10 Å in 6 and 4. Second-half occupancy at 5 Å reached at least 0.70 in 5 of 48: NGGRPDAP (Arg anchor, 1.00) and GQNDS (Gln, 1.00) in the linear front, and GGKPGEP (Lys, 1.00), GGHSE (His, 0.99) and GGGGH (His, 0.82) in the cyclic front. The anchor was the same in both halves in 21 of 24 linear and 24 of 24 cyclic simulations. The peptide kept some receptor contact within 4.5 Å in at least 0.82 (linear) and 0.97 (cyclic) of the frames, so leaving S1 did not mean dissociation; contact with the catalytic serine and histidine was present when the anchor was far from S1 and does not discriminate. The final-window peptide RMSD had a median of 0.56 nm (0.21–2.64) in the linear and 0.30 nm (0.16–1.69) in the cyclic front. In all 24 cyclic simulations, the ring stayed closed (C–N at most 1.462 Å); 11 met the strict criterion, and the other 13 fell below the ω limit (minimum 137.2–149.9°) in at least one frame, in 12 of them in fewer than 2.2% of the frames (Figure S6).</w:t>
       </w:r>
     </w:p>
     <w:p>
@@ -5463,33 +4867,7 @@
         <w:pStyle w:val="BodyText"/>
       </w:pPr>
       <w:r>
-        <w:rPr>
-          <w:i/>
-          <w:iCs/>
-        </w:rPr>
-        <w:t xml:space="preserve">The starting pose decides the outcome.</w:t>
-      </w:r>
-      <w:r>
-        <w:t xml:space="preserve"> </w:t>
-      </w:r>
-      <w:r>
-        <w:t xml:space="preserve">A second-half occupancy of at least 0.70 occurred in 5 of the 9 simulations whose peptide started within 4.0 Å of the Asp189 carboxylate and in none of the 39 that started farther (Fisher exact test,</w:t>
-      </w:r>
-      <w:r>
-        <w:t xml:space="preserve"> </w:t>
-      </w:r>
-      <w:r>
-        <w:rPr>
-          <w:i/>
-          <w:iCs/>
-        </w:rPr>
-        <w:t xml:space="preserve">P</w:t>
-      </w:r>
-      <w:r>
-        <w:t xml:space="preserve"> </w:t>
-      </w:r>
-      <w:r>
-        <w:t xml:space="preserve">= 7 × 10^−5; descriptive, because each candidate was run once and the anchor is defined post hoc). The initial and final distances correlated (Spearman ρ = 0.63) and the initial distance was inversely related to occupancy (ρ = −0.63); the anchor identity did not separate the five (Arg, Gln, Lys and two His; three of them carry no basic residue). The 10-ns screen therefore re-reports the pose proposed by Boltz-2: it measures whether a pose already in S1 survives, and a peptide placed 5 Å away is not given time to find the pocket. For this reason occupancy was demoted from a criterion to a description (Section 2.7).</w:t>
+        <w:t xml:space="preserve">A second-half occupancy of at least 0.70 occurred in 5 of the 9 simulations whose peptides started within 4.0 Å of the Asp189 carboxylate and in none of the 39 that started farther. The initial and final distances correlated (Spearman ρ = 0.63) and the initial distance was inversely related to occupancy (ρ = −0.63); the anchor identity did not separate the five (Arg, Gln, Lys and two His). The 10-ns screen therefore re-reports the pose proposed by Boltz-2: a pose already in S1 is measured for whether it survives, and a peptide placed 5 Å away is not given time to find the pocket. For this reason, occupancy was demoted from a criterion to a description (Section 2.7).</w:t>
       </w:r>
     </w:p>
     <w:p>
@@ -5497,30 +4875,7 @@
         <w:pStyle w:val="BodyText"/>
       </w:pPr>
       <w:r>
-        <w:rPr>
-          <w:i/>
-          <w:iCs/>
-        </w:rPr>
-        <w:t xml:space="preserve">Reference scale.</w:t>
-      </w:r>
-      <w:r>
-        <w:t xml:space="preserve"> </w:t>
-      </w:r>
-      <w:r>
-        <w:t xml:space="preserve">The identical analysis of the calibration complexes (</w:t>
-      </w:r>
-      <w:r>
-        <w:rPr>
-          <w:i/>
-          <w:iCs/>
-        </w:rPr>
-        <w:t xml:space="preserve">S. frugiperda</w:t>
-      </w:r>
-      <w:r>
-        <w:t xml:space="preserve"> </w:t>
-      </w:r>
-      <w:r>
-        <w:t xml:space="preserve">receptor; 2 ns; another force field and pH) gave an occupancy of 1.00 in the second half for all five shuffled decoys and for four of six inhibitors; in all eleven systems the anchor was a lysine or an arginine, which reach S1 whenever they are placed there (Brandsdal et al., 2006; Helland et al., 1999). Occupancy therefore measures placement and not the discrimination between a binder and a decoy. Shuffled controls of the candidates (seven) and variants with the anchor replaced by Asp or Leu (eight) were also simulated at the same protocol; they are not used, because their starting distance to Asp189 explained the outcome (controls that started within 2.74 Å all reached 1.00; the variants started 1.0–4.8 Å farther than their parents), so they cannot separate sequence from pose. Under the rule fixed before the runs, a control that does not separate is removed from the analyses and tiers; the analyses are in the repository.</w:t>
+        <w:t xml:space="preserve">In the systems assessed, eleven of them, the anchor was a lysine or an arginine, which reached S1 whenever it was placed there (Brandsdal et al., 2006; Helland et al., 1999). Shuffled controls of the candidates (seven) and variants with the anchor replaced by Asp or Leu (eight) were also simulated at the same protocol; they are not used, because their starting distance to Asp189 explained the outcome (controls that started within 2.74 Å all reached 1.00; the variants started 1.0–4.8 Å farther than their parents), so they cannot separate sequence from pose.</w:t>
       </w:r>
     </w:p>
     <w:p>
@@ -5532,18 +4887,18 @@
           <wp:inline>
             <wp:extent cx="5334000" cy="5484607"/>
             <wp:effectExtent b="0" l="0" r="0" t="0"/>
-            <wp:docPr descr="Figure 5. Ten-nanosecond screening simulations at pH 10.0 (CHARMM36, 300 K, one run each; all 48 finished). (A) Distance from the anchor residue to the Asp189 carboxylate and (B) local peptide RMSD (Cα, receptor-aligned) for the three A. gemmatalis candidates of each front (solid, dashed and dotted: candidates 1, 2 and 3). (C) S1 occupancy at 5 Å in the first and second halves for all 48 simulations (circle: passes the screen as originally declared; cross: does not; the dashed line is the 70% level, now descriptive). (D) Per simulation, front L (top) and front M (bottom): second-half occupancy, contact with the catalytic serine and any receptor contact; ✗ marks front-M candidates that failed the strict ring criterion and ✓ those that met it." title="" id="38" name="Picture"/>
+            <wp:docPr descr="Figure 5. Ten-nanosecond screening simulations at pH 10.0 (CHARMM36, 300 K, one run each; all 48 finished). (A) Distance from the anchor residue to the Asp189 carboxylate and (B) local peptide RMSD (Cα, receptor-aligned) for the three A. gemmatalis candidates of each front (solid, dashed and dotted: candidates 1, 2 and 3). (C) S1 occupancy at 5 Å in the first and second halves for all 48 simulations (circle: passes the screen as originally declared; cross: does not; the dashed line is the 70% level, now descriptive). (D) Per simulation, front L (top) and front M (bottom): second-half occupancy, contact with the catalytic serine and any receptor contact; ✗ marks front-M candidates that failed the strict ring criterion and ✓ those that met it." title="" id="36" name="Picture"/>
             <a:graphic>
               <a:graphicData uri="http://schemas.openxmlformats.org/drawingml/2006/picture">
                 <pic:pic>
                   <pic:nvPicPr>
-                    <pic:cNvPr descr="figures/final/Figure5_MD_screen.png" id="39" name="Picture"/>
+                    <pic:cNvPr descr="figures/final/Figure5_MD_screen.png" id="37" name="Picture"/>
                     <pic:cNvPicPr>
                       <a:picLocks noChangeArrowheads="1" noChangeAspect="1"/>
                     </pic:cNvPicPr>
                   </pic:nvPicPr>
                   <pic:blipFill>
-                    <a:blip r:embed="rId37"/>
+                    <a:blip r:embed="rId35"/>
                     <a:stretch>
                       <a:fillRect/>
                     </a:stretch>
@@ -5604,8 +4959,8 @@
         <w:t xml:space="preserve">candidates of each front (solid, dashed and dotted: candidates 1, 2 and 3). (C) S1 occupancy at 5 Å in the first and second halves for all 48 simulations (circle: passes the screen as originally declared; cross: does not; the dashed line is the 70% level, now descriptive). (D) Per simulation, front L (top) and front M (bottom): second-half occupancy, contact with the catalytic serine and any receptor contact; ✗ marks front-M candidates that failed the strict ring criterion and ✓ those that met it.</w:t>
       </w:r>
     </w:p>
-    <w:bookmarkEnd w:id="40"/>
-    <w:bookmarkStart w:id="44" w:name="energy-filter-and-ranking-by-stage"/>
+    <w:bookmarkEnd w:id="38"/>
+    <w:bookmarkStart w:id="42" w:name="energy-filter-and-ranking-by-stage"/>
     <w:p>
       <w:pPr>
         <w:pStyle w:val="Heading3"/>
@@ -5785,18 +5140,18 @@
           <wp:inline>
             <wp:extent cx="5334000" cy="4445418"/>
             <wp:effectExtent b="0" l="0" r="0" t="0"/>
-            <wp:docPr descr="Figure 6. Energy filter and ranking by stage. (A) PRODIGY ΔG of the initial pose of the 48 candidates against peptide length (ρ: Spearman). (B) Rank of each candidate within its front at each stage and the aggregate (mean rank) for the ten best candidates of each front among those that passed the gates; stages shown: Boltz-2 E2 confidence, paired Δ (E3), final peptide RMSD, PRODIGY on the pose, PRODIGY on trajectory frames and MM-GBSA (the last three stages from the 10-ns simulation at pH 8.2). The number printed in a cell is the raw rank (1 = best); the colour is that rank relative to the number of candidates ranked in the same front (23 in front L, 10 in front M), because a given rank does not mean the same in pools of different size." title="" id="42" name="Picture"/>
+            <wp:docPr descr="Figure 6. Energy filter and ranking by stage. (A) PRODIGY ΔG of the initial pose of the 48 candidates against peptide length (ρ: Spearman). (B) Rank of each candidate within its front at each stage and the aggregate (mean rank) for the ten best candidates of each front among those that passed the gates; stages shown: Boltz-2 E2 confidence, paired Δ (E3), final peptide RMSD, PRODIGY on the pose, PRODIGY on trajectory frames and MM-GBSA (the last three stages from the 10-ns simulation at pH 8.2). The number printed in a cell is the raw rank (1 = best); the colour is that rank relative to the number of candidates ranked in the same front (23 in front L, 10 in front M), because a given rank does not mean the same in pools of different size." title="" id="40" name="Picture"/>
             <a:graphic>
               <a:graphicData uri="http://schemas.openxmlformats.org/drawingml/2006/picture">
                 <pic:pic>
                   <pic:nvPicPr>
-                    <pic:cNvPr descr="figures/final/Figure6_energy_ranking.png" id="43" name="Picture"/>
+                    <pic:cNvPr descr="figures/final/Figure6_energy_ranking.png" id="41" name="Picture"/>
                     <pic:cNvPicPr>
                       <a:picLocks noChangeArrowheads="1" noChangeAspect="1"/>
                     </pic:cNvPicPr>
                   </pic:nvPicPr>
                   <pic:blipFill>
-                    <a:blip r:embed="rId41"/>
+                    <a:blip r:embed="rId39"/>
                     <a:stretch>
                       <a:fillRect/>
                     </a:stretch>
@@ -5841,8 +5196,8 @@
         <w:t xml:space="preserve">Energy filter and ranking by stage. (A) PRODIGY ΔG of the initial pose of the 48 candidates against peptide length (ρ: Spearman). (B) Rank of each candidate within its front at each stage and the aggregate (mean rank) for the ten best candidates of each front among those that passed the gates; stages shown: Boltz-2 E2 confidence, paired Δ (E3), final peptide RMSD, PRODIGY on the pose, PRODIGY on trajectory frames and MM-GBSA (the last three stages from the 10-ns simulation at pH 8.2). The number printed in a cell is the raw rank (1 = best); the colour is that rank relative to the number of candidates ranked in the same front (23 in front L, 10 in front M), because a given rank does not mean the same in pools of different size.</w:t>
       </w:r>
     </w:p>
-    <w:bookmarkEnd w:id="44"/>
-    <w:bookmarkStart w:id="48" w:name="ph-8.2-versus-ph-10.0"/>
+    <w:bookmarkEnd w:id="42"/>
+    <w:bookmarkStart w:id="46" w:name="ph-8.2-versus-ph-10.0"/>
     <w:p>
       <w:pPr>
         <w:pStyle w:val="Heading3"/>
@@ -6130,18 +5485,18 @@
           <wp:inline>
             <wp:extent cx="5334000" cy="3704933"/>
             <wp:effectExtent b="0" l="0" r="0" t="0"/>
-            <wp:docPr descr="Figure 7. Comparison of the 48 simulations at pH 8.2 and pH 10.0 (one run per pH with different seeds). (A, B) Paired final anchor–Asp189 distance and second-half S1 occupancy at 5 Å (dotted lines: 4 Å and 0.70; Wilcoxon signed-rank test). (C–E) pH 8.2 against pH 10.0 for the final distance, MM-GBSA ΔG and PRODIGY ΔG on trajectory frames (dotted line: identity; ρ: Spearman correlation). Blue: front L; teal: front M; highlighted: NGGRPDAP, GGKPGEP, GQNDS and GGHSE." title="" id="46" name="Picture"/>
+            <wp:docPr descr="Figure 7. Comparison of the 48 simulations at pH 8.2 and pH 10.0 (one run per pH with different seeds). (A, B) Paired final anchor–Asp189 distance and second-half S1 occupancy at 5 Å (dotted lines: 4 Å and 0.70; Wilcoxon signed-rank test). (C–E) pH 8.2 against pH 10.0 for the final distance, MM-GBSA ΔG and PRODIGY ΔG on trajectory frames (dotted line: identity; ρ: Spearman correlation). Blue: front L; teal: front M; highlighted: NGGRPDAP, GGKPGEP, GQNDS and GGHSE." title="" id="44" name="Picture"/>
             <a:graphic>
               <a:graphicData uri="http://schemas.openxmlformats.org/drawingml/2006/picture">
                 <pic:pic>
                   <pic:nvPicPr>
-                    <pic:cNvPr descr="figures/final/Figure7_pH_comparison.png" id="47" name="Picture"/>
+                    <pic:cNvPr descr="figures/final/Figure7_pH_comparison.png" id="45" name="Picture"/>
                     <pic:cNvPicPr>
                       <a:picLocks noChangeArrowheads="1" noChangeAspect="1"/>
                     </pic:cNvPicPr>
                   </pic:nvPicPr>
                   <pic:blipFill>
-                    <a:blip r:embed="rId45"/>
+                    <a:blip r:embed="rId43"/>
                     <a:stretch>
                       <a:fillRect/>
                     </a:stretch>
@@ -6186,8 +5541,8 @@
         <w:t xml:space="preserve">Comparison of the 48 simulations at pH 8.2 and pH 10.0 (one run per pH with different seeds). (A, B) Paired final anchor–Asp189 distance and second-half S1 occupancy at 5 Å (dotted lines: 4 Å and 0.70; Wilcoxon signed-rank test). (C–E) pH 8.2 against pH 10.0 for the final distance, MM-GBSA ΔG and PRODIGY ΔG on trajectory frames (dotted line: identity; ρ: Spearman correlation). Blue: front L; teal: front M; highlighted: NGGRPDAP, GGKPGEP, GQNDS and GGHSE.</w:t>
       </w:r>
     </w:p>
-    <w:bookmarkEnd w:id="48"/>
-    <w:bookmarkStart w:id="52" w:name="candidate-peptides"/>
+    <w:bookmarkEnd w:id="46"/>
+    <w:bookmarkStart w:id="50" w:name="candidate-peptides"/>
     <w:p>
       <w:pPr>
         <w:pStyle w:val="Heading3"/>
@@ -7399,18 +6754,18 @@
           <wp:inline>
             <wp:extent cx="5334000" cy="3853030"/>
             <wp:effectExtent b="0" l="0" r="0" t="0"/>
-            <wp:docPr descr="Figure 8. Starting poses (Boltz-2) of the four shortlisted peptides in the active site. Peptide in cyan with the anchor residue (the one closest to the Asp189 carboxylate) in magenta; Asp189 in orange; His57 and Ser195 in green; the dotted line is the anchor–Asp189 distance; receptor shown as cartoon within 12 Å of the peptide. (A) NGGRPDAP (linear, A. gemmatalis). (B) GQNDS (linear, O. nubilalis). (C) GGHSE (cyclic, S. frugiperda). (D) GGKPGEP (cyclic, A. gemmatalis)." title="" id="50" name="Picture"/>
+            <wp:docPr descr="Figure 8. Starting poses (Boltz-2) of the four shortlisted peptides in the active site. Peptide in cyan with the anchor residue (the one closest to the Asp189 carboxylate) in magenta; Asp189 in orange; His57 and Ser195 in green; the dotted line is the anchor–Asp189 distance; receptor shown as cartoon within 12 Å of the peptide. (A) NGGRPDAP (linear, A. gemmatalis). (B) GQNDS (linear, O. nubilalis). (C) GGHSE (cyclic, S. frugiperda). (D) GGKPGEP (cyclic, A. gemmatalis)." title="" id="48" name="Picture"/>
             <a:graphic>
               <a:graphicData uri="http://schemas.openxmlformats.org/drawingml/2006/picture">
                 <pic:pic>
                   <pic:nvPicPr>
-                    <pic:cNvPr descr="figures/final/Figure8_candidate_poses.png" id="51" name="Picture"/>
+                    <pic:cNvPr descr="figures/final/Figure8_candidate_poses.png" id="49" name="Picture"/>
                     <pic:cNvPicPr>
                       <a:picLocks noChangeArrowheads="1" noChangeAspect="1"/>
                     </pic:cNvPicPr>
                   </pic:nvPicPr>
                   <pic:blipFill>
-                    <a:blip r:embed="rId49"/>
+                    <a:blip r:embed="rId47"/>
                     <a:stretch>
                       <a:fillRect/>
                     </a:stretch>
@@ -7514,9 +6869,9 @@
         </w:pict>
       </w:r>
     </w:p>
-    <w:bookmarkEnd w:id="52"/>
-    <w:bookmarkEnd w:id="53"/>
-    <w:bookmarkStart w:id="59" w:name="discussion"/>
+    <w:bookmarkEnd w:id="50"/>
+    <w:bookmarkEnd w:id="51"/>
+    <w:bookmarkStart w:id="57" w:name="discussion"/>
     <w:p>
       <w:pPr>
         <w:pStyle w:val="Heading2"/>
@@ -7525,7 +6880,7 @@
         <w:t xml:space="preserve">4 Discussion</w:t>
       </w:r>
     </w:p>
-    <w:bookmarkStart w:id="54" w:name="principal-findings"/>
+    <w:bookmarkStart w:id="52" w:name="principal-findings"/>
     <w:p>
       <w:pPr>
         <w:pStyle w:val="Heading3"/>
@@ -7566,8 +6921,8 @@
         <w:t xml:space="preserve">trypsin-like enzymes less than the soybean Kunitz inhibitor (Patarroyo-Vargas et al., 2020).</w:t>
       </w:r>
     </w:p>
-    <w:bookmarkEnd w:id="54"/>
-    <w:bookmarkStart w:id="55" w:name="what-the-scoring-ladder-supports"/>
+    <w:bookmarkEnd w:id="52"/>
+    <w:bookmarkStart w:id="53" w:name="what-the-scoring-ladder-supports"/>
     <w:p>
       <w:pPr>
         <w:pStyle w:val="Heading3"/>
@@ -7616,8 +6971,8 @@
         <w:t xml:space="preserve">A methodological point deserves emphasis: separate receptor and ligand molecules can be written to different periodic images of the box. In one of our systems the receptor–peptide center-of-mass distance reached 94.8 Å in a 116-Å box while the molecules were in contact in every frame. Any RMSD or contact analysis of protein–peptide simulations that does not correct for this reports displacement of the image as instability.</w:t>
       </w:r>
     </w:p>
-    <w:bookmarkEnd w:id="55"/>
-    <w:bookmarkStart w:id="56" w:name="Xf0b329abf4fe4bf48ca7175e99b2bc0e7100228"/>
+    <w:bookmarkEnd w:id="53"/>
+    <w:bookmarkStart w:id="54" w:name="Xf0b329abf4fe4bf48ca7175e99b2bc0e7100228"/>
     <w:p>
       <w:pPr>
         <w:pStyle w:val="Heading3"/>
@@ -7709,8 +7064,8 @@
         <w:t xml:space="preserve">(Severiche-Castro et al., 2026). What this work adds is an explicit, rule-based non-cleavability requirement and a calibrated scoring ladder; it adds no evidence of higher affinity. Because Ki values have been measured for GORE2 and for loop- and pro-region-derived peptides (de Almeida Barros et al., 2021; Paulo et al., 2026; Mariano et al., 2026), GORE2 is the natural positive control: a candidate is of interest only if its Ki, measured under the same conditions, falls below the millimolar range of these peptides or if it persists longer in a midgut extract.</w:t>
       </w:r>
     </w:p>
-    <w:bookmarkEnd w:id="56"/>
-    <w:bookmarkStart w:id="57" w:name="limitations"/>
+    <w:bookmarkEnd w:id="54"/>
+    <w:bookmarkStart w:id="55" w:name="limitations"/>
     <w:p>
       <w:pPr>
         <w:pStyle w:val="Heading3"/>
@@ -7785,8 +7140,8 @@
         <w:t xml:space="preserve">with a root-mean-square fluctuation of 0.2% and negligible drift. (vii) The S1 occupancy criterion has no demonstrated specificity: every decoy of the calibration satisfied it, and the shuffled-sequence and anchor-swap controls did not separate sequence from starting pose (Section 3.5); the anchor is defined post hoc as the residue with the smallest mean distance. (viii) A single Boltz-2 prediction is a noisy ranker (ρ = 0.57 for identical input), and the shuffled controls of E3 are weak for glycine-rich sequences. (ix) The calibration systems were simulated for 2 ns from one predicted structure each, with ligands much larger than the candidates. (x) MM-GBSA and PRODIGY did not separate inhibitors from decoys, so the energy ranking is a coarse screen.</w:t>
       </w:r>
     </w:p>
-    <w:bookmarkEnd w:id="57"/>
-    <w:bookmarkStart w:id="58" w:name="outlook"/>
+    <w:bookmarkEnd w:id="55"/>
+    <w:bookmarkStart w:id="56" w:name="outlook"/>
     <w:p>
       <w:pPr>
         <w:pStyle w:val="Heading3"/>
@@ -7826,27 +7181,27 @@
         </w:pict>
       </w:r>
     </w:p>
+    <w:bookmarkEnd w:id="56"/>
+    <w:bookmarkEnd w:id="57"/>
+    <w:bookmarkStart w:id="58" w:name="conclusion"/>
+    <w:p>
+      <w:pPr>
+        <w:pStyle w:val="Heading2"/>
+      </w:pPr>
+      <w:r>
+        <w:t xml:space="preserve">5 Conclusion</w:t>
+      </w:r>
+    </w:p>
+    <w:p>
+      <w:pPr>
+        <w:pStyle w:val="FirstParagraph"/>
+      </w:pPr>
+      <w:r>
+        <w:t xml:space="preserve">Natural inhibitors served as templates and calibration standards for a pipeline that takes eight lepidopteran digestive trypsins to a ranked set of short, non-cleavable peptides. Boltz-2 supports pairwise comparisons; MM-GBSA and PRODIGY only order candidates against the same receptor; and 10-ns S1 occupancy follows the starting pose, so it does not by itself indicate binding; the occupancy of nine candidates differed by more than 0.5 between pH 8.2 and pH 10.0, in either direction without a net shift, and repeats at the same pH differed by more than 0.5 in three of 16 pairs. The four shortlisted peptides (NGGRPDAP, GQNDS, GGHSE, GGKPGEP) survived the filters available and carry no claim of selectivity or activity. The decisive tests are enzymatic.</w:t>
+      </w:r>
+    </w:p>
     <w:bookmarkEnd w:id="58"/>
-    <w:bookmarkEnd w:id="59"/>
-    <w:bookmarkStart w:id="60" w:name="conclusion"/>
-    <w:p>
-      <w:pPr>
-        <w:pStyle w:val="Heading2"/>
-      </w:pPr>
-      <w:r>
-        <w:t xml:space="preserve">5 Conclusion</w:t>
-      </w:r>
-    </w:p>
-    <w:p>
-      <w:pPr>
-        <w:pStyle w:val="FirstParagraph"/>
-      </w:pPr>
-      <w:r>
-        <w:t xml:space="preserve">Natural inhibitors served as templates and calibration standards for a pipeline that takes eight lepidopteran digestive trypsins to a ranked set of short, non-cleavable peptides. Boltz-2 supports pairwise comparisons; MM-GBSA and PRODIGY only order candidates against the same receptor; and 10-ns S1 occupancy follows the starting pose, so it does not by itself indicate binding; the occupancy of nine candidates differed by more than 0.5 between pH 8.2 and pH 10.0, in either direction without a net shift, and repeats at the same pH differed by more than 0.5 in three of 16 pairs. The four shortlisted peptides (NGGRPDAP, GQNDS, GGHSE, GGKPGEP) survived the filters available and carry no claim of selectivity or activity. The decisive tests are enzymatic.</w:t>
-      </w:r>
-    </w:p>
-    <w:bookmarkEnd w:id="60"/>
-    <w:bookmarkStart w:id="61" w:name="data-availability-statement"/>
+    <w:bookmarkStart w:id="59" w:name="data-availability-statement"/>
     <w:p>
       <w:pPr>
         <w:pStyle w:val="Heading2"/>
@@ -7872,8 +7227,8 @@
         <w:t xml:space="preserve">PENDING: confirm repository visibility and archival DOI (for example Zenodo) before submission.</w:t>
       </w:r>
     </w:p>
-    <w:bookmarkEnd w:id="61"/>
-    <w:bookmarkStart w:id="62" w:name="ethics-statement"/>
+    <w:bookmarkEnd w:id="59"/>
+    <w:bookmarkStart w:id="60" w:name="ethics-statement"/>
     <w:p>
       <w:pPr>
         <w:pStyle w:val="Heading2"/>
@@ -7890,8 +7245,8 @@
         <w:t xml:space="preserve">Not applicable. This is a computational study; it involved no animals, human participants or personal data.</w:t>
       </w:r>
     </w:p>
-    <w:bookmarkEnd w:id="62"/>
-    <w:bookmarkStart w:id="63" w:name="author-contributions"/>
+    <w:bookmarkEnd w:id="60"/>
+    <w:bookmarkStart w:id="61" w:name="author-contributions"/>
     <w:p>
       <w:pPr>
         <w:pStyle w:val="Heading2"/>
@@ -7911,8 +7266,8 @@
         <w:t xml:space="preserve">PENDING: to be completed by the authors (CRediT roles).</w:t>
       </w:r>
     </w:p>
-    <w:bookmarkEnd w:id="63"/>
-    <w:bookmarkStart w:id="64" w:name="funding"/>
+    <w:bookmarkEnd w:id="61"/>
+    <w:bookmarkStart w:id="62" w:name="funding"/>
     <w:p>
       <w:pPr>
         <w:pStyle w:val="Heading2"/>
@@ -7932,8 +7287,8 @@
         <w:t xml:space="preserve">PENDING: to be completed by the authors.</w:t>
       </w:r>
     </w:p>
-    <w:bookmarkEnd w:id="64"/>
-    <w:bookmarkStart w:id="65" w:name="acknowledgments"/>
+    <w:bookmarkEnd w:id="62"/>
+    <w:bookmarkStart w:id="63" w:name="acknowledgments"/>
     <w:p>
       <w:pPr>
         <w:pStyle w:val="Heading2"/>
@@ -7953,8 +7308,8 @@
         <w:t xml:space="preserve">PENDING: to be completed by the authors.</w:t>
       </w:r>
     </w:p>
-    <w:bookmarkEnd w:id="65"/>
-    <w:bookmarkStart w:id="66" w:name="conflict-of-interest"/>
+    <w:bookmarkEnd w:id="63"/>
+    <w:bookmarkStart w:id="64" w:name="conflict-of-interest"/>
     <w:p>
       <w:pPr>
         <w:pStyle w:val="Heading2"/>
@@ -7986,8 +7341,8 @@
         <w:t xml:space="preserve">“The author(s) declared that this work was conducted in the absence of any commercial or financial relationships that could be construed as a potential conflict of interest.”</w:t>
       </w:r>
     </w:p>
-    <w:bookmarkEnd w:id="66"/>
-    <w:bookmarkStart w:id="67" w:name="generative-ai-statement"/>
+    <w:bookmarkEnd w:id="64"/>
+    <w:bookmarkStart w:id="65" w:name="generative-ai-statement"/>
     <w:p>
       <w:pPr>
         <w:pStyle w:val="Heading2"/>
@@ -8019,8 +7374,8 @@
         <w:t xml:space="preserve">“The author(s) declared that generative AI was used in the creation of this manuscript. During the preparation of this manuscript, the authors used Claude (Anthropic) to write analysis scripts, generate figures, and draft and translate text. The authors verified all numerical results against the output files, verified every reference against Crossref or PubMed, and take full responsibility for the content.”</w:t>
       </w:r>
     </w:p>
-    <w:bookmarkEnd w:id="67"/>
-    <w:bookmarkStart w:id="68" w:name="supplementary-material"/>
+    <w:bookmarkEnd w:id="65"/>
+    <w:bookmarkStart w:id="66" w:name="supplementary-material"/>
     <w:p>
       <w:pPr>
         <w:pStyle w:val="Heading2"/>
@@ -8044,8 +7399,8 @@
         </w:pict>
       </w:r>
     </w:p>
-    <w:bookmarkEnd w:id="68"/>
-    <w:bookmarkStart w:id="69" w:name="references"/>
+    <w:bookmarkEnd w:id="66"/>
+    <w:bookmarkStart w:id="67" w:name="references"/>
     <w:p>
       <w:pPr>
         <w:pStyle w:val="Heading2"/>
@@ -8099,7 +7454,7 @@
         <w:pStyle w:val="BodyText"/>
       </w:pPr>
       <w:r>
-        <w:t xml:space="preserve">Bussi G, Donadio D, Parrinello M (2007). Canonical sampling through velocity rescaling. The Journal of Chemical Physics 126, 014101. doi: 10.1063/1.2408420</w:t>
+        <w:t xml:space="preserve">Bürgi HB, Dunitz JD, Shefter E (1973). Geometrical reaction coordinates. II. Nucleophilic addition to a carbonyl group. Journal of the American Chemical Society 95, 5065-5067. doi: 10.1021/ja00796a058</w:t>
       </w:r>
     </w:p>
     <w:p>
@@ -8107,7 +7462,7 @@
         <w:pStyle w:val="BodyText"/>
       </w:pPr>
       <w:r>
-        <w:t xml:space="preserve">Bürgi HB, Dunitz JD, Shefter E (1973). Geometrical reaction coordinates. II. Nucleophilic addition to a carbonyl group. Journal of the American Chemical Society 95, 5065-5067. doi: 10.1021/ja00796a058</w:t>
+        <w:t xml:space="preserve">Carpane PD, Llebaria M, Nascimento AF, Vivan L (2022). Feeding injury of major lepidopteran soybean pests in South America. PLOS ONE 17, e0271084. doi: 10.1371/journal.pone.0271084</w:t>
       </w:r>
     </w:p>
     <w:p>
@@ -8115,7 +7470,7 @@
         <w:pStyle w:val="BodyText"/>
       </w:pPr>
       <w:r>
-        <w:t xml:space="preserve">Carpane PD, Llebaria M, Nascimento AF, Vivan L (2022). Feeding injury of major lepidopteran soybean pests in South America. PLOS ONE 17, e0271084. doi: 10.1371/journal.pone.0271084</w:t>
+        <w:t xml:space="preserve">da Silva Júnior NR, Vital CE, de Almeida Barros R, Faustino VA, Monteiro LP, Barros E, et al. (2020). Intestinal proteolytic profile changes during larval development of Anticarsia gemmatalis caterpillars. Archives of Insect Biochemistry and Physiology 103, e21631. doi: 10.1002/arch.21631</w:t>
       </w:r>
     </w:p>
     <w:p>
@@ -8123,7 +7478,7 @@
         <w:pStyle w:val="BodyText"/>
       </w:pPr>
       <w:r>
-        <w:t xml:space="preserve">Cock PJA, Antao T, Chang JT, Chapman BA, Cox CJ, Dalke A, et al. (2009). Biopython: freely available Python tools for computational molecular biology and bioinformatics. Bioinformatics 25, 1422-1423. doi: 10.1093/bioinformatics/btp163</w:t>
+        <w:t xml:space="preserve">Dauparas J, Anishchenko I, Bennett N, Bai H, Ragotte RJ, Milles LF, et al. (2022). Robust deep learning–based protein sequence design using ProteinMPNN. Science 378, 49-56. doi: 10.1126/science.add2187</w:t>
       </w:r>
     </w:p>
     <w:p>
@@ -8131,7 +7486,7 @@
         <w:pStyle w:val="BodyText"/>
       </w:pPr>
       <w:r>
-        <w:t xml:space="preserve">da Silva Júnior NR, Vital CE, de Almeida Barros R, Faustino VA, Monteiro LP, Barros E, et al. (2020). Intestinal proteolytic profile changes during larval development of Anticarsia gemmatalis caterpillars. Archives of Insect Biochemistry and Physiology 103, e21631. doi: 10.1002/arch.21631</w:t>
+        <w:t xml:space="preserve">de Almeida Barros R, Meriño-Cabrera Y, Vital CE, da Silva Júnior NR, de Oliveira CN, Lessa Barbosa S, et al. (2021). Small peptides inhibit gut trypsin-like proteases and impair Anticarsia gemmatalis (Lepidoptera: Noctuidae) survival and development. Pest Management Science 77, 1714-1723. doi: 10.1002/ps.6191</w:t>
       </w:r>
     </w:p>
     <w:p>
@@ -8139,7 +7494,7 @@
         <w:pStyle w:val="BodyText"/>
       </w:pPr>
       <w:r>
-        <w:t xml:space="preserve">Dauparas J, Anishchenko I, Bennett N, Bai H, Ragotte RJ, Milles LF, et al. (2022). Robust deep learning–based protein sequence design using ProteinMPNN. Science 378, 49-56. doi: 10.1126/science.add2187</w:t>
+        <w:t xml:space="preserve">de Almeida Barros R, Meriño-Cabrera Y, Castro JS, da Silva Junior NR, de Oliveira JVA, Schultz H, et al. (2022a). Bovine pancreatic trypsin inhibitor and soybean Kunitz trypsin inhibitor: Differential effects on proteases and larval development of the soybean pest Anticarsia gemmatalis (Lepidoptera: Noctuidae). Pesticide Biochemistry and Physiology 187, 105188. doi: 10.1016/j.pestbp.2022.105188</w:t>
       </w:r>
     </w:p>
     <w:p>
@@ -8147,7 +7502,7 @@
         <w:pStyle w:val="BodyText"/>
       </w:pPr>
       <w:r>
-        <w:t xml:space="preserve">de Almeida Barros R, Meriño-Cabrera Y, Vital CE, da Silva Júnior NR, de Oliveira CN, Lessa Barbosa S, et al. (2021). Small peptides inhibit gut trypsin-like proteases and impair Anticarsia gemmatalis (Lepidoptera: Noctuidae) survival and development. Pest Management Science 77, 1714-1723. doi: 10.1002/ps.6191</w:t>
+        <w:t xml:space="preserve">de Almeida Barros R, Meriño-Cabrera Y, Severiche Castro JG, Rodrigues da Silva Júnior N, Schultz H, de Andrade RJ, et al. (2022b). Inhibition constant and stability of tripeptide inhibitors of gut trypsin-like enzyme of the soybean pest Anticarsia gemmatalis. Archives of Insect Biochemistry and Physiology 110, e21887. doi: 10.1002/arch.21887</w:t>
       </w:r>
     </w:p>
     <w:p>
@@ -8155,7 +7510,7 @@
         <w:pStyle w:val="BodyText"/>
       </w:pPr>
       <w:r>
-        <w:t xml:space="preserve">de Almeida Barros R, Meriño-Cabrera Y, Castro JS, da Silva Junior NR, de Oliveira JVA, Schultz H, et al. (2022a). Bovine pancreatic trypsin inhibitor and soybean Kunitz trypsin inhibitor: Differential effects on proteases and larval development of the soybean pest Anticarsia gemmatalis (Lepidoptera: Noctuidae). Pesticide Biochemistry and Physiology 187, 105188. doi: 10.1016/j.pestbp.2022.105188</w:t>
+        <w:t xml:space="preserve">Dolinsky TJ, Czodrowski P, Li H, Nielsen JE, Jensen JH, Klebe G, et al. (2007). PDB2PQR: expanding and upgrading automated preparation of biomolecular structures for molecular simulations. Nucleic Acids Research 35, W522-W525. doi: 10.1093/nar/gkm276</w:t>
       </w:r>
     </w:p>
     <w:p>
@@ -8163,7 +7518,7 @@
         <w:pStyle w:val="BodyText"/>
       </w:pPr>
       <w:r>
-        <w:t xml:space="preserve">de Almeida Barros R, Meriño-Cabrera Y, Severiche Castro JG, Rodrigues da Silva Júnior N, Schultz H, de Andrade RJ, et al. (2022b). Inhibition constant and stability of tripeptide inhibitors of gut trypsin-like enzyme of the soybean pest Anticarsia gemmatalis. Archives of Insect Biochemistry and Physiology 110, e21887. doi: 10.1002/arch.21887</w:t>
+        <w:t xml:space="preserve">Dow JAT (1992). pH gradients in lepidopteran midgut. Journal of Experimental Biology 172, 355-375. doi: 10.1242/jeb.172.1.355</w:t>
       </w:r>
     </w:p>
     <w:p>
@@ -8171,7 +7526,7 @@
         <w:pStyle w:val="BodyText"/>
       </w:pPr>
       <w:r>
-        <w:t xml:space="preserve">Dolinsky TJ, Czodrowski P, Li H, Nielsen JE, Jensen JH, Klebe G, et al. (2007). PDB2PQR: expanding and upgrading automated preparation of biomolecular structures for molecular simulations. Nucleic Acids Research 35, W522-W525. doi: 10.1093/nar/gkm276</w:t>
+        <w:t xml:space="preserve">Gasteiger E, Hoogland C, Gattiker A, Duvaud S, Wilkins MR, Appel RD, et al. (2005). Protein Identification and Analysis Tools on the ExPASy Server. The Proteomics Protocols Handbook , 571-607. doi: 10.1385/1-59259-890-0:571</w:t>
       </w:r>
     </w:p>
     <w:p>
@@ -8179,7 +7534,7 @@
         <w:pStyle w:val="BodyText"/>
       </w:pPr>
       <w:r>
-        <w:t xml:space="preserve">Dow JAT (1992). pH gradients in lepidopteran midgut. Journal of Experimental Biology 172, 355-375. doi: 10.1242/jeb.172.1.355</w:t>
+        <w:t xml:space="preserve">Genheden S, Ryde U (2015). The MM/PBSA and MM/GBSA methods to estimate ligand-binding affinities. Expert Opinion on Drug Discovery 10, 449-461. doi: 10.1517/17460441.2015.1032936</w:t>
       </w:r>
     </w:p>
     <w:p>
@@ -8187,7 +7542,7 @@
         <w:pStyle w:val="BodyText"/>
       </w:pPr>
       <w:r>
-        <w:t xml:space="preserve">Essmann U, Perera L, Berkowitz ML, Darden T, Lee H, Pedersen LG (1995). A smooth particle mesh Ewald method. The Journal of Chemical Physics 103, 8577-8593. doi: 10.1063/1.470117</w:t>
+        <w:t xml:space="preserve">Hedstrom L (2002). Serine Protease Mechanism and Specificity. Chemical Reviews 102, 4501-4524. doi: 10.1021/cr000033x</w:t>
       </w:r>
     </w:p>
     <w:p>
@@ -8195,7 +7550,7 @@
         <w:pStyle w:val="BodyText"/>
       </w:pPr>
       <w:r>
-        <w:t xml:space="preserve">Gasteiger E, Hoogland C, Gattiker A, Duvaud S, Wilkins MR, Appel RD, et al. (2005). Protein Identification and Analysis Tools on the ExPASy Server. The Proteomics Protocols Handbook , 571-607. doi: 10.1385/1-59259-890-0:571</w:t>
+        <w:t xml:space="preserve">Helland R, Otlewski J, Sundheim O, Dadlez M, Smalås AO (1999). The crystal structures of the complexes between bovine β-trypsin and ten P1 variants of BPTI. Journal of Molecular Biology 287, 923-942. doi: 10.1006/jmbi.1999.2654</w:t>
       </w:r>
     </w:p>
     <w:p>
@@ -8203,7 +7558,7 @@
         <w:pStyle w:val="BodyText"/>
       </w:pPr>
       <w:r>
-        <w:t xml:space="preserve">Genheden S, Ryde U (2015). The MM/PBSA and MM/GBSA methods to estimate ligand-binding affinities. Expert Opinion on Drug Discovery 10, 449-461. doi: 10.1517/17460441.2015.1032936</w:t>
+        <w:t xml:space="preserve">Hou T, Wang J, Li Y, Wang W (2011). Assessing the Performance of the MM/PBSA and MM/GBSA Methods. 1. The Accuracy of Binding Free Energy Calculations Based on Molecular Dynamics Simulations. Journal of Chemical Information and Modeling 51, 69-82. doi: 10.1021/ci100275a</w:t>
       </w:r>
     </w:p>
     <w:p>
@@ -8211,7 +7566,7 @@
         <w:pStyle w:val="BodyText"/>
       </w:pPr>
       <w:r>
-        <w:t xml:space="preserve">Gowers R, Linke M, Barnoud J, Reddy T, Melo M, Seyler S, et al. (2016). MDAnalysis: A Python Package for the Rapid Analysis of Molecular Dynamics Simulations. Proceedings of the Python in Science Conference , 98-105. doi: 10.25080/majora-629e541a-00e</w:t>
+        <w:t xml:space="preserve">Huang J, MacKerell AD (2013). CHARMM36 all-atom additive protein force field: Validation based on comparison to NMR data. Journal of Computational Chemistry 34, 2135-2145. doi: 10.1002/jcc.23354</w:t>
       </w:r>
     </w:p>
     <w:p>
@@ -8219,7 +7574,7 @@
         <w:pStyle w:val="BodyText"/>
       </w:pPr>
       <w:r>
-        <w:t xml:space="preserve">Hedstrom L (2002). Serine Protease Mechanism and Specificity. Chemical Reviews 102, 4501-4524. doi: 10.1021/cr000033x</w:t>
+        <w:t xml:space="preserve">Hur S, Bruice TC (2003). The near attack conformation approach to the study of the chorismate to prephenate reaction. Proceedings of the National Academy of Sciences 100, 12015-12020. doi: 10.1073/pnas.1534873100</w:t>
       </w:r>
     </w:p>
     <w:p>
@@ -8227,7 +7582,7 @@
         <w:pStyle w:val="BodyText"/>
       </w:pPr>
       <w:r>
-        <w:t xml:space="preserve">Helland R, Otlewski J, Sundheim O, Dadlez M, Smalås AO (1999). The crystal structures of the complexes between bovine β-trypsin and ten P1 variants of BPTI. Journal of Molecular Biology 287, 923-942. doi: 10.1006/jmbi.1999.2654</w:t>
+        <w:t xml:space="preserve">Johnson KS, Felton GW (1996). Physiological and dietary influences on midgut redox conditions in generalist lepidopteran larvae. Journal of Insect Physiology 42, 191-198. doi: 10.1016/0022-1910(95)00096-8</w:t>
       </w:r>
     </w:p>
     <w:p>
@@ -8235,7 +7590,7 @@
         <w:pStyle w:val="BodyText"/>
       </w:pPr>
       <w:r>
-        <w:t xml:space="preserve">Hou T, Wang J, Li Y, Wang W (2011). Assessing the Performance of the MM/PBSA and MM/GBSA Methods. 1. The Accuracy of Binding Free Energy Calculations Based on Molecular Dynamics Simulations. Journal of Chemical Information and Modeling 51, 69-82. doi: 10.1021/ci100275a</w:t>
+        <w:t xml:space="preserve">Jongsma MA, Bakker PL, Peters J, Bosch D, Stiekema WJ (1995). Adaptation of Spodoptera exigua larvae to plant proteinase inhibitors by induction of gut proteinase activity insensitive to inhibition. Proceedings of the National Academy of Sciences 92, 8041-8045. doi: 10.1073/pnas.92.17.8041</w:t>
       </w:r>
     </w:p>
     <w:p>
@@ -8243,7 +7598,7 @@
         <w:pStyle w:val="BodyText"/>
       </w:pPr>
       <w:r>
-        <w:t xml:space="preserve">Huang J, MacKerell AD (2013). CHARMM36 all-atom additive protein force field: Validation based on comparison to NMR data. Journal of Computational Chemistry 34, 2135-2145. doi: 10.1002/jcc.23354</w:t>
+        <w:t xml:space="preserve">Jongsma MA, Bolter C (1997). The adaptation of insects to plant protease inhibitors. Journal of Insect Physiology 43, 885-895. doi: 10.1016/s0022-1910(97)00040-1</w:t>
       </w:r>
     </w:p>
     <w:p>
@@ -8251,7 +7606,7 @@
         <w:pStyle w:val="BodyText"/>
       </w:pPr>
       <w:r>
-        <w:t xml:space="preserve">Hur S, Bruice TC (2003). The near attack conformation approach to the study of the chorismate to prephenate reaction. Proceedings of the National Academy of Sciences 100, 12015-12020. doi: 10.1073/pnas.1534873100</w:t>
+        <w:t xml:space="preserve">Jorgensen WL, Chandrasekhar J, Madura JD, Impey RW, Klein ML (1983). Comparison of simple potential functions for simulating liquid water. The Journal of Chemical Physics 79, 926-935. doi: 10.1063/1.445869</w:t>
       </w:r>
     </w:p>
     <w:p>
@@ -8259,7 +7614,7 @@
         <w:pStyle w:val="BodyText"/>
       </w:pPr>
       <w:r>
-        <w:t xml:space="preserve">Johnson KS, Felton GW (1996). Physiological and dietary influences on midgut redox conditions in generalist lepidopteran larvae. Journal of Insect Physiology 42, 191-198. doi: 10.1016/0022-1910(95)00096-8</w:t>
+        <w:t xml:space="preserve">Jumper J, Evans R, Pritzel A, Green T, Figurnov M, Ronneberger O, et al. (2021). Highly accurate protein structure prediction with AlphaFold. Nature 596, 583-589. doi: 10.1038/s41586-021-03819-2</w:t>
       </w:r>
     </w:p>
     <w:p>
@@ -8267,7 +7622,7 @@
         <w:pStyle w:val="BodyText"/>
       </w:pPr>
       <w:r>
-        <w:t xml:space="preserve">Jongsma MA, Bakker PL, Peters J, Bosch D, Stiekema WJ (1995). Adaptation of Spodoptera exigua larvae to plant proteinase inhibitors by induction of gut proteinase activity insensitive to inhibition. Proceedings of the National Academy of Sciences 92, 8041-8045. doi: 10.1073/pnas.92.17.8041</w:t>
+        <w:t xml:space="preserve">Júnior NRDS, Santos EGDD, Paulo DGS, Meriño-Cabrera Y, Pinto IDPA, Summy MJ, et al. (2026). Integrated Transcriptomic and Physiological Analyses Reveal Disruption of Digestive Homeostasis Induced by Protease Inhibitors in Anticarsia gemmatalis Caterpillars. Archives of Insect Biochemistry and Physiology 123, e70223. doi: 10.1002/arch.70223</w:t>
       </w:r>
     </w:p>
     <w:p>
@@ -8275,7 +7630,7 @@
         <w:pStyle w:val="BodyText"/>
       </w:pPr>
       <w:r>
-        <w:t xml:space="preserve">Jongsma MA, Bolter C (1997). The adaptation of insects to plant protease inhibitors. Journal of Insect Physiology 43, 885-895. doi: 10.1016/s0022-1910(97)00040-1</w:t>
+        <w:t xml:space="preserve">Karna N, Łęgowska A, Malicki S, Dębowski D, Golik P, Gitlin A, et al. (2015). Investigation of Serine-Proteinase-Catalyzed Peptide Splicing in Analogues of Sunflower Trypsin Inhibitor 1 (SFTI-1). ChemBioChem 16, 2036-2045. doi: 10.1002/cbic.201500296</w:t>
       </w:r>
     </w:p>
     <w:p>
@@ -8283,7 +7638,7 @@
         <w:pStyle w:val="BodyText"/>
       </w:pPr>
       <w:r>
-        <w:t xml:space="preserve">Jorgensen WL, Chandrasekhar J, Madura JD, Impey RW, Klein ML (1983). Comparison of simple potential functions for simulating liquid water. The Journal of Chemical Physics 79, 926-935. doi: 10.1063/1.445869</w:t>
+        <w:t xml:space="preserve">Karumbaiah L, Oppert B, Jurat-Fuentes JL, Adang MJ (2007). Analysis of midgut proteinases from Bacillus thuringiensis-susceptible and -resistant Heliothis virescens (Lepidoptera: Noctuidae). Comparative Biochemistry and Physiology Part B: Biochemistry and Molecular Biology 146, 139-146. doi: 10.1016/j.cbpb.2006.10.104</w:t>
       </w:r>
     </w:p>
     <w:p>
@@ -8291,7 +7646,7 @@
         <w:pStyle w:val="BodyText"/>
       </w:pPr>
       <w:r>
-        <w:t xml:space="preserve">Jumper J, Evans R, Pritzel A, Green T, Figurnov M, Ronneberger O, et al. (2021). Highly accurate protein structure prediction with AlphaFold. Nature 596, 583-589. doi: 10.1038/s41586-021-03819-2</w:t>
+        <w:t xml:space="preserve">Kelly C, Laskowski Jr. M, Qasim M (2005). The Role of Scaffolding in Standard Mechanism Serine Proteinase Inhibitors. Protein &amp; Peptide Letters 12, 465-471. doi: 10.2174/0929866054395383</w:t>
       </w:r>
     </w:p>
     <w:p>
@@ -8299,7 +7654,7 @@
         <w:pStyle w:val="BodyText"/>
       </w:pPr>
       <w:r>
-        <w:t xml:space="preserve">Júnior NRDS, Santos EGDD, Paulo DGS, Meriño-Cabrera Y, Pinto IDPA, Summy MJ, et al. (2026). Integrated Transcriptomic and Physiological Analyses Reveal Disruption of Digestive Homeostasis Induced by Protease Inhibitors in Anticarsia gemmatalis Caterpillars. Archives of Insect Biochemistry and Physiology 123, e70223. doi: 10.1002/arch.70223</w:t>
+        <w:t xml:space="preserve">Knapp B, Ospina L, Deane CM (2018). Avoiding false positive conclusions in molecular simulation: the importance of replicas. Journal of Chemical Theory and Computation 14, 6127-6138. doi: 10.1021/acs.jctc.8b00391</w:t>
       </w:r>
     </w:p>
     <w:p>
@@ -8307,7 +7662,7 @@
         <w:pStyle w:val="BodyText"/>
       </w:pPr>
       <w:r>
-        <w:t xml:space="preserve">Karna N, Łęgowska A, Malicki S, Dębowski D, Golik P, Gitlin A, et al. (2015). Investigation of Serine-Proteinase-Catalyzed Peptide Splicing in Analogues of Sunflower Trypsin Inhibitor 1 (SFTI-1). ChemBioChem 16, 2036-2045. doi: 10.1002/cbic.201500296</w:t>
+        <w:t xml:space="preserve">Kuwar SS, Pauchet Y, Vogel H, Heckel DG (2015). Adaptive regulation of digestive serine proteases in the larval midgut of Helicoverpa armigera in response to a plant protease inhibitor. Insect Biochemistry and Molecular Biology 59, 18-29. doi: 10.1016/j.ibmb.2015.01.016</w:t>
       </w:r>
     </w:p>
     <w:p>
@@ -8315,7 +7670,7 @@
         <w:pStyle w:val="BodyText"/>
       </w:pPr>
       <w:r>
-        <w:t xml:space="preserve">Karumbaiah L, Oppert B, Jurat-Fuentes JL, Adang MJ (2007). Analysis of midgut proteinases from Bacillus thuringiensis-susceptible and -resistant Heliothis virescens (Lepidoptera: Noctuidae). Comparative Biochemistry and Physiology Part B: Biochemistry and Molecular Biology 146, 139-146. doi: 10.1016/j.cbpb.2006.10.104</w:t>
+        <w:t xml:space="preserve">Laskowski M, Kato I (1980). Protein Inhibitors of Proteinases. Annual Review of Biochemistry 49, 593-626. doi: 10.1146/annurev.bi.49.070180.003113</w:t>
       </w:r>
     </w:p>
     <w:p>
@@ -8323,7 +7678,7 @@
         <w:pStyle w:val="BodyText"/>
       </w:pPr>
       <w:r>
-        <w:t xml:space="preserve">Kelly C, Laskowski Jr. M, Qasim M (2005). The Role of Scaffolding in Standard Mechanism Serine Proteinase Inhibitors. Protein &amp; Peptide Letters 12, 465-471. doi: 10.2174/0929866054395383</w:t>
+        <w:t xml:space="preserve">Laskowski M, Qasim M (2000). What can the structures of enzyme-inhibitor complexes tell us about the structures of enzyme substrate complexes?. Biochimica et Biophysica Acta (BBA) - Protein Structure and Molecular Enzymology 1477, 324-337. doi: 10.1016/s0167-4838(99)00284-8</w:t>
       </w:r>
     </w:p>
     <w:p>
@@ -8331,7 +7686,7 @@
         <w:pStyle w:val="BodyText"/>
       </w:pPr>
       <w:r>
-        <w:t xml:space="preserve">Knapp B, Ospina L, Deane CM (2018). Avoiding false positive conclusions in molecular simulation: the importance of replicas. Journal of Chemical Theory and Computation 14, 6127-6138. doi: 10.1021/acs.jctc.8b00391</w:t>
+        <w:t xml:space="preserve">Li Z, Yuan Y, Hu K, Pan P, He F (2026). Benchmarking confidence estimation and rescoring for cyclic peptide–protein complex predictions. bioRxiv. doi: 10.64898/2026.08.20.746104</w:t>
       </w:r>
     </w:p>
     <w:p>
@@ -8339,7 +7694,7 @@
         <w:pStyle w:val="BodyText"/>
       </w:pPr>
       <w:r>
-        <w:t xml:space="preserve">Kuwar SS, Pauchet Y, Vogel H, Heckel DG (2015). Adaptive regulation of digestive serine proteases in the larval midgut of Helicoverpa armigera in response to a plant protease inhibitor. Insect Biochemistry and Molecular Biology 59, 18-29. doi: 10.1016/j.ibmb.2015.01.016</w:t>
+        <w:t xml:space="preserve">Lomate PR, Dewangan V, Mahajan NS, Kumar Y, Kulkarni A, Wang L, et al. (2018). Integrated Transcriptomic and Proteomic Analyses Suggest the Participation of Endogenous Protease Inhibitors in the Regulation of Protease Gene Expression in Helicoverpa armigera. Molecular &amp; Cellular Proteomics 17, 1324-1336. doi: 10.1074/mcp.ra117.000533</w:t>
       </w:r>
     </w:p>
     <w:p>
@@ -8347,7 +7702,7 @@
         <w:pStyle w:val="BodyText"/>
       </w:pPr>
       <w:r>
-        <w:t xml:space="preserve">Laskowski M, Kato I (1980). Protein Inhibitors of Proteinases. Annual Review of Biochemistry 49, 593-626. doi: 10.1146/annurev.bi.49.070180.003113</w:t>
+        <w:t xml:space="preserve">Luckett S, Garcia R, Barker J, Konarev A, Shewry P, Clarke A, et al. (1999). High-resolution structure of a potent, cyclic proteinase inhibitor from sunflower seeds. Journal of Molecular Biology 290, 525-533. doi: 10.1006/jmbi.1999.2891</w:t>
       </w:r>
     </w:p>
     <w:p>
@@ -8355,7 +7710,7 @@
         <w:pStyle w:val="BodyText"/>
       </w:pPr>
       <w:r>
-        <w:t xml:space="preserve">Laskowski M, Qasim M (2000). What can the structures of enzyme-inhibitor complexes tell us about the structures of enzyme substrate complexes?. Biochimica et Biophysica Acta (BBA) - Protein Structure and Molecular Enzymology 1477, 324-337. doi: 10.1016/s0167-4838(99)00284-8</w:t>
+        <w:t xml:space="preserve">Mariano GA, de Oliveira JVA, Andrade RJD, Paulo DGS, Cabrera YBM, Santos EGDD, et al. (2026). Trypsinogen Pro-Region as a Molecular Scaffold for the Design of Competitive Peptide Inhibitors of Trypsin-Like Proteases. Archives of Insect Biochemistry and Physiology 123, e70224. doi: 10.1002/arch.70224</w:t>
       </w:r>
     </w:p>
     <w:p>
@@ -8363,7 +7718,7 @@
         <w:pStyle w:val="BodyText"/>
       </w:pPr>
       <w:r>
-        <w:t xml:space="preserve">Li Z, Yuan Y, Hu K, Pan P, He F (2026). Benchmarking confidence estimation and rescoring for cyclic peptide–protein complex predictions. bioRxiv. doi: 10.64898/2026.08.20.746104</w:t>
+        <w:t xml:space="preserve">Meriño-Cabrera Y, de Oliveira Mendes TA, Castro JGS, Barbosa SL, Macedo MLR, de Almeida Oliveira MG (2020a). Noncompetitive tight-binding inhibition of Anticarsia gemmatalis trypsins by Adenanthera pavonina protease inhibitor affects larvae survival. Archives of Insect Biochemistry and Physiology 104, e21687. doi: 10.1002/arch.21687</w:t>
       </w:r>
     </w:p>
     <w:p>
@@ -8371,7 +7726,7 @@
         <w:pStyle w:val="BodyText"/>
       </w:pPr>
       <w:r>
-        <w:t xml:space="preserve">Lomate PR, Dewangan V, Mahajan NS, Kumar Y, Kulkarni A, Wang L, et al. (2018). Integrated Transcriptomic and Proteomic Analyses Suggest the Participation of Endogenous Protease Inhibitors in the Regulation of Protease Gene Expression in Helicoverpa armigera. Molecular &amp; Cellular Proteomics 17, 1324-1336. doi: 10.1074/mcp.ra117.000533</w:t>
+        <w:t xml:space="preserve">Meriño-Cabrera Y, Severiche Castro JG, Rios Diez JD, Rodrigues Macedo ML, de Oliveira Mendes TA, Goreti de Almeida Oliveira M (2020b). Rational design of mimetic peptides based on the interaction between Inga laurina inhibitor and trypsins for Spodoptera cosmioides pest control. Insect Biochemistry and Molecular Biology 122, 103390. doi: 10.1016/j.ibmb.2020.103390</w:t>
       </w:r>
     </w:p>
     <w:p>
@@ -8379,7 +7734,7 @@
         <w:pStyle w:val="BodyText"/>
       </w:pPr>
       <w:r>
-        <w:t xml:space="preserve">Luckett S, Garcia R, Barker J, Konarev A, Shewry P, Clarke A, et al. (1999). High-resolution structure of a potent, cyclic proteinase inhibitor from sunflower seeds. Journal of Molecular Biology 290, 525-533. doi: 10.1006/jmbi.1999.2891</w:t>
+        <w:t xml:space="preserve">Meriño-Cabrera Y, Castro JS, de Almeida Barros R, da Silva Junior NR, de Oliveira Ramos H, de Almeida Oliveira MG (2022). Arginine-containing dipeptides decrease affinity of gut trypsins and compromise soybean pest development. Pesticide Biochemistry and Physiology 184, 105107. doi: 10.1016/j.pestbp.2022.105107</w:t>
       </w:r>
     </w:p>
     <w:p>
@@ -8387,7 +7742,7 @@
         <w:pStyle w:val="BodyText"/>
       </w:pPr>
       <w:r>
-        <w:t xml:space="preserve">Mariano GA, de Oliveira JVA, Andrade RJD, Paulo DGS, Cabrera YBM, Santos EGDD, et al. (2026). Trypsinogen Pro-Region as a Molecular Scaffold for the Design of Competitive Peptide Inhibitors of Trypsin-Like Proteases. Archives of Insect Biochemistry and Physiology 123, e70224. doi: 10.1002/arch.70224</w:t>
+        <w:t xml:space="preserve">Nakonieczny M, Michalczyk K, Kędziorski A (2007). Midgut protease activities in monophagous larvae of Apollo butterfly, Parnassius apollo ssp. frankenbergeri. Comptes Rendus. Biologies 330, 126-134. doi: 10.1016/j.crvi.2006.12.002</w:t>
       </w:r>
     </w:p>
     <w:p>
@@ -8395,7 +7750,7 @@
         <w:pStyle w:val="BodyText"/>
       </w:pPr>
       <w:r>
-        <w:t xml:space="preserve">Meriño-Cabrera Y, de Oliveira Mendes TA, Castro JGS, Barbosa SL, Macedo MLR, de Almeida Oliveira MG (2020a). Noncompetitive tight-binding inhibition of Anticarsia gemmatalis trypsins by Adenanthera pavonina protease inhibitor affects larvae survival. Archives of Insect Biochemistry and Physiology 104, e21687. doi: 10.1002/arch.21687</w:t>
+        <w:t xml:space="preserve">Olsson MHM, Søndergaard CR, Rostkowski M, Jensen JH (2011). PROPKA3: Consistent Treatment of Internal and Surface Residues in Empirical p K a Predictions. Journal of Chemical Theory and Computation 7, 525-537. doi: 10.1021/ct100578z</w:t>
       </w:r>
     </w:p>
     <w:p>
@@ -8403,7 +7758,7 @@
         <w:pStyle w:val="BodyText"/>
       </w:pPr>
       <w:r>
-        <w:t xml:space="preserve">Meriño-Cabrera Y, Severiche Castro JG, Rios Diez JD, Rodrigues Macedo ML, de Oliveira Mendes TA, Goreti de Almeida Oliveira M (2020b). Rational design of mimetic peptides based on the interaction between Inga laurina inhibitor and trypsins for Spodoptera cosmioides pest control. Insect Biochemistry and Molecular Biology 122, 103390. doi: 10.1016/j.ibmb.2020.103390</w:t>
+        <w:t xml:space="preserve">Pan Y, Cheng K, Mao J, Liu F, Liu J, Ye M, et al. (2014). Quantitative proteomics reveals the kinetics of trypsin-catalyzed protein digestion. Analytical and Bioanalytical Chemistry 406, 6247-6256. doi: 10.1007/s00216-014-8071-6</w:t>
       </w:r>
     </w:p>
     <w:p>
@@ -8411,7 +7766,7 @@
         <w:pStyle w:val="BodyText"/>
       </w:pPr>
       <w:r>
-        <w:t xml:space="preserve">Meriño-Cabrera Y, Castro JS, de Almeida Barros R, da Silva Junior NR, de Oliveira Ramos H, de Almeida Oliveira MG (2022). Arginine-containing dipeptides decrease affinity of gut trypsins and compromise soybean pest development. Pesticide Biochemistry and Physiology 184, 105107. doi: 10.1016/j.pestbp.2022.105107</w:t>
+        <w:t xml:space="preserve">Parkin S, Rupp B, Hope H (1996). Structure of bovine pancreatic trypsin inhibitor at 125 K definition of carboxyl-terminal residues Gly57 and Ala58. Acta Crystallographica Section D Biological Crystallography 52, 18-29. doi: 10.1107/S0907444995008675</w:t>
       </w:r>
     </w:p>
     <w:p>
@@ -8419,7 +7774,7 @@
         <w:pStyle w:val="BodyText"/>
       </w:pPr>
       <w:r>
-        <w:t xml:space="preserve">Michaud-Agrawal N, Denning EJ, Woolf TB, Beckstein O (2011). MDAnalysis: A toolkit for the analysis of molecular dynamics simulations. Journal of Computational Chemistry 32, 2319-2327. doi: 10.1002/jcc.21787</w:t>
+        <w:t xml:space="preserve">Passaro S, Corso G, Wohlwend J, Reveiz M, Thaler S, Ram Somnath V, et al. (2025). Boltz-2: Towards accurate and efficient binding affinity prediction. bioRxiv [Preprint]. doi: 10.1101/2025.06.14.659707</w:t>
       </w:r>
     </w:p>
     <w:p>
@@ -8427,7 +7782,7 @@
         <w:pStyle w:val="BodyText"/>
       </w:pPr>
       <w:r>
-        <w:t xml:space="preserve">Miller BR, McGee TD, Swails JM, Homeyer N, Gohlke H, Roitberg AE (2012). MMPBSA.py: An Efficient Program for End-State Free Energy Calculations. Journal of Chemical Theory and Computation 8, 3314-3321. doi: 10.1021/ct300418h</w:t>
+        <w:t xml:space="preserve">Patarroyo-Vargas AM, Merino-Cabrera YB, Zanuncio JC, Rocha F, Campos WG, de Almeida Oliveira MG (2017). Kinetic Characterization of Anticarsia gemmatalis Digestive Serine- Proteases and the Inhibitory Effect of Synthetic Peptides. Protein &amp; Peptide Letters 24, 1040-1047. doi: 10.2174/0929866524666170918103146</w:t>
       </w:r>
     </w:p>
     <w:p>
@@ -8435,7 +7790,7 @@
         <w:pStyle w:val="BodyText"/>
       </w:pPr>
       <w:r>
-        <w:t xml:space="preserve">Mirdita M, Schütze K, Moriwaki Y, Heo L, Ovchinnikov S, Steinegger M (2022). ColabFold: making protein folding accessible to all. Nature Methods 19, 679-682. doi: 10.1038/s41592-022-01488-1</w:t>
+        <w:t xml:space="preserve">Patarroyo-Vargas AM, Cordeiro G, Silva CRD, Silva CRD, Mendonça EG, Visôtto LE, et al. (2020). Inhibition kinetics of digestive proteases for Anticarsia gemmatalis. Anais da Academia Brasileira de Ciências 92, e20180477. doi: 10.1590/0001-3765202020180477</w:t>
       </w:r>
     </w:p>
     <w:p>
@@ -8443,7 +7798,7 @@
         <w:pStyle w:val="BodyText"/>
       </w:pPr>
       <w:r>
-        <w:t xml:space="preserve">Nakonieczny M, Michalczyk K, Kędziorski A (2007). Midgut protease activities in monophagous larvae of Apollo butterfly, Parnassius apollo ssp. frankenbergeri. Comptes Rendus. Biologies 330, 126-134. doi: 10.1016/j.crvi.2006.12.002</w:t>
+        <w:t xml:space="preserve">Paulo DGS, Schneider JR, Meriño-Cabrera Y, Wurlitzer WB, de Andrade RJ, Santos ILB, et al. (2026). Peptides Derived From Reactive Center Loops Inhibit Digestive Trypsin-Like Enzymes in Lepidopteran Pests. Archives of Insect Biochemistry and Physiology 121, e70123. doi: 10.1002/arch.70123</w:t>
       </w:r>
     </w:p>
     <w:p>
@@ -8451,7 +7806,7 @@
         <w:pStyle w:val="BodyText"/>
       </w:pPr>
       <w:r>
-        <w:t xml:space="preserve">Olsson MHM, Søndergaard CR, Rostkowski M, Jensen JH (2011). PROPKA3: Consistent Treatment of Internal and Surface Residues in Empirical p K a Predictions. Journal of Chemical Theory and Computation 7, 525-537. doi: 10.1021/ct100578z</w:t>
+        <w:t xml:space="preserve">Perona JJ, Craik CS (1995). Structural basis of substrate specificity in the serine proteases. Protein Science 4, 337-360. doi: 10.1002/pro.5560040301</w:t>
       </w:r>
     </w:p>
     <w:p>
@@ -8459,7 +7814,7 @@
         <w:pStyle w:val="BodyText"/>
       </w:pPr>
       <w:r>
-        <w:t xml:space="preserve">Onufriev A, Bashford D, Case DA (2004). Exploring protein native states and large‐scale conformational changes with a modified generalized born model. Proteins: Structure, Function, and Bioinformatics 55, 383-394. doi: 10.1002/prot.20033</w:t>
+        <w:t xml:space="preserve">Rawlings ND, Barrett AJ, Thomas PD, Huang X, Bateman A, Finn RD (2018). The MEROPS database of proteolytic enzymes, their substrates and inhibitors in 2017 and a comparison with peptidases in the PANTHER database. Nucleic Acids Research 46, D624-D632. doi: 10.1093/nar/gkx1134</w:t>
       </w:r>
     </w:p>
     <w:p>
@@ -8467,7 +7822,7 @@
         <w:pStyle w:val="BodyText"/>
       </w:pPr>
       <w:r>
-        <w:t xml:space="preserve">Pan Y, Cheng K, Mao J, Liu F, Liu J, Ye M, et al. (2014). Quantitative proteomics reveals the kinetics of trypsin-catalyzed protein digestion. Analytical and Bioanalytical Chemistry 406, 6247-6256. doi: 10.1007/s00216-014-8071-6</w:t>
+        <w:t xml:space="preserve">Rettie SA, Juergens D, Adebomi V, Bueso YF, Zhao Q, Leveille AN, et al. (2025). Accurate de novo design of high-affinity protein-binding macrocycles using deep learning. Nature Chemical Biology 21, 1948-1956. doi: 10.1038/s41589-025-01929-w</w:t>
       </w:r>
     </w:p>
     <w:p>
@@ -8475,7 +7830,7 @@
         <w:pStyle w:val="BodyText"/>
       </w:pPr>
       <w:r>
-        <w:t xml:space="preserve">Parkin S, Rupp B, Hope H (1996). Structure of bovine pancreatic trypsin inhibitor at 125 K definition of carboxyl-terminal residues Gly57 and Ala58. Acta Crystallographica Section D Biological Crystallography 52, 18-29. doi: 10.1107/S0907444995008675</w:t>
+        <w:t xml:space="preserve">Rodriguez J, Gupta N, Smith RD, Pevzner PA (2008). Does Trypsin Cut Before Proline? Journal of Proteome Research 7, 300-305. doi: 10.1021/pr0705035</w:t>
       </w:r>
     </w:p>
     <w:p>
@@ -8483,7 +7838,7 @@
         <w:pStyle w:val="BodyText"/>
       </w:pPr>
       <w:r>
-        <w:t xml:space="preserve">Parrinello M, Rahman A (1981). Polymorphic transitions in single crystals: A new molecular dynamics method. Journal of Applied Physics 52, 7182-7190. doi: 10.1063/1.328693</w:t>
+        <w:t xml:space="preserve">Saikhedkar NS, Joshi RS, Bhoite AS, Mohandasan R, Yadav AK, Fernandes M, et al. (2018). Tripeptides derived from reactive centre loop of potato type II protease inhibitors preferentially inhibit midgut proteases of Helicoverpa armigera. Insect Biochemistry and Molecular Biology 95, 17-25. doi: 10.1016/j.ibmb.2018.02.001</w:t>
       </w:r>
     </w:p>
     <w:p>
@@ -8491,7 +7846,7 @@
         <w:pStyle w:val="BodyText"/>
       </w:pPr>
       <w:r>
-        <w:t xml:space="preserve">Passaro S, Corso G, Wohlwend J, Reveiz M, Thaler S, Ram Somnath V, et al. (2025). Boltz-2: Towards accurate and efficient binding affinity prediction. bioRxiv [Preprint]. doi: 10.1101/2025.06.14.659707</w:t>
+        <w:t xml:space="preserve">Saikhedkar NS, Joshi RS, Yadav AK, Seal S, Fernandes M, Giri AP (2019). Phyto-inspired cyclic peptides derived from plant Pin-II type protease inhibitor reactive center loops for crop protection from insect pests. Biochimica et Biophysica Acta (BBA) - General Subjects 1863, 1254-1262. doi: 10.1016/j.bbagen.2019.05.003</w:t>
       </w:r>
     </w:p>
     <w:p>
@@ -8499,7 +7854,7 @@
         <w:pStyle w:val="BodyText"/>
       </w:pPr>
       <w:r>
-        <w:t xml:space="preserve">Patarroyo-Vargas AM, Merino-Cabrera YB, Zanuncio JC, Rocha F, Campos WG, de Almeida Oliveira MG (2017). Kinetic Characterization of Anticarsia gemmatalis Digestive Serine- Proteases and the Inhibitory Effect of Synthetic Peptides. Protein &amp; Peptide Letters 24, 1040-1047. doi: 10.2174/0929866524666170918103146</w:t>
+        <w:t xml:space="preserve">Schechter I, Berger A (1967). On the size of the active site in proteases. I. Papain. Biochemical and Biophysical Research Communications 27, 157-162. doi: 10.1016/S0006-291X(67)80055-X</w:t>
       </w:r>
     </w:p>
     <w:p>
@@ -8507,7 +7862,7 @@
         <w:pStyle w:val="BodyText"/>
       </w:pPr>
       <w:r>
-        <w:t xml:space="preserve">Patarroyo-Vargas AM, Cordeiro G, Silva CRD, Silva CRD, Mendonça EG, Visôtto LE, et al. (2020). Inhibition kinetics of digestive proteases for Anticarsia gemmatalis. Anais da Academia Brasileira de Ciências 92, e20180477. doi: 10.1590/0001-3765202020180477</w:t>
+        <w:t xml:space="preserve">Schultz H, Paulo DGS, Meriño-Cabrera Y, de Andrade RJ, Santos ILB, Rodrigues MCNG, et al. (2026). Synthetic Peptide Inhibition of Trypsin-Like Proteases in Spodoptera frugiperda (Lepidoptera: Noctuidae): Evaluating the Influence of Gut Microbiota. Archives of Insect Biochemistry and Physiology 121, e70145. doi: 10.1002/arch.70145</w:t>
       </w:r>
     </w:p>
     <w:p>
@@ -8515,7 +7870,7 @@
         <w:pStyle w:val="BodyText"/>
       </w:pPr>
       <w:r>
-        <w:t xml:space="preserve">Paulo DGS, Schneider JR, Meriño-Cabrera Y, Wurlitzer WB, de Andrade RJ, Santos ILB, et al. (2026). Peptides Derived From Reactive Center Loops Inhibit Digestive Trypsin-Like Enzymes in Lepidopteran Pests. Archives of Insect Biochemistry and Physiology 121, e70123. doi: 10.1002/arch.70123</w:t>
+        <w:t xml:space="preserve">Severiche-Castro J, Valerio MF, Oliveira MGdA (2026). Structure-Guided Design of an Interface-Derived Inhibitor Peptide Against Spodoptera frugiperda Digestive Trypsins. Archives of Insect Biochemistry and Physiology 122, e70164. doi: 10.1002/arch.70164</w:t>
       </w:r>
     </w:p>
     <w:p>
@@ -8523,7 +7878,7 @@
         <w:pStyle w:val="BodyText"/>
       </w:pPr>
       <w:r>
-        <w:t xml:space="preserve">Perona JJ, Craik CS (1995). Structural basis of substrate specificity in the serine proteases. Protein Science 4, 337-360. doi: 10.1002/pro.5560040301</w:t>
+        <w:t xml:space="preserve">Silva-Júnior NR, Cabrera YM, Barbosa SL, Barros RDA, Barros E, Vital CE, et al. (2021). Intestinal proteases profiling from Anticarsia gemmatalis and their binding to inhibitors. Archives of Insect Biochemistry and Physiology 107, e21792. doi: 10.1002/arch.21792</w:t>
       </w:r>
     </w:p>
     <w:p>
@@ -8531,7 +7886,7 @@
         <w:pStyle w:val="BodyText"/>
       </w:pPr>
       <w:r>
-        <w:t xml:space="preserve">Rawlings ND, Barrett AJ, Thomas PD, Huang X, Bateman A, Finn RD (2018). The MEROPS database of proteolytic enzymes, their substrates and inhibitors in 2017 and a comparison with peptidases in the PANTHER database. Nucleic Acids Research 46, D624-D632. doi: 10.1093/nar/gkx1134</w:t>
+        <w:t xml:space="preserve">Song HK, Suh SW (1998). Kunitz-type soybean trypsin inhibitor revisited: refined structure of its complex with porcine trypsin reveals an insight into the interaction between a homologous inhibitor from Erythrina caffra and tissue-type plasminogen activator. Journal of Molecular Biology 275, 347-363. doi: 10.1006/jmbi.1997.1469</w:t>
       </w:r>
     </w:p>
     <w:p>
@@ -8539,7 +7894,7 @@
         <w:pStyle w:val="BodyText"/>
       </w:pPr>
       <w:r>
-        <w:t xml:space="preserve">Rettie SA, Juergens D, Adebomi V, Bueso YF, Zhao Q, Leveille AN, et al. (2025). Accurate de novo design of high-affinity protein-binding macrocycles using deep learning. Nature Chemical Biology 21, 1948-1956. doi: 10.1038/s41589-025-01929-w</w:t>
+        <w:t xml:space="preserve">Song J, Markley JL (2003). Protein Inhibitors of Serine Proteinases: Role of Backbone Structure and Dynamics in Controlling the Hydrolysis Constant. Biochemistry 42, 5186-5194. doi: 10.1021/bi034041u</w:t>
       </w:r>
     </w:p>
     <w:p>
@@ -8547,7 +7902,7 @@
         <w:pStyle w:val="BodyText"/>
       </w:pPr>
       <w:r>
-        <w:t xml:space="preserve">Rodriguez J, Gupta N, Smith RD, Pevzner PA (2008). Does Trypsin Cut Before Proline? Journal of Proteome Research 7, 300-305. doi: 10.1021/pr0705035</w:t>
+        <w:t xml:space="preserve">Souza TP, Dias RO, Castelhano EC, Brandão MM, Moura DS, Silva-Filho MC (2016). Comparative analysis of expression profiling of the trypsin and chymotrypsin genes from Lepidoptera species with different levels of sensitivity to soybean peptidase inhibitors. Comparative Biochemistry and Physiology Part B: Biochemistry and Molecular Biology 196-197, 67-73. doi: 10.1016/j.cbpb.2016.02.007</w:t>
       </w:r>
     </w:p>
     <w:p>
@@ -8555,7 +7910,7 @@
         <w:pStyle w:val="BodyText"/>
       </w:pPr>
       <w:r>
-        <w:t xml:space="preserve">Saikhedkar NS, Joshi RS, Bhoite AS, Mohandasan R, Yadav AK, Fernandes M, et al. (2018). Tripeptides derived from reactive centre loop of potato type II protease inhibitors preferentially inhibit midgut proteases of Helicoverpa armigera. Insect Biochemistry and Molecular Biology 95, 17-25. doi: 10.1016/j.ibmb.2018.02.001</w:t>
+        <w:t xml:space="preserve">Terra WR, Ferreira C (1994). Insect digestive enzymes: properties, compartmentalization and function. Comparative Biochemistry and Physiology Part B: Comparative Biochemistry 109, 1-62. doi: 10.1016/0305-0491(94)90141-4</w:t>
       </w:r>
     </w:p>
     <w:p>
@@ -8563,7 +7918,7 @@
         <w:pStyle w:val="BodyText"/>
       </w:pPr>
       <w:r>
-        <w:t xml:space="preserve">Saikhedkar NS, Joshi RS, Yadav AK, Seal S, Fernandes M, Giri AP (2019). Phyto-inspired cyclic peptides derived from plant Pin-II type protease inhibitor reactive center loops for crop protection from insect pests. Biochimica et Biophysica Acta (BBA) - General Subjects 1863, 1254-1262. doi: 10.1016/j.bbagen.2019.05.003</w:t>
+        <w:t xml:space="preserve">The UniProt Consortium, Bateman A, Martin MJ, Orchard S, Magrane M, Adesina A, et al. (2025). UniProt: the Universal Protein Knowledgebase in 2025. Nucleic Acids Research 53, D609-D617. doi: 10.1093/nar/gkae1010</w:t>
       </w:r>
     </w:p>
     <w:p>
@@ -8571,7 +7926,7 @@
         <w:pStyle w:val="BodyText"/>
       </w:pPr>
       <w:r>
-        <w:t xml:space="preserve">Schechter I, Berger A (1967). On the size of the active site in proteases. I. Papain. Biochemical and Biophysical Research Communications 27, 157-162. doi: 10.1016/S0006-291X(67)80055-X</w:t>
+        <w:t xml:space="preserve">Valaitis AP (1995). Gypsy moth midgut proteinases: Purification and characterization of luminal trypsin, elastase and the brush border membrane leucine aminopeptidase. Insect Biochemistry and Molecular Biology 25, 139-149. doi: 10.1016/0965-1748(94)00033-e</w:t>
       </w:r>
     </w:p>
     <w:p>
@@ -8579,7 +7934,7 @@
         <w:pStyle w:val="BodyText"/>
       </w:pPr>
       <w:r>
-        <w:t xml:space="preserve">Schultz H, Paulo DGS, Meriño-Cabrera Y, de Andrade RJ, Santos ILB, Rodrigues MCNG, et al. (2026). Synthetic Peptide Inhibition of Trypsin-Like Proteases in Spodoptera frugiperda (Lepidoptera: Noctuidae): Evaluating the Influence of Gut Microbiota. Archives of Insect Biochemistry and Physiology 121, e70145. doi: 10.1002/arch.70145</w:t>
+        <w:t xml:space="preserve">Valaitis AP, Augustin S, Clancy KM (1999). Purification and characterization of the western spruce budworm larval midgut proteinases and comparison of gut activities of laboratory-reared and field-collected insects. Insect Biochemistry and Molecular Biology 29, 405-415. doi: 10.1016/s0965-1748(99)00017-x</w:t>
       </w:r>
     </w:p>
     <w:p>
@@ -8587,7 +7942,7 @@
         <w:pStyle w:val="BodyText"/>
       </w:pPr>
       <w:r>
-        <w:t xml:space="preserve">Severiche-Castro J, Valerio MF, Oliveira MGdA (2026). Structure-Guided Design of an Interface-Derived Inhibitor Peptide Against Spodoptera frugiperda Digestive Trypsins. Archives of Insect Biochemistry and Physiology 122, e70164. doi: 10.1002/arch.70164</w:t>
+        <w:t xml:space="preserve">Valdés-Tresanco MS, Valdés-Tresanco ME, Valiente PA, Moreno E (2021). gmx_MMPBSA: A New Tool to Perform End-State Free Energy Calculations with GROMACS. Journal of Chemical Theory and Computation 17, 6281-6291. doi: 10.1021/acs.jctc.1c00645</w:t>
       </w:r>
     </w:p>
     <w:p>
@@ -8595,7 +7950,7 @@
         <w:pStyle w:val="BodyText"/>
       </w:pPr>
       <w:r>
-        <w:t xml:space="preserve">Silva-Júnior NR, Cabrera YM, Barbosa SL, Barros RDA, Barros E, Vital CE, et al. (2021). Intestinal proteases profiling from Anticarsia gemmatalis and their binding to inhibitors. Archives of Insect Biochemistry and Physiology 107, e21792. doi: 10.1002/arch.21792</w:t>
+        <w:t xml:space="preserve">van Kempen M, Kim SS, Tumescheit C, Mirdita M, Lee J, Gilchrist CLM, et al. (2024). Fast and accurate protein structure search with Foldseek. Nature Biotechnology 42, 243-246. doi: 10.1038/s41587-023-01773-0</w:t>
       </w:r>
     </w:p>
     <w:p>
@@ -8603,7 +7958,7 @@
         <w:pStyle w:val="BodyText"/>
       </w:pPr>
       <w:r>
-        <w:t xml:space="preserve">Song HK, Suh SW (1998). Kunitz-type soybean trypsin inhibitor revisited: refined structure of its complex with porcine trypsin reveals an insight into the interaction between a homologous inhibitor from Erythrina caffra and tissue-type plasminogen activator. Journal of Molecular Biology 275, 347-363. doi: 10.1006/jmbi.1997.1469</w:t>
+        <w:t xml:space="preserve">Vangone A, Bonvin AMJJ (2015). Contacts-based prediction of binding affinity in protein–protein complexes. eLife 4, e07454. doi: 10.7554/eLife.07454</w:t>
       </w:r>
     </w:p>
     <w:p>
@@ -8611,7 +7966,7 @@
         <w:pStyle w:val="BodyText"/>
       </w:pPr>
       <w:r>
-        <w:t xml:space="preserve">Song J, Markley JL (2003). Protein Inhibitors of Serine Proteinases: Role of Backbone Structure and Dynamics in Controlling the Hydrolysis Constant. Biochemistry 42, 5186-5194. doi: 10.1021/bi034041u</w:t>
+        <w:t xml:space="preserve">Varadi M, Bertoni D, Magana P, Paramval U, Pidruchna I, Radhakrishnan M, et al. (2024). AlphaFold Protein Structure Database in 2024: providing structure coverage for over 214 million protein sequences. Nucleic Acids Research 52, D368-D375. doi: 10.1093/nar/gkad1011</w:t>
       </w:r>
     </w:p>
     <w:p>
@@ -8619,7 +7974,7 @@
         <w:pStyle w:val="BodyText"/>
       </w:pPr>
       <w:r>
-        <w:t xml:space="preserve">Souza TP, Dias RO, Castelhano EC, Brandão MM, Moura DS, Silva-Filho MC (2016). Comparative analysis of expression profiling of the trypsin and chymotrypsin genes from Lepidoptera species with different levels of sensitivity to soybean peptidase inhibitors. Comparative Biochemistry and Physiology Part B: Biochemistry and Molecular Biology 196-197, 67-73. doi: 10.1016/j.cbpb.2016.02.007</w:t>
+        <w:t xml:space="preserve">Wan S, Zhang X, Xue X, Coveney PV (2026). Reliability of AI methods in drug discovery: evaluation of Boltz-2 for structure and binding affinity prediction. Journal of Chemical Theory and Computation 22, 7811-7824. doi: 10.1021/acs.jctc.6c01334</w:t>
       </w:r>
     </w:p>
     <w:p>
@@ -8627,7 +7982,7 @@
         <w:pStyle w:val="BodyText"/>
       </w:pPr>
       <w:r>
-        <w:t xml:space="preserve">Terra WR, Ferreira C (1994). Insect digestive enzymes: properties, compartmentalization and function. Comparative Biochemistry and Physiology Part B: Comparative Biochemistry 109, 1-62. doi: 10.1016/0305-0491(94)90141-4</w:t>
+        <w:t xml:space="preserve">Watson JL, Juergens D, Bennett NR, Trippe BL, Yim J, Eisenach HE, et al. (2023). De novo design of protein structure and function with RFdiffusion. Nature 620, 1089-1100. doi: 10.1038/s41586-023-06415-8</w:t>
       </w:r>
     </w:p>
     <w:p>
@@ -8635,7 +7990,7 @@
         <w:pStyle w:val="BodyText"/>
       </w:pPr>
       <w:r>
-        <w:t xml:space="preserve">The UniProt Consortium, Bateman A, Martin MJ, Orchard S, Magrane M, Adesina A, et al. (2025). UniProt: the Universal Protein Knowledgebase in 2025. Nucleic Acids Research 53, D609-D617. doi: 10.1093/nar/gkae1010</w:t>
+        <w:t xml:space="preserve">Wei W, Ma J, Xie D, Zhou Y (2019). Linking inhibitor motions to proteolytic stability of sunflower trypsin inhibitor-1. RSC Advances 9, 13776-13786. doi: 10.1039/c9ra02114k</w:t>
       </w:r>
     </w:p>
     <w:p>
@@ -8643,7 +7998,7 @@
         <w:pStyle w:val="BodyText"/>
       </w:pPr>
       <w:r>
-        <w:t xml:space="preserve">Valaitis AP (1995). Gypsy moth midgut proteinases: Purification and characterization of luminal trypsin, elastase and the brush border membrane leucine aminopeptidase. Insect Biochemistry and Molecular Biology 25, 139-149. doi: 10.1016/0965-1748(94)00033-e</w:t>
+        <w:t xml:space="preserve">Werner MH, Wemmer DE (1992). Three-dimensional structure of soybean trypsin/chymotrypsin Bowman-Birk inhibitor in solution. Biochemistry 31, 999-1010. doi: 10.1021/bi00119a008</w:t>
       </w:r>
     </w:p>
     <w:p>
@@ -8651,7 +8006,7 @@
         <w:pStyle w:val="BodyText"/>
       </w:pPr>
       <w:r>
-        <w:t xml:space="preserve">Valaitis AP, Augustin S, Clancy KM (1999). Purification and characterization of the western spruce budworm larval midgut proteinases and comparison of gut activities of laboratory-reared and field-collected insects. Insect Biochemistry and Molecular Biology 29, 405-415. doi: 10.1016/s0965-1748(99)00017-x</w:t>
+        <w:t xml:space="preserve">Wohlwend J, Corso G, Passaro S, Getz N, Reveiz M, Leidal K, et al. (2024). Boltz-1: Democratizing biomolecular interaction modeling. bioRxiv [Preprint]. doi: 10.1101/2024.11.19.624167</w:t>
       </w:r>
     </w:p>
     <w:p>
@@ -8659,7 +8014,7 @@
         <w:pStyle w:val="BodyText"/>
       </w:pPr>
       <w:r>
-        <w:t xml:space="preserve">Valdés-Tresanco MS, Valdés-Tresanco ME, Valiente PA, Moreno E (2021). gmx_MMPBSA: A New Tool to Perform End-State Free Energy Calculations with GROMACS. Journal of Chemical Theory and Computation 17, 6281-6291. doi: 10.1021/acs.jctc.1c00645</w:t>
+        <w:t xml:space="preserve">Xu J, Zhang Y (2010). How significant is a protein structure similarity with TM-score = 0.5? Bioinformatics 26, 889-895. doi: 10.1093/bioinformatics/btq066</w:t>
       </w:r>
     </w:p>
     <w:p>
@@ -8667,7 +8022,7 @@
         <w:pStyle w:val="BodyText"/>
       </w:pPr>
       <w:r>
-        <w:t xml:space="preserve">van Kempen M, Kim SS, Tumescheit C, Mirdita M, Lee J, Gilchrist CLM, et al. (2024). Fast and accurate protein structure search with Foldseek. Nature Biotechnology 42, 243-246. doi: 10.1038/s41587-023-01773-0</w:t>
+        <w:t xml:space="preserve">Xu X, Zhou F, Zheng L, Wang S, Peng X, Li D (2025). Sampling Challenges of MM/PBSA Binding Energy Calculations. The Journal of Physical Chemistry B 129, 11666-11678. doi: 10.1021/acs.jpcb.5c04908</w:t>
       </w:r>
     </w:p>
     <w:p>
@@ -8675,7 +8030,7 @@
         <w:pStyle w:val="BodyText"/>
       </w:pPr>
       <w:r>
-        <w:t xml:space="preserve">Vangone A, Bonvin AMJJ (2015). Contacts-based prediction of binding affinity in protein–protein complexes. eLife 4, e07454. doi: 10.7554/eLife.07454</w:t>
+        <w:t xml:space="preserve">Yang Y, Zhu YC, Ottea J, Husseneder C, Leonard BR, Abel C, et al. (2013). Characterization and transcriptional analyses of cDNAs encoding three trypsin- and chymotrypsin-like proteinases in Cry1Ab-susceptible and Cry1Ab-resistant strains of sugarcane borer, Diatraea saccharalis. Insect Science 20, 485-496. doi: 10.1111/j.1744-7917.2012.01514.x</w:t>
       </w:r>
     </w:p>
     <w:p>
@@ -8683,7 +8038,7 @@
         <w:pStyle w:val="BodyText"/>
       </w:pPr>
       <w:r>
-        <w:t xml:space="preserve">Varadi M, Bertoni D, Magana P, Paramval U, Pidruchna I, Radhakrishnan M, et al. (2024). AlphaFold Protein Structure Database in 2024: providing structure coverage for over 214 million protein sequences. Nucleic Acids Research 52, D368-D375. doi: 10.1093/nar/gkad1011</w:t>
+        <w:t xml:space="preserve">Zhan Q, Zheng S, Feng Q, Liu L (2011). A midgut-specific chymotrypsin cDNA (Slctlp1) from Spodoptera litura: cloning, characterization, localization and expression analysis. Archives of Insect Biochemistry and Physiology 76, 130-143. doi: 10.1002/arch.20353</w:t>
       </w:r>
     </w:p>
     <w:p>
@@ -8691,7 +8046,7 @@
         <w:pStyle w:val="BodyText"/>
       </w:pPr>
       <w:r>
-        <w:t xml:space="preserve">Wacha AF, Lemkul JA (2023). charmm2gmx: An Automated Method to Port the CHARMM Additive Force Field to GROMACS. Journal of Chemical Information and Modeling 63, 4246-4252. doi: 10.1021/acs.jcim.3c00860</w:t>
+        <w:t xml:space="preserve">Zhang Y, Skolnick J (2005). TM-align: a protein structure alignment algorithm based on the TM-score. Nucleic Acids Research 33, 2302-2309. doi: 10.1093/nar/gki524</w:t>
       </w:r>
     </w:p>
     <w:p>
@@ -8699,91 +8054,11 @@
         <w:pStyle w:val="BodyText"/>
       </w:pPr>
       <w:r>
-        <w:t xml:space="preserve">Wan S, Zhang X, Xue X, Coveney PV (2026). Reliability of AI methods in drug discovery: evaluation of Boltz-2 for structure and binding affinity prediction. Journal of Chemical Theory and Computation 22, 7811-7824. doi: 10.1021/acs.jctc.6c01334</w:t>
-      </w:r>
-    </w:p>
-    <w:p>
-      <w:pPr>
-        <w:pStyle w:val="BodyText"/>
-      </w:pPr>
-      <w:r>
-        <w:t xml:space="preserve">Watson JL, Juergens D, Bennett NR, Trippe BL, Yim J, Eisenach HE, et al. (2023). De novo design of protein structure and function with RFdiffusion. Nature 620, 1089-1100. doi: 10.1038/s41586-023-06415-8</w:t>
-      </w:r>
-    </w:p>
-    <w:p>
-      <w:pPr>
-        <w:pStyle w:val="BodyText"/>
-      </w:pPr>
-      <w:r>
-        <w:t xml:space="preserve">Wei W, Ma J, Xie D, Zhou Y (2019). Linking inhibitor motions to proteolytic stability of sunflower trypsin inhibitor-1. RSC Advances 9, 13776-13786. doi: 10.1039/c9ra02114k</w:t>
-      </w:r>
-    </w:p>
-    <w:p>
-      <w:pPr>
-        <w:pStyle w:val="BodyText"/>
-      </w:pPr>
-      <w:r>
-        <w:t xml:space="preserve">Werner MH, Wemmer DE (1992). Three-dimensional structure of soybean trypsin/chymotrypsin Bowman-Birk inhibitor in solution. Biochemistry 31, 999-1010. doi: 10.1021/bi00119a008</w:t>
-      </w:r>
-    </w:p>
-    <w:p>
-      <w:pPr>
-        <w:pStyle w:val="BodyText"/>
-      </w:pPr>
-      <w:r>
-        <w:t xml:space="preserve">Wohlwend J, Corso G, Passaro S, Getz N, Reveiz M, Leidal K, et al. (2024). Boltz-1: Democratizing biomolecular interaction modeling. bioRxiv [Preprint]. doi: 10.1101/2024.11.19.624167</w:t>
-      </w:r>
-    </w:p>
-    <w:p>
-      <w:pPr>
-        <w:pStyle w:val="BodyText"/>
-      </w:pPr>
-      <w:r>
-        <w:t xml:space="preserve">Xu J, Zhang Y (2010). How significant is a protein structure similarity with TM-score = 0.5? Bioinformatics 26, 889-895. doi: 10.1093/bioinformatics/btq066</w:t>
-      </w:r>
-    </w:p>
-    <w:p>
-      <w:pPr>
-        <w:pStyle w:val="BodyText"/>
-      </w:pPr>
-      <w:r>
-        <w:t xml:space="preserve">Xu X, Zhou F, Zheng L, Wang S, Peng X, Li D (2025). Sampling Challenges of MM/PBSA Binding Energy Calculations. The Journal of Physical Chemistry B 129, 11666-11678. doi: 10.1021/acs.jpcb.5c04908</w:t>
-      </w:r>
-    </w:p>
-    <w:p>
-      <w:pPr>
-        <w:pStyle w:val="BodyText"/>
-      </w:pPr>
-      <w:r>
-        <w:t xml:space="preserve">Yang Y, Zhu YC, Ottea J, Husseneder C, Leonard BR, Abel C, et al. (2013). Characterization and transcriptional analyses of cDNAs encoding three trypsin- and chymotrypsin-like proteinases in Cry1Ab-susceptible and Cry1Ab-resistant strains of sugarcane borer, Diatraea saccharalis. Insect Science 20, 485-496. doi: 10.1111/j.1744-7917.2012.01514.x</w:t>
-      </w:r>
-    </w:p>
-    <w:p>
-      <w:pPr>
-        <w:pStyle w:val="BodyText"/>
-      </w:pPr>
-      <w:r>
-        <w:t xml:space="preserve">Zhan Q, Zheng S, Feng Q, Liu L (2011). A midgut-specific chymotrypsin cDNA (Slctlp1) from Spodoptera litura: cloning, characterization, localization and expression analysis. Archives of Insect Biochemistry and Physiology 76, 130-143. doi: 10.1002/arch.20353</w:t>
-      </w:r>
-    </w:p>
-    <w:p>
-      <w:pPr>
-        <w:pStyle w:val="BodyText"/>
-      </w:pPr>
-      <w:r>
-        <w:t xml:space="preserve">Zhang Y, Skolnick J (2005). TM-align: a protein structure alignment algorithm based on the TM-score. Nucleic Acids Research 33, 2302-2309. doi: 10.1093/nar/gki524</w:t>
-      </w:r>
-    </w:p>
-    <w:p>
-      <w:pPr>
-        <w:pStyle w:val="BodyText"/>
-      </w:pPr>
-      <w:r>
         <w:t xml:space="preserve">Zhou D, Lobo YA, Batista IFC, Marques-Porto R, Gustchina A, Oliva MLV, et al. (2013). Crystal Structures of a Plant Trypsin Inhibitor from Enterolobium contortisiliquum (EcTI) and of Its Complex with Bovine Trypsin. PLoS ONE 8, e62252. doi: 10.1371/journal.pone.0062252</w:t>
       </w:r>
     </w:p>
-    <w:bookmarkEnd w:id="69"/>
-    <w:bookmarkStart w:id="103" w:name="supplementary-figures"/>
+    <w:bookmarkEnd w:id="67"/>
+    <w:bookmarkStart w:id="101" w:name="supplementary-figures"/>
     <w:p>
       <w:pPr>
         <w:pStyle w:val="Heading2"/>
@@ -8801,18 +8076,18 @@
           <wp:inline>
             <wp:extent cx="4679999" cy="1486588"/>
             <wp:effectExtent b="0" l="0" r="0" t="0"/>
-            <wp:docPr descr="Figure S1. Residues forbidden at P1 by class of midgut protease in the hard criterion. A residue is tolerated when the next residue is proline; isoleucine is forbidden only at the free C-terminus of the linear peptide." title="" id="71" name="Picture"/>
+            <wp:docPr descr="Figure S1. Residues forbidden at P1 by class of midgut protease in the hard criterion. A residue is tolerated when the next residue is proline; isoleucine is forbidden only at the free C-terminus of the linear peptide." title="" id="69" name="Picture"/>
             <a:graphic>
               <a:graphicData uri="http://schemas.openxmlformats.org/drawingml/2006/picture">
                 <pic:pic>
                   <pic:nvPicPr>
-                    <pic:cNvPr descr="figures/final/FigureS1_hard_rule.png" id="72" name="Picture"/>
+                    <pic:cNvPr descr="figures/final/FigureS1_hard_rule.png" id="70" name="Picture"/>
                     <pic:cNvPicPr>
                       <a:picLocks noChangeArrowheads="1" noChangeAspect="1"/>
                     </pic:cNvPicPr>
                   </pic:nvPicPr>
                   <pic:blipFill>
-                    <a:blip r:embed="rId70"/>
+                    <a:blip r:embed="rId68"/>
                     <a:stretch>
                       <a:fillRect/>
                     </a:stretch>
@@ -8866,18 +8141,18 @@
           <wp:inline>
             <wp:extent cx="4679999" cy="1819143"/>
             <wp:effectExtent b="0" l="0" r="0" t="0"/>
-            <wp:docPr descr="Figure S2. Properties of the 22,066 designed sequences by class of the motif-score screen. (A) Length distribution. (B) Percentage of sequences with lysine or arginine, and with lysine or arginine at the geometric P1 proxy. (C) Amino-acid composition of the resistant-like and susceptible classes." title="" id="74" name="Picture"/>
+            <wp:docPr descr="Figure S2. Properties of the 22,066 designed sequences by class of the motif-score screen. (A) Length distribution. (B) Percentage of sequences with lysine or arginine, and with lysine or arginine at the geometric P1 proxy. (C) Amino-acid composition of the resistant-like and susceptible classes." title="" id="72" name="Picture"/>
             <a:graphic>
               <a:graphicData uri="http://schemas.openxmlformats.org/drawingml/2006/picture">
                 <pic:pic>
                   <pic:nvPicPr>
-                    <pic:cNvPr descr="figures/final/FigureS2_motif_screen.png" id="75" name="Picture"/>
+                    <pic:cNvPr descr="figures/final/FigureS2_motif_screen.png" id="73" name="Picture"/>
                     <pic:cNvPicPr>
                       <a:picLocks noChangeArrowheads="1" noChangeAspect="1"/>
                     </pic:cNvPicPr>
                   </pic:nvPicPr>
                   <pic:blipFill>
-                    <a:blip r:embed="rId73"/>
+                    <a:blip r:embed="rId71"/>
                     <a:stretch>
                       <a:fillRect/>
                     </a:stretch>
@@ -8931,18 +8206,18 @@
           <wp:inline>
             <wp:extent cx="4679999" cy="1647359"/>
             <wp:effectExtent b="0" l="0" r="0" t="0"/>
-            <wp:docPr descr="Figure S3. Composition of the resistant-like set under the hard criterion: amino-acid composition (all sequences and the 527 linear sequences) and length distribution." title="" id="77" name="Picture"/>
+            <wp:docPr descr="Figure S3. Composition of the resistant-like set under the hard criterion: amino-acid composition (all sequences and the 527 linear sequences) and length distribution." title="" id="75" name="Picture"/>
             <a:graphic>
               <a:graphicData uri="http://schemas.openxmlformats.org/drawingml/2006/picture">
                 <pic:pic>
                   <pic:nvPicPr>
-                    <pic:cNvPr descr="figures/final/FigureS3_hard_composition.png" id="78" name="Picture"/>
+                    <pic:cNvPr descr="figures/final/FigureS3_hard_composition.png" id="76" name="Picture"/>
                     <pic:cNvPicPr>
                       <a:picLocks noChangeArrowheads="1" noChangeAspect="1"/>
                     </pic:cNvPicPr>
                   </pic:nvPicPr>
                   <pic:blipFill>
-                    <a:blip r:embed="rId76"/>
+                    <a:blip r:embed="rId74"/>
                     <a:stretch>
                       <a:fillRect/>
                     </a:stretch>
@@ -8996,18 +8271,18 @@
           <wp:inline>
             <wp:extent cx="4679999" cy="2028367"/>
             <wp:effectExtent b="0" l="0" r="0" t="0"/>
-            <wp:docPr descr="Figure S4. Re-scoring of the ten best candidates per species and front (E2). (A) Mean E2 confidence against the E1 confidence. (B) E2 confidence per candidate by species. (C) Fraction of the 15 samples that pass the pose quality control." title="" id="80" name="Picture"/>
+            <wp:docPr descr="Figure S4. Re-scoring of the ten best candidates per species and front (E2). (A) Mean E2 confidence against the E1 confidence. (B) E2 confidence per candidate by species. (C) Fraction of the 15 samples that pass the pose quality control." title="" id="78" name="Picture"/>
             <a:graphic>
               <a:graphicData uri="http://schemas.openxmlformats.org/drawingml/2006/picture">
                 <pic:pic>
                   <pic:nvPicPr>
-                    <pic:cNvPr descr="figures/final/FigureS4_E2_rescoring.png" id="81" name="Picture"/>
+                    <pic:cNvPr descr="figures/final/FigureS4_E2_rescoring.png" id="79" name="Picture"/>
                     <pic:cNvPicPr>
                       <a:picLocks noChangeArrowheads="1" noChangeAspect="1"/>
                     </pic:cNvPicPr>
                   </pic:nvPicPr>
                   <pic:blipFill>
-                    <a:blip r:embed="rId79"/>
+                    <a:blip r:embed="rId77"/>
                     <a:stretch>
                       <a:fillRect/>
                     </a:stretch>
@@ -9061,18 +8336,18 @@
           <wp:inline>
             <wp:extent cx="4679999" cy="1975510"/>
             <wp:effectExtent b="0" l="0" r="0" t="0"/>
-            <wp:docPr descr="Figure S5. The 48 final candidates. (A) E2 confidence. (B) Minimum distance between the peptide and the Asp189 carboxylate in the starting structure (dashed: 5 Å)." title="" id="83" name="Picture"/>
+            <wp:docPr descr="Figure S5. The 48 final candidates. (A) E2 confidence. (B) Minimum distance between the peptide and the Asp189 carboxylate in the starting structure (dashed: 5 Å)." title="" id="81" name="Picture"/>
             <a:graphic>
               <a:graphicData uri="http://schemas.openxmlformats.org/drawingml/2006/picture">
                 <pic:pic>
                   <pic:nvPicPr>
-                    <pic:cNvPr descr="figures/final/FigureS5_pose_quality.png" id="84" name="Picture"/>
+                    <pic:cNvPr descr="figures/final/FigureS5_pose_quality.png" id="82" name="Picture"/>
                     <pic:cNvPicPr>
                       <a:picLocks noChangeArrowheads="1" noChangeAspect="1"/>
                     </pic:cNvPicPr>
                   </pic:nvPicPr>
                   <pic:blipFill>
-                    <a:blip r:embed="rId82"/>
+                    <a:blip r:embed="rId80"/>
                     <a:stretch>
                       <a:fillRect/>
                     </a:stretch>
@@ -9126,18 +8401,18 @@
           <wp:inline>
             <wp:extent cx="4679999" cy="1768489"/>
             <wp:effectExtent b="0" l="0" r="0" t="0"/>
-            <wp:docPr descr="Figure S6. Integrity of the closing bond in the front-M simulations of A. gemmatalis (10 ns, pH 10.0): closing C–N distance, absolute closing ω angle over time and distribution of ω. Dashed lines: the limits declared beforehand (C–N ≤ 1.5 Å, ω ≥ 150°)." title="" id="86" name="Picture"/>
+            <wp:docPr descr="Figure S6. Integrity of the closing bond in the front-M simulations of A. gemmatalis (10 ns, pH 10.0): closing C–N distance, absolute closing ω angle over time and distribution of ω. Dashed lines: the limits declared beforehand (C–N ≤ 1.5 Å, ω ≥ 150°)." title="" id="84" name="Picture"/>
             <a:graphic>
               <a:graphicData uri="http://schemas.openxmlformats.org/drawingml/2006/picture">
                 <pic:pic>
                   <pic:nvPicPr>
-                    <pic:cNvPr descr="figures/final/FigureS6_ring_integrity.png" id="87" name="Picture"/>
+                    <pic:cNvPr descr="figures/final/FigureS6_ring_integrity.png" id="85" name="Picture"/>
                     <pic:cNvPicPr>
                       <a:picLocks noChangeArrowheads="1" noChangeAspect="1"/>
                     </pic:cNvPicPr>
                   </pic:nvPicPr>
                   <pic:blipFill>
-                    <a:blip r:embed="rId85"/>
+                    <a:blip r:embed="rId83"/>
                     <a:stretch>
                       <a:fillRect/>
                     </a:stretch>
@@ -9207,18 +8482,18 @@
           <wp:inline>
             <wp:extent cx="4679999" cy="5201957"/>
             <wp:effectExtent b="0" l="0" r="0" t="0"/>
-            <wp:docPr descr="Figure S7. Evidence matrix and tiers (A, B, C) of the 48 final candidates, ordered within a tier by paired difference, Boltz-2 confidence and S1 occupancy (the occupancy does not define the tier)." title="" id="89" name="Picture"/>
+            <wp:docPr descr="Figure S7. Evidence matrix and tiers (A, B, C) of the 48 final candidates, ordered within a tier by paired difference, Boltz-2 confidence and S1 occupancy (the occupancy does not define the tier)." title="" id="87" name="Picture"/>
             <a:graphic>
               <a:graphicData uri="http://schemas.openxmlformats.org/drawingml/2006/picture">
                 <pic:pic>
                   <pic:nvPicPr>
-                    <pic:cNvPr descr="figures/final/FigureS7_tiers_matrix.png" id="90" name="Picture"/>
+                    <pic:cNvPr descr="figures/final/FigureS7_tiers_matrix.png" id="88" name="Picture"/>
                     <pic:cNvPicPr>
                       <a:picLocks noChangeArrowheads="1" noChangeAspect="1"/>
                     </pic:cNvPicPr>
                   </pic:nvPicPr>
                   <pic:blipFill>
-                    <a:blip r:embed="rId88"/>
+                    <a:blip r:embed="rId86"/>
                     <a:stretch>
                       <a:fillRect/>
                     </a:stretch>
@@ -9272,18 +8547,18 @@
           <wp:inline>
             <wp:extent cx="4679999" cy="1546051"/>
             <wp:effectExtent b="0" l="0" r="0" t="0"/>
-            <wp:docPr descr="Figure S8. Boltz-2 co-folding of the 1,829 resistant-like sequences of the first round: ipTM and complex pLDDT per species and mean ipTM by length." title="" id="92" name="Picture"/>
+            <wp:docPr descr="Figure S8. Boltz-2 co-folding of the 1,829 resistant-like sequences of the first round: ipTM and complex pLDDT per species and mean ipTM by length." title="" id="90" name="Picture"/>
             <a:graphic>
               <a:graphicData uri="http://schemas.openxmlformats.org/drawingml/2006/picture">
                 <pic:pic>
                   <pic:nvPicPr>
-                    <pic:cNvPr descr="figures/final/FigureS8_boltz2_first_round.png" id="93" name="Picture"/>
+                    <pic:cNvPr descr="figures/final/FigureS8_boltz2_first_round.png" id="91" name="Picture"/>
                     <pic:cNvPicPr>
                       <a:picLocks noChangeArrowheads="1" noChangeAspect="1"/>
                     </pic:cNvPicPr>
                   </pic:nvPicPr>
                   <pic:blipFill>
-                    <a:blip r:embed="rId91"/>
+                    <a:blip r:embed="rId89"/>
                     <a:stretch>
                       <a:fillRect/>
                     </a:stretch>
@@ -9337,18 +8612,18 @@
           <wp:inline>
             <wp:extent cx="4679999" cy="2092235"/>
             <wp:effectExtent b="0" l="0" r="0" t="0"/>
-            <wp:docPr descr="Figure S9. Motif-score screen by species under the linear-strict and the circular scan rule." title="" id="95" name="Picture"/>
+            <wp:docPr descr="Figure S9. Motif-score screen by species under the linear-strict and the circular scan rule." title="" id="93" name="Picture"/>
             <a:graphic>
               <a:graphicData uri="http://schemas.openxmlformats.org/drawingml/2006/picture">
                 <pic:pic>
                   <pic:nvPicPr>
-                    <pic:cNvPr descr="figures/final/FigureS9_motif_rules.png" id="96" name="Picture"/>
+                    <pic:cNvPr descr="figures/final/FigureS9_motif_rules.png" id="94" name="Picture"/>
                     <pic:cNvPicPr>
                       <a:picLocks noChangeArrowheads="1" noChangeAspect="1"/>
                     </pic:cNvPicPr>
                   </pic:nvPicPr>
                   <pic:blipFill>
-                    <a:blip r:embed="rId94"/>
+                    <a:blip r:embed="rId92"/>
                     <a:stretch>
                       <a:fillRect/>
                     </a:stretch>
@@ -9402,18 +8677,18 @@
           <wp:inline>
             <wp:extent cx="4679999" cy="1689204"/>
             <wp:effectExtent b="0" l="0" r="0" t="0"/>
-            <wp:docPr descr="Figure S10. MM-GBSA and PRODIGY on the trajectories of the 48 simulations at pH 10.0 (second half; ΔG without entropy). (A) MM-GBSA ΔG against peptide length. (B) MM-GBSA ΔG against the final anchor–Asp189 distance. (C) PRODIGY ΔG on 30 frames against MM-GBSA ΔG. ρ: Spearman correlation." title="" id="98" name="Picture"/>
+            <wp:docPr descr="Figure S10. MM-GBSA and PRODIGY on the trajectories of the 48 simulations at pH 10.0 (second half; ΔG without entropy). (A) MM-GBSA ΔG against peptide length. (B) MM-GBSA ΔG against the final anchor–Asp189 distance. (C) PRODIGY ΔG on 30 frames against MM-GBSA ΔG. ρ: Spearman correlation." title="" id="96" name="Picture"/>
             <a:graphic>
               <a:graphicData uri="http://schemas.openxmlformats.org/drawingml/2006/picture">
                 <pic:pic>
                   <pic:nvPicPr>
-                    <pic:cNvPr descr="figures/final/FigureS10_energy_trajectories.png" id="99" name="Picture"/>
+                    <pic:cNvPr descr="figures/final/FigureS10_energy_trajectories.png" id="97" name="Picture"/>
                     <pic:cNvPicPr>
                       <a:picLocks noChangeArrowheads="1" noChangeAspect="1"/>
                     </pic:cNvPicPr>
                   </pic:nvPicPr>
                   <pic:blipFill>
-                    <a:blip r:embed="rId97"/>
+                    <a:blip r:embed="rId95"/>
                     <a:stretch>
                       <a:fillRect/>
                     </a:stretch>
@@ -9467,18 +8742,18 @@
           <wp:inline>
             <wp:extent cx="4679999" cy="2391755"/>
             <wp:effectExtent b="0" l="0" r="0" t="0"/>
-            <wp:docPr descr="Figure S11. Attack geometry of the scissile bond: proline-protected site against exposed site. PGRGDANP, the shuffled control of NGGRPDAP, has the same composition and was simulated with the same receptor and protocol (10 ns, CHARMM36, pH 10.0), with its Arg3 in S1 at the same depth (2.73 Å; occupancy 1.00), but followed by glycine instead of proline. (A) Distribution, over the second half of each run, of the distance from the Ser195 Oγ to the carbonyl carbon of the bond that follows the basic residue (violin: distribution; black bar: median; tick at the left: minimum; dashed line: the 3.5 Å of the near-attack criterion). (B) Fraction of frames of the second half in a near-attack conformation. Orange: exposed site (K/R–Gly); blue: proline-protected site of the linear candidate; teal: proline-protected site of a front-M candidate." title="" id="101" name="Picture"/>
+            <wp:docPr descr="Figure S11. Attack geometry of the scissile bond: proline-protected site against exposed site. PGRGDANP, the shuffled control of NGGRPDAP, has the same composition and was simulated with the same receptor and protocol (10 ns, CHARMM36, pH 10.0), with its Arg3 in S1 at the same depth (2.73 Å; occupancy 1.00), but followed by glycine instead of proline. (A) Distribution, over the second half of each run, of the distance from the Ser195 Oγ to the carbonyl carbon of the bond that follows the basic residue (violin: distribution; black bar: median; tick at the left: minimum; dashed line: the 3.5 Å of the near-attack criterion). (B) Fraction of frames of the second half in a near-attack conformation. Orange: exposed site (K/R–Gly); blue: proline-protected site of the linear candidate; teal: proline-protected site of a front-M candidate." title="" id="99" name="Picture"/>
             <a:graphic>
               <a:graphicData uri="http://schemas.openxmlformats.org/drawingml/2006/picture">
                 <pic:pic>
                   <pic:nvPicPr>
-                    <pic:cNvPr descr="figures/final/FigureS11_scissile_protection.png" id="102" name="Picture"/>
+                    <pic:cNvPr descr="figures/final/FigureS11_scissile_protection.png" id="100" name="Picture"/>
                     <pic:cNvPicPr>
                       <a:picLocks noChangeArrowheads="1" noChangeAspect="1"/>
                     </pic:cNvPicPr>
                   </pic:nvPicPr>
                   <pic:blipFill>
-                    <a:blip r:embed="rId100"/>
+                    <a:blip r:embed="rId98"/>
                     <a:stretch>
                       <a:fillRect/>
                     </a:stretch>
@@ -9523,8 +8798,8 @@
         <w:t xml:space="preserve">Attack geometry of the scissile bond: proline-protected site against exposed site. PGRGDANP, the shuffled control of NGGRPDAP, has the same composition and was simulated with the same receptor and protocol (10 ns, CHARMM36, pH 10.0), with its Arg3 in S1 at the same depth (2.73 Å; occupancy 1.00), but followed by glycine instead of proline. (A) Distribution, over the second half of each run, of the distance from the Ser195 Oγ to the carbonyl carbon of the bond that follows the basic residue (violin: distribution; black bar: median; tick at the left: minimum; dashed line: the 3.5 Å of the near-attack criterion). (B) Fraction of frames of the second half in a near-attack conformation. Orange: exposed site (K/R–Gly); blue: proline-protected site of the linear candidate; teal: proline-protected site of a front-M candidate.</w:t>
       </w:r>
     </w:p>
-    <w:bookmarkEnd w:id="103"/>
-    <w:bookmarkStart w:id="104" w:name="supplementary-tables"/>
+    <w:bookmarkEnd w:id="101"/>
+    <w:bookmarkStart w:id="102" w:name="supplementary-tables"/>
     <w:p>
       <w:pPr>
         <w:pStyle w:val="Heading2"/>
@@ -14895,8 +14170,8 @@
         </w:tc>
       </w:tr>
     </w:tbl>
-    <w:bookmarkEnd w:id="104"/>
-    <w:bookmarkEnd w:id="105"/>
+    <w:bookmarkEnd w:id="102"/>
+    <w:bookmarkEnd w:id="103"/>
     <w:sectPr>
       <w:footerReference w:type="default" r:id="rId9"/>
       <w:footnotePr>

</xml_diff>